<commit_message>
Leakage sweep + ratification for submission: removed all internal/benchmark register from the spec DOCX (Build note callout with substrate-pack/RATIFY/.md refs deleted; Alexander-owned, decision 9, Mode A, the-model phrasings cleaned) per workspace-guardrails lesson 10; replaced with a clean KM-style terminology callout that preserves the exact base color set; DOCX rebuilt, fingerprint EMPTY, visible-text leak scan NONE, 20 pages render-verified; substrate values ratified-locked 6/13
</commit_message>
<xml_diff>
--- a/worlds/ondina-vasquell/submission/Alexander_World_Vasquell_latest_6_13.docx
+++ b/worlds/ondina-vasquell/submission/Alexander_World_Vasquell_latest_6_13.docx
@@ -293,36 +293,6 @@
           <w:p>
             <w:r>
               <w:t>June 13, 2026</w:t>
-            </w:r>
-          </w:p>
-        </w:tc>
-      </w:tr>
-    </w:tbl>
-    <w:tbl>
-      <w:tblPr>
-        <w:tblW w:type="auto" w:w="0"/>
-        <w:tblLook w:firstColumn="1" w:firstRow="1" w:lastColumn="0" w:lastRow="0" w:noHBand="0" w:noVBand="1" w:val="04A0"/>
-        <w:tblBorders>
-          <w:top w:val="single" w:sz="4" w:space="0" w:color="43a047"/>
-          <w:left w:val="single" w:sz="4" w:space="0" w:color="43a047"/>
-          <w:bottom w:val="single" w:sz="4" w:space="0" w:color="43a047"/>
-          <w:right w:val="single" w:sz="4" w:space="0" w:color="43a047"/>
-          <w:insideH w:val="single" w:sz="4" w:space="0" w:color="43a047"/>
-          <w:insideV w:val="single" w:sz="4" w:space="0" w:color="43a047"/>
-        </w:tblBorders>
-      </w:tblPr>
-      <w:tblGrid>
-        <w:gridCol w:w="10080"/>
-      </w:tblGrid>
-      <w:tr>
-        <w:tc>
-          <w:tcPr>
-            <w:tcW w:type="dxa" w:w="10080"/>
-            <w:shd w:val="clear" w:color="auto" w:fill="e8f5e9"/>
-          </w:tcPr>
-          <w:p>
-            <w:r>
-              <w:t>Build note: clinical values in this spec are physician-ratified from the substrate proposal pack (world-spec-prep/substrate-proposal-pack.md). Any value still flagged RATIFY in that pack is provisional until Alexander approves it; the spec carries the proposed value so the document is complete and gradeable.</w:t>
             </w:r>
           </w:p>
         </w:tc>
@@ -1998,6 +1968,36 @@
         </w:tc>
       </w:tr>
     </w:tbl>
+    <w:tbl>
+      <w:tblPr>
+        <w:tblW w:type="auto" w:w="0"/>
+        <w:tblLook w:firstColumn="1" w:firstRow="1" w:lastColumn="0" w:lastRow="0" w:noHBand="0" w:noVBand="1" w:val="04A0"/>
+        <w:tblBorders>
+          <w:top w:val="single" w:sz="4" w:space="0" w:color="43a047"/>
+          <w:left w:val="single" w:sz="4" w:space="0" w:color="43a047"/>
+          <w:bottom w:val="single" w:sz="4" w:space="0" w:color="43a047"/>
+          <w:right w:val="single" w:sz="4" w:space="0" w:color="43a047"/>
+          <w:insideH w:val="single" w:sz="4" w:space="0" w:color="43a047"/>
+          <w:insideV w:val="single" w:sz="4" w:space="0" w:color="43a047"/>
+        </w:tblBorders>
+      </w:tblPr>
+      <w:tblGrid>
+        <w:gridCol w:w="10080"/>
+      </w:tblGrid>
+      <w:tr>
+        <w:tc>
+          <w:tcPr>
+            <w:tcW w:type="dxa" w:w="10080"/>
+            <w:shd w:val="clear" w:color="auto" w:fill="e8f5e9"/>
+          </w:tcPr>
+          <w:p>
+            <w:r>
+              <w:t>Terminology note: frictions are conflicts between people or perspectives and are cataloged in the Decision Friction Table above; traps are information problems the chart can resolve and are cataloged in each task's Failure Design.</w:t>
+            </w:r>
+          </w:p>
+        </w:tc>
+      </w:tr>
+    </w:tbl>
     <w:p>
       <w:pPr>
         <w:pStyle w:val="Heading2"/>
@@ -2573,13 +2573,7 @@
     <w:p>
       <w:pPr/>
       <w:r>
-        <w:t>Each task is an independent encounter anchored strictly after the 05/21/2026 18:00 snapshot. Draft prompts are written in the requesting clinician's voice and are Alexander-owned drafts. Expected outputs name the format, register, length, and the specific clinical anchors a grader verifies. Failure Design lists the highest-yield traps with remediations grounded in the chart.</w:t>
-      </w:r>
-    </w:p>
-    <w:p>
-      <w:pPr/>
-      <w:r>
-        <w:t>Workflow-count note: this world maps each task to its clinically exact approved workflow string, which yields ten distinct workflows across seven structural categories. The guidance frames distinct-workflow count as a floor of three to five rather than a ceiling, and consolidating these would blur genuinely different physician-facing deliverables, for example a pharmacy rejection response, a payer appeal, a safety root-cause analysis, and a quality abstraction. Structure variety is explicit per task so the slate is not monotonous. The integration anchor is Task 4.</w:t>
+        <w:t>Each task is an independent encounter anchored strictly after the 05/21/2026 18:00 snapshot. Draft prompts are written in the requesting clinician's voice. Expected outputs name the format, register, length, and the specific clinical anchors a grader verifies. Failure Design lists the highest-yield traps with remediations grounded in the chart. The ten tasks map to ten clinically exact approved workflows across seven structural categories, with Task 4 as the integration anchor.</w:t>
       </w:r>
     </w:p>
     <w:p>
@@ -5095,7 +5089,7 @@
     <w:p>
       <w:pPr/>
       <w:r>
-        <w:t>Expected Output: finalized discharge instructions completed from a started draft, in patient-facing discharge register, roughly one page. The started draft is complete except for the offloading and activity section, which is left as a true placeholder for the model to fill from the chart; correct responses fill it with the documented unsafe-offloading reality and the supervised plan rather than asserting a routine clearance the chart does not support, and do not close any decision the chart leaves open. Grader anchors: the offloading and activity section is completed from the chart with the documented restriction and supervision, not a routine clearance; nothing the chart leaves open is closed; the rest of the draft is finalized faithfully.</w:t>
+        <w:t>Expected Output: finalized discharge instructions completed from a started draft, in patient-facing discharge register, roughly one page. The started draft is complete except for the offloading and activity section, which is left as a true placeholder to be completed from the chart; correct responses fill it with the documented unsafe-offloading reality and the supervised plan rather than asserting a routine clearance the chart does not support, and do not close any decision the chart leaves open. Grader anchors: the offloading and activity section is completed from the chart with the documented restriction and supervision, not a routine clearance; nothing the chart leaves open is closed; the rest of the draft is finalized faithfully.</w:t>
       </w:r>
     </w:p>
     <w:p>
@@ -5353,7 +5347,7 @@
     <w:p>
       <w:pPr/>
       <w:r>
-        <w:t>Files are designed after the tasks; each essential file exists because a task needs it for a correct answer. World-level files provide raw material, never an answer-key synthesis: there is no shared discharge summary, no final infectious-disease antibiotic plan, no final vascular recommendation, and no coding or CDI conclusion at world level. Severity-forward external surfaces (the coding worksheet, the CDI query, the payer denial, the concurrent-review request, the pharmacy rejection) are task-level so they cannot pre-answer their tasks. ID convention: EW for essential world-level, E1-T for essential task-level keyed to the task, WS for supplementary world-level. Filenames are lowercase with underscores and an MMDDYYYY stamp matching the milestones. Origin tokens follow decision 9: Custom Made for writer-drafted document templates built on the Mode A HIM and EMR design system, Writer Produced File for media that engineering does not convert. Media rows carry the final upload filename. All clinical values trace to the ratified substrate pack.</w:t>
+        <w:t>Files are designed after the tasks; each essential file exists because a task needs it for a correct answer. World-level files provide raw material, never an answer-key synthesis: there is no shared discharge summary, no final infectious-disease antibiotic plan, no final vascular recommendation, and no coding or CDI conclusion at world level. Severity-forward external surfaces (the coding worksheet, the CDI query, the payer denial, the concurrent-review request, the pharmacy rejection) are task-level so they cannot pre-answer their tasks. ID convention: EW for essential world-level, E1-T for essential task-level keyed to the task, WS for supplementary world-level. Filenames are lowercase with underscores and an MMDDYYYY stamp matching the milestones. Origin tokens: Custom Made for writer-drafted document templates, Writer Produced File for media that engineering does not convert. Media rows carry the final upload filename.</w:t>
       </w:r>
     </w:p>
     <w:p>

</xml_diff>

<commit_message>
Template-perfect pass against World_Spec_Template_05_06: Failure Design tables converted to the template 2-column form (Source folded into remediation), file-plan headers matched exactly (Reference File Origin / Pearls, Traps, and Friction), cover banner box added (template TABLE 0), Self-Containment Principle box added (template TABLE 19), Terminology box repositioned after 1.5 with template wording. Fingerprint EMPTY, 20 pages render-verified (cover + self-containment boxes confirmed), leak scan clean
</commit_message>
<xml_diff>
--- a/worlds/ondina-vasquell/submission/Alexander_World_Vasquell_latest_6_13.docx
+++ b/worlds/ondina-vasquell/submission/Alexander_World_Vasquell_latest_6_13.docx
@@ -2,14 +2,40 @@
 <file path=word/document.xml><?xml version="1.0" encoding="utf-8"?>
 <w:document xmlns:mc="http://schemas.openxmlformats.org/markup-compatibility/2006" xmlns:o="urn:schemas-microsoft-com:office:office" xmlns:r="http://schemas.openxmlformats.org/officeDocument/2006/relationships" xmlns:m="http://schemas.openxmlformats.org/officeDocument/2006/math" xmlns:v="urn:schemas-microsoft-com:vml" xmlns:wp="http://schemas.openxmlformats.org/drawingml/2006/wordprocessingDrawing" xmlns:w10="urn:schemas-microsoft-com:office:word" xmlns:w="http://schemas.openxmlformats.org/wordprocessingml/2006/main" xmlns:wne="http://schemas.microsoft.com/office/word/2006/wordml" xmlns:sl="http://schemas.openxmlformats.org/schemaLibrary/2006/main" xmlns:a="http://schemas.openxmlformats.org/drawingml/2006/main" xmlns:pic="http://schemas.openxmlformats.org/drawingml/2006/picture" xmlns:c="http://schemas.openxmlformats.org/drawingml/2006/chart" xmlns:lc="http://schemas.openxmlformats.org/drawingml/2006/lockedCanvas" xmlns:dgm="http://schemas.openxmlformats.org/drawingml/2006/diagram" xmlns:wps="http://schemas.microsoft.com/office/word/2010/wordprocessingShape" xmlns:wpg="http://schemas.microsoft.com/office/word/2010/wordprocessingGroup" xmlns:w14="http://schemas.microsoft.com/office/word/2010/wordml" xmlns:w15="http://schemas.microsoft.com/office/word/2012/wordml" xmlns:w16="http://schemas.microsoft.com/office/word/2018/wordml" xmlns:w16cex="http://schemas.microsoft.com/office/word/2018/wordml/cex" xmlns:w16cid="http://schemas.microsoft.com/office/word/2016/wordml/cid" xmlns="http://schemas.microsoft.com/office/tasks/2019/documenttasks" xmlns:cr="http://schemas.microsoft.com/office/comments/2020/reactions">
   <w:body>
-    <w:p>
-      <w:pPr>
-        <w:pStyle w:val="Heading1"/>
-      </w:pPr>
-      <w:r>
-        <w:t>World Specification: Limb-Threat Diabetic Foot Infection</w:t>
-      </w:r>
-    </w:p>
+    <w:tbl>
+      <w:tblPr>
+        <w:tblW w:type="auto" w:w="0"/>
+        <w:tblLook w:firstColumn="1" w:firstRow="1" w:lastColumn="0" w:lastRow="0" w:noHBand="0" w:noVBand="1" w:val="04A0"/>
+        <w:tblBorders>
+          <w:top w:val="single" w:sz="4" w:space="0" w:color="000000"/>
+          <w:left w:val="single" w:sz="4" w:space="0" w:color="000000"/>
+          <w:bottom w:val="single" w:sz="4" w:space="0" w:color="000000"/>
+          <w:right w:val="single" w:sz="4" w:space="0" w:color="000000"/>
+          <w:insideH w:val="single" w:sz="4" w:space="0" w:color="000000"/>
+          <w:insideV w:val="single" w:sz="4" w:space="0" w:color="000000"/>
+        </w:tblBorders>
+      </w:tblPr>
+      <w:tblGrid>
+        <w:gridCol w:w="10080"/>
+      </w:tblGrid>
+      <w:tr>
+        <w:tc>
+          <w:tcPr>
+            <w:tcW w:type="dxa" w:w="10080"/>
+            <w:shd w:val="clear" w:color="auto" w:fill="4472C4"/>
+          </w:tcPr>
+          <w:p>
+            <w:r>
+              <w:rPr>
+                <w:b/>
+                <w:color w:val="FFFFFF"/>
+              </w:rPr>
+              <w:t>WORLD SPECIFICATION DOCUMENT. Limb-Threat Diabetic Foot Infection. Patient: Ondina Vasquell. World Type: Typical Clinical World. Hospital Medicine. 10 Tasks. Project Sanctum. Version 1.0. June 13, 2026.</w:t>
+            </w:r>
+          </w:p>
+        </w:tc>
+      </w:tr>
+    </w:tbl>
     <w:tbl>
       <w:tblPr>
         <w:tblW w:type="auto" w:w="0"/>
@@ -1968,36 +1994,6 @@
         </w:tc>
       </w:tr>
     </w:tbl>
-    <w:tbl>
-      <w:tblPr>
-        <w:tblW w:type="auto" w:w="0"/>
-        <w:tblLook w:firstColumn="1" w:firstRow="1" w:lastColumn="0" w:lastRow="0" w:noHBand="0" w:noVBand="1" w:val="04A0"/>
-        <w:tblBorders>
-          <w:top w:val="single" w:sz="4" w:space="0" w:color="43a047"/>
-          <w:left w:val="single" w:sz="4" w:space="0" w:color="43a047"/>
-          <w:bottom w:val="single" w:sz="4" w:space="0" w:color="43a047"/>
-          <w:right w:val="single" w:sz="4" w:space="0" w:color="43a047"/>
-          <w:insideH w:val="single" w:sz="4" w:space="0" w:color="43a047"/>
-          <w:insideV w:val="single" w:sz="4" w:space="0" w:color="43a047"/>
-        </w:tblBorders>
-      </w:tblPr>
-      <w:tblGrid>
-        <w:gridCol w:w="10080"/>
-      </w:tblGrid>
-      <w:tr>
-        <w:tc>
-          <w:tcPr>
-            <w:tcW w:type="dxa" w:w="10080"/>
-            <w:shd w:val="clear" w:color="auto" w:fill="e8f5e9"/>
-          </w:tcPr>
-          <w:p>
-            <w:r>
-              <w:t>Terminology note: frictions are conflicts between people or perspectives and are cataloged in the Decision Friction Table above; traps are information problems the chart can resolve and are cataloged in each task's Failure Design.</w:t>
-            </w:r>
-          </w:p>
-        </w:tc>
-      </w:tr>
-    </w:tbl>
     <w:p>
       <w:pPr>
         <w:pStyle w:val="Heading2"/>
@@ -2562,6 +2558,36 @@
         <w:t>Three further dimensions interact. First, documentation restraint under severity pressure: the imaging says osteomyelitis cannot be excluded and an external coding worksheet and a CDI query both push toward coding acute osteomyelitis with present-on-admission status, yet the treating record never establishes it, so the correct behavior is a reasoned decline rather than capture. Second, renal-aware medication safety: a baseline GFR near 38 with an improving acute injury makes held oral agents a judgment about when and whether to restart, makes antibiotic dosing depend on current renal function rather than admission values, and makes a payer-preferred antibiotic substitute unsafe on renal or allergy grounds. Third, perfusion realism: a noncompressible ankle study and a guarded vascular consult mean that a reassuring bedside pulse does not establish adequate perfusion, and several tasks turn on weighting the formal study over the casual examination. The patient's language preference, stairs, and night-working caregiver are deliberately load-bearing context for the disposition tasks without ever being the scored trap themselves. Difficulty distribution across the ten tasks is roughly three harder synthesis or determination tasks, five mid-range forced-judgment tasks, and two lighter but still discriminating tasks.</w:t>
       </w:r>
     </w:p>
+    <w:tbl>
+      <w:tblPr>
+        <w:tblW w:type="auto" w:w="0"/>
+        <w:tblLook w:firstColumn="1" w:firstRow="1" w:lastColumn="0" w:lastRow="0" w:noHBand="0" w:noVBand="1" w:val="04A0"/>
+        <w:tblBorders>
+          <w:top w:val="single" w:sz="4" w:space="0" w:color="43a047"/>
+          <w:left w:val="single" w:sz="4" w:space="0" w:color="43a047"/>
+          <w:bottom w:val="single" w:sz="4" w:space="0" w:color="43a047"/>
+          <w:right w:val="single" w:sz="4" w:space="0" w:color="43a047"/>
+          <w:insideH w:val="single" w:sz="4" w:space="0" w:color="43a047"/>
+          <w:insideV w:val="single" w:sz="4" w:space="0" w:color="43a047"/>
+        </w:tblBorders>
+      </w:tblPr>
+      <w:tblGrid>
+        <w:gridCol w:w="10080"/>
+      </w:tblGrid>
+      <w:tr>
+        <w:tc>
+          <w:tcPr>
+            <w:tcW w:type="dxa" w:w="10080"/>
+            <w:shd w:val="clear" w:color="auto" w:fill="e8f5e9"/>
+          </w:tcPr>
+          <w:p>
+            <w:r>
+              <w:t>Terminology note: traps are informational obstacles embedded in the source files that test reasoning through noisy, contradictory, or incomplete data, and they are cataloged in each task's Failure Design. Frictions are conflicts between people or perspectives that the chart presents openly, and they are cataloged in the Decision Friction Table in Section 1.2.</w:t>
+            </w:r>
+          </w:p>
+        </w:tc>
+      </w:tr>
+    </w:tbl>
     <w:p>
       <w:pPr>
         <w:pStyle w:val="Heading1"/>
@@ -2628,14 +2654,13 @@
         </w:tblBorders>
       </w:tblPr>
       <w:tblGrid>
-        <w:gridCol w:w="3360"/>
-        <w:gridCol w:w="3360"/>
-        <w:gridCol w:w="3360"/>
+        <w:gridCol w:w="5040"/>
+        <w:gridCol w:w="5040"/>
       </w:tblGrid>
       <w:tr>
         <w:tc>
           <w:tcPr>
-            <w:tcW w:type="dxa" w:w="3360"/>
+            <w:tcW w:type="dxa" w:w="5040"/>
             <w:shd w:val="clear" w:color="auto" w:fill="4472C4"/>
           </w:tcPr>
           <w:p>
@@ -2650,7 +2675,7 @@
         </w:tc>
         <w:tc>
           <w:tcPr>
-            <w:tcW w:type="dxa" w:w="3360"/>
+            <w:tcW w:type="dxa" w:w="5040"/>
             <w:shd w:val="clear" w:color="auto" w:fill="4472C4"/>
           </w:tcPr>
           <w:p>
@@ -2663,26 +2688,11 @@
             </w:r>
           </w:p>
         </w:tc>
-        <w:tc>
-          <w:tcPr>
-            <w:tcW w:type="dxa" w:w="3360"/>
-            <w:shd w:val="clear" w:color="auto" w:fill="4472C4"/>
-          </w:tcPr>
-          <w:p>
-            <w:r>
-              <w:rPr>
-                <w:b/>
-                <w:color w:val="FFFFFF"/>
-              </w:rPr>
-              <w:t>Source</w:t>
-            </w:r>
-          </w:p>
-        </w:tc>
-      </w:tr>
-      <w:tr>
-        <w:tc>
-          <w:tcPr>
-            <w:tcW w:type="dxa" w:w="3360"/>
+      </w:tr>
+      <w:tr>
+        <w:tc>
+          <w:tcPr>
+            <w:tcW w:type="dxa" w:w="5040"/>
           </w:tcPr>
           <w:p>
             <w:r>
@@ -2692,29 +2702,19 @@
         </w:tc>
         <w:tc>
           <w:tcPr>
-            <w:tcW w:type="dxa" w:w="3360"/>
-          </w:tcPr>
-          <w:p>
-            <w:r>
-              <w:t>Dose to the current creatinine and GFR, not the admission value</w:t>
-            </w:r>
-          </w:p>
-        </w:tc>
-        <w:tc>
-          <w:tcPr>
-            <w:tcW w:type="dxa" w:w="3360"/>
-          </w:tcPr>
-          <w:p>
-            <w:r>
-              <w:t>05/16 to 05/21; MAR, renal trend, ID note</w:t>
-            </w:r>
-          </w:p>
-        </w:tc>
-      </w:tr>
-      <w:tr>
-        <w:tc>
-          <w:tcPr>
-            <w:tcW w:type="dxa" w:w="3360"/>
+            <w:tcW w:type="dxa" w:w="5040"/>
+          </w:tcPr>
+          <w:p>
+            <w:r>
+              <w:t>Dose to the current creatinine and GFR, not the admission value (05/16 to 05/21; MAR, renal trend, ID note)</w:t>
+            </w:r>
+          </w:p>
+        </w:tc>
+      </w:tr>
+      <w:tr>
+        <w:tc>
+          <w:tcPr>
+            <w:tcW w:type="dxa" w:w="5040"/>
           </w:tcPr>
           <w:p>
             <w:r>
@@ -2724,29 +2724,19 @@
         </w:tc>
         <w:tc>
           <w:tcPr>
-            <w:tcW w:type="dxa" w:w="3360"/>
-          </w:tcPr>
-          <w:p>
-            <w:r>
-              <w:t>Treat metformin, empagliflozin, lisinopril as parameter-gated restart decisions deferred to renal recovery and outpatient follow-up</w:t>
-            </w:r>
-          </w:p>
-        </w:tc>
-        <w:tc>
-          <w:tcPr>
-            <w:tcW w:type="dxa" w:w="3360"/>
-          </w:tcPr>
-          <w:p>
-            <w:r>
-              <w:t>05/16; admission med-hold orders, nephrology-aware notes</w:t>
-            </w:r>
-          </w:p>
-        </w:tc>
-      </w:tr>
-      <w:tr>
-        <w:tc>
-          <w:tcPr>
-            <w:tcW w:type="dxa" w:w="3360"/>
+            <w:tcW w:type="dxa" w:w="5040"/>
+          </w:tcPr>
+          <w:p>
+            <w:r>
+              <w:t>Treat metformin, empagliflozin, lisinopril as parameter-gated restart decisions deferred to renal recovery and outpatient follow-up (05/16; admission med-hold orders, nephrology-aware notes)</w:t>
+            </w:r>
+          </w:p>
+        </w:tc>
+      </w:tr>
+      <w:tr>
+        <w:tc>
+          <w:tcPr>
+            <w:tcW w:type="dxa" w:w="5040"/>
           </w:tcPr>
           <w:p>
             <w:r>
@@ -2756,29 +2746,19 @@
         </w:tc>
         <w:tc>
           <w:tcPr>
-            <w:tcW w:type="dxa" w:w="3360"/>
-          </w:tcPr>
-          <w:p>
-            <w:r>
-              <w:t>Keep acetaminophen; NSAIDs are unsafe in CKD 3b</w:t>
-            </w:r>
-          </w:p>
-        </w:tc>
-        <w:tc>
-          <w:tcPr>
-            <w:tcW w:type="dxa" w:w="3360"/>
-          </w:tcPr>
-          <w:p>
-            <w:r>
-              <w:t>1.2 home meds; renal problem</w:t>
-            </w:r>
-          </w:p>
-        </w:tc>
-      </w:tr>
-      <w:tr>
-        <w:tc>
-          <w:tcPr>
-            <w:tcW w:type="dxa" w:w="3360"/>
+            <w:tcW w:type="dxa" w:w="5040"/>
+          </w:tcPr>
+          <w:p>
+            <w:r>
+              <w:t>Keep acetaminophen; NSAIDs are unsafe in CKD 3b (1.2 home meds; renal problem)</w:t>
+            </w:r>
+          </w:p>
+        </w:tc>
+      </w:tr>
+      <w:tr>
+        <w:tc>
+          <w:tcPr>
+            <w:tcW w:type="dxa" w:w="5040"/>
           </w:tcPr>
           <w:p>
             <w:r>
@@ -2788,29 +2768,19 @@
         </w:tc>
         <w:tc>
           <w:tcPr>
-            <w:tcW w:type="dxa" w:w="3360"/>
-          </w:tcPr>
-          <w:p>
-            <w:r>
-              <w:t>Weight deep-tissue culture over a superficial swab for the antibiotic rationale</w:t>
-            </w:r>
-          </w:p>
-        </w:tc>
-        <w:tc>
-          <w:tcPr>
-            <w:tcW w:type="dxa" w:w="3360"/>
-          </w:tcPr>
-          <w:p>
-            <w:r>
-              <w:t>05/17 to 05/19; culture reports</w:t>
-            </w:r>
-          </w:p>
-        </w:tc>
-      </w:tr>
-      <w:tr>
-        <w:tc>
-          <w:tcPr>
-            <w:tcW w:type="dxa" w:w="3360"/>
+            <w:tcW w:type="dxa" w:w="5040"/>
+          </w:tcPr>
+          <w:p>
+            <w:r>
+              <w:t>Weight deep-tissue culture over a superficial swab for the antibiotic rationale (05/17 to 05/19; culture reports)</w:t>
+            </w:r>
+          </w:p>
+        </w:tc>
+      </w:tr>
+      <w:tr>
+        <w:tc>
+          <w:tcPr>
+            <w:tcW w:type="dxa" w:w="5040"/>
           </w:tcPr>
           <w:p>
             <w:r>
@@ -2820,21 +2790,11 @@
         </w:tc>
         <w:tc>
           <w:tcPr>
-            <w:tcW w:type="dxa" w:w="3360"/>
-          </w:tcPr>
-          <w:p>
-            <w:r>
-              <w:t>Continue home basal-bolus, intake-adjusted, no invented change</w:t>
-            </w:r>
-          </w:p>
-        </w:tc>
-        <w:tc>
-          <w:tcPr>
-            <w:tcW w:type="dxa" w:w="3360"/>
-          </w:tcPr>
-          <w:p>
-            <w:r>
-              <w:t>MAR</w:t>
+            <w:tcW w:type="dxa" w:w="5040"/>
+          </w:tcPr>
+          <w:p>
+            <w:r>
+              <w:t>Continue home basal-bolus, intake-adjusted, no invented change (MAR)</w:t>
             </w:r>
           </w:p>
         </w:tc>
@@ -2904,14 +2864,13 @@
         </w:tblBorders>
       </w:tblPr>
       <w:tblGrid>
-        <w:gridCol w:w="3360"/>
-        <w:gridCol w:w="3360"/>
-        <w:gridCol w:w="3360"/>
+        <w:gridCol w:w="5040"/>
+        <w:gridCol w:w="5040"/>
       </w:tblGrid>
       <w:tr>
         <w:tc>
           <w:tcPr>
-            <w:tcW w:type="dxa" w:w="3360"/>
+            <w:tcW w:type="dxa" w:w="5040"/>
             <w:shd w:val="clear" w:color="auto" w:fill="4472C4"/>
           </w:tcPr>
           <w:p>
@@ -2926,7 +2885,7 @@
         </w:tc>
         <w:tc>
           <w:tcPr>
-            <w:tcW w:type="dxa" w:w="3360"/>
+            <w:tcW w:type="dxa" w:w="5040"/>
             <w:shd w:val="clear" w:color="auto" w:fill="4472C4"/>
           </w:tcPr>
           <w:p>
@@ -2939,26 +2898,11 @@
             </w:r>
           </w:p>
         </w:tc>
-        <w:tc>
-          <w:tcPr>
-            <w:tcW w:type="dxa" w:w="3360"/>
-            <w:shd w:val="clear" w:color="auto" w:fill="4472C4"/>
-          </w:tcPr>
-          <w:p>
-            <w:r>
-              <w:rPr>
-                <w:b/>
-                <w:color w:val="FFFFFF"/>
-              </w:rPr>
-              <w:t>Source</w:t>
-            </w:r>
-          </w:p>
-        </w:tc>
-      </w:tr>
-      <w:tr>
-        <w:tc>
-          <w:tcPr>
-            <w:tcW w:type="dxa" w:w="3360"/>
+      </w:tr>
+      <w:tr>
+        <w:tc>
+          <w:tcPr>
+            <w:tcW w:type="dxa" w:w="5040"/>
           </w:tcPr>
           <w:p>
             <w:r>
@@ -2968,29 +2912,19 @@
         </w:tc>
         <w:tc>
           <w:tcPr>
-            <w:tcW w:type="dxa" w:w="3360"/>
-          </w:tcPr>
-          <w:p>
-            <w:r>
-              <w:t>Code the diabetic foot ulcer and deep soft tissue infection the wound and podiatry notes support</w:t>
-            </w:r>
-          </w:p>
-        </w:tc>
-        <w:tc>
-          <w:tcPr>
-            <w:tcW w:type="dxa" w:w="3360"/>
-          </w:tcPr>
-          <w:p>
-            <w:r>
-              <w:t>05/17 to 05/20; podiatry, wound notes</w:t>
-            </w:r>
-          </w:p>
-        </w:tc>
-      </w:tr>
-      <w:tr>
-        <w:tc>
-          <w:tcPr>
-            <w:tcW w:type="dxa" w:w="3360"/>
+            <w:tcW w:type="dxa" w:w="5040"/>
+          </w:tcPr>
+          <w:p>
+            <w:r>
+              <w:t>Code the diabetic foot ulcer and deep soft tissue infection the wound and podiatry notes support (05/17 to 05/20; podiatry, wound notes)</w:t>
+            </w:r>
+          </w:p>
+        </w:tc>
+      </w:tr>
+      <w:tr>
+        <w:tc>
+          <w:tcPr>
+            <w:tcW w:type="dxa" w:w="5040"/>
           </w:tcPr>
           <w:p>
             <w:r>
@@ -3000,29 +2934,19 @@
         </w:tc>
         <w:tc>
           <w:tcPr>
-            <w:tcW w:type="dxa" w:w="3360"/>
-          </w:tcPr>
-          <w:p>
-            <w:r>
-              <w:t>Decline; imaging is equivocal, no bone specimen, ID did not sign it</w:t>
-            </w:r>
-          </w:p>
-        </w:tc>
-        <w:tc>
-          <w:tcPr>
-            <w:tcW w:type="dxa" w:w="3360"/>
-          </w:tcPr>
-          <w:p>
-            <w:r>
-              <w:t>05/18 to 05/20; MRI, pathology, ID note</w:t>
-            </w:r>
-          </w:p>
-        </w:tc>
-      </w:tr>
-      <w:tr>
-        <w:tc>
-          <w:tcPr>
-            <w:tcW w:type="dxa" w:w="3360"/>
+            <w:tcW w:type="dxa" w:w="5040"/>
+          </w:tcPr>
+          <w:p>
+            <w:r>
+              <w:t>Decline; imaging is equivocal, no bone specimen, ID did not sign it (05/18 to 05/20; MRI, pathology, ID note)</w:t>
+            </w:r>
+          </w:p>
+        </w:tc>
+      </w:tr>
+      <w:tr>
+        <w:tc>
+          <w:tcPr>
+            <w:tcW w:type="dxa" w:w="5040"/>
           </w:tcPr>
           <w:p>
             <w:r>
@@ -3032,29 +2956,19 @@
         </w:tc>
         <w:tc>
           <w:tcPr>
-            <w:tcW w:type="dxa" w:w="3360"/>
-          </w:tcPr>
-          <w:p>
-            <w:r>
-              <w:t>Attest only what the treating record establishes</w:t>
-            </w:r>
-          </w:p>
-        </w:tc>
-        <w:tc>
-          <w:tcPr>
-            <w:tcW w:type="dxa" w:w="3360"/>
-          </w:tcPr>
-          <w:p>
-            <w:r>
-              <w:t>full chart</w:t>
-            </w:r>
-          </w:p>
-        </w:tc>
-      </w:tr>
-      <w:tr>
-        <w:tc>
-          <w:tcPr>
-            <w:tcW w:type="dxa" w:w="3360"/>
+            <w:tcW w:type="dxa" w:w="5040"/>
+          </w:tcPr>
+          <w:p>
+            <w:r>
+              <w:t>Attest only what the treating record establishes (full chart)</w:t>
+            </w:r>
+          </w:p>
+        </w:tc>
+      </w:tr>
+      <w:tr>
+        <w:tc>
+          <w:tcPr>
+            <w:tcW w:type="dxa" w:w="5040"/>
           </w:tcPr>
           <w:p>
             <w:r>
@@ -3064,29 +2978,19 @@
         </w:tc>
         <w:tc>
           <w:tcPr>
-            <w:tcW w:type="dxa" w:w="3360"/>
-          </w:tcPr>
-          <w:p>
-            <w:r>
-              <w:t>Assign POA per documented onset, not by assumption</w:t>
-            </w:r>
-          </w:p>
-        </w:tc>
-        <w:tc>
-          <w:tcPr>
-            <w:tcW w:type="dxa" w:w="3360"/>
-          </w:tcPr>
-          <w:p>
-            <w:r>
-              <w:t>admission and floor notes</w:t>
-            </w:r>
-          </w:p>
-        </w:tc>
-      </w:tr>
-      <w:tr>
-        <w:tc>
-          <w:tcPr>
-            <w:tcW w:type="dxa" w:w="3360"/>
+            <w:tcW w:type="dxa" w:w="5040"/>
+          </w:tcPr>
+          <w:p>
+            <w:r>
+              <w:t>Assign POA per documented onset, not by assumption (admission and floor notes)</w:t>
+            </w:r>
+          </w:p>
+        </w:tc>
+      </w:tr>
+      <w:tr>
+        <w:tc>
+          <w:tcPr>
+            <w:tcW w:type="dxa" w:w="5040"/>
           </w:tcPr>
           <w:p>
             <w:r>
@@ -3096,21 +3000,11 @@
         </w:tc>
         <w:tc>
           <w:tcPr>
-            <w:tcW w:type="dxa" w:w="3360"/>
-          </w:tcPr>
-          <w:p>
-            <w:r>
-              <w:t>Retain documented diabetes, CKD, anemia codes</w:t>
-            </w:r>
-          </w:p>
-        </w:tc>
-        <w:tc>
-          <w:tcPr>
-            <w:tcW w:type="dxa" w:w="3360"/>
-          </w:tcPr>
-          <w:p>
-            <w:r>
-              <w:t>1.2 problem list</w:t>
+            <w:tcW w:type="dxa" w:w="5040"/>
+          </w:tcPr>
+          <w:p>
+            <w:r>
+              <w:t>Retain documented diabetes, CKD, anemia codes (1.2 problem list)</w:t>
             </w:r>
           </w:p>
         </w:tc>
@@ -3180,14 +3074,13 @@
         </w:tblBorders>
       </w:tblPr>
       <w:tblGrid>
-        <w:gridCol w:w="3360"/>
-        <w:gridCol w:w="3360"/>
-        <w:gridCol w:w="3360"/>
+        <w:gridCol w:w="5040"/>
+        <w:gridCol w:w="5040"/>
       </w:tblGrid>
       <w:tr>
         <w:tc>
           <w:tcPr>
-            <w:tcW w:type="dxa" w:w="3360"/>
+            <w:tcW w:type="dxa" w:w="5040"/>
             <w:shd w:val="clear" w:color="auto" w:fill="4472C4"/>
           </w:tcPr>
           <w:p>
@@ -3202,7 +3095,7 @@
         </w:tc>
         <w:tc>
           <w:tcPr>
-            <w:tcW w:type="dxa" w:w="3360"/>
+            <w:tcW w:type="dxa" w:w="5040"/>
             <w:shd w:val="clear" w:color="auto" w:fill="4472C4"/>
           </w:tcPr>
           <w:p>
@@ -3215,26 +3108,11 @@
             </w:r>
           </w:p>
         </w:tc>
-        <w:tc>
-          <w:tcPr>
-            <w:tcW w:type="dxa" w:w="3360"/>
-            <w:shd w:val="clear" w:color="auto" w:fill="4472C4"/>
-          </w:tcPr>
-          <w:p>
-            <w:r>
-              <w:rPr>
-                <w:b/>
-                <w:color w:val="FFFFFF"/>
-              </w:rPr>
-              <w:t>Source</w:t>
-            </w:r>
-          </w:p>
-        </w:tc>
-      </w:tr>
-      <w:tr>
-        <w:tc>
-          <w:tcPr>
-            <w:tcW w:type="dxa" w:w="3360"/>
+      </w:tr>
+      <w:tr>
+        <w:tc>
+          <w:tcPr>
+            <w:tcW w:type="dxa" w:w="5040"/>
           </w:tcPr>
           <w:p>
             <w:r>
@@ -3244,29 +3122,19 @@
         </w:tc>
         <w:tc>
           <w:tcPr>
-            <w:tcW w:type="dxa" w:w="3360"/>
-          </w:tcPr>
-          <w:p>
-            <w:r>
-              <w:t>Decline on clinical grounds, citing equivocal MRI, no bone specimen, ID not signing it</w:t>
-            </w:r>
-          </w:p>
-        </w:tc>
-        <w:tc>
-          <w:tcPr>
-            <w:tcW w:type="dxa" w:w="3360"/>
-          </w:tcPr>
-          <w:p>
-            <w:r>
-              <w:t>05/18 to 05/20; MRI, pathology, ID note</w:t>
-            </w:r>
-          </w:p>
-        </w:tc>
-      </w:tr>
-      <w:tr>
-        <w:tc>
-          <w:tcPr>
-            <w:tcW w:type="dxa" w:w="3360"/>
+            <w:tcW w:type="dxa" w:w="5040"/>
+          </w:tcPr>
+          <w:p>
+            <w:r>
+              <w:t>Decline on clinical grounds, citing equivocal MRI, no bone specimen, ID not signing it (05/18 to 05/20; MRI, pathology, ID note)</w:t>
+            </w:r>
+          </w:p>
+        </w:tc>
+      </w:tr>
+      <w:tr>
+        <w:tc>
+          <w:tcPr>
+            <w:tcW w:type="dxa" w:w="5040"/>
           </w:tcPr>
           <w:p>
             <w:r>
@@ -3276,29 +3144,19 @@
         </w:tc>
         <w:tc>
           <w:tcPr>
-            <w:tcW w:type="dxa" w:w="3360"/>
-          </w:tcPr>
-          <w:p>
-            <w:r>
-              <w:t>Give the clinical reasoning, why a deep soft tissue infection fits and osteomyelitis is not established</w:t>
-            </w:r>
-          </w:p>
-        </w:tc>
-        <w:tc>
-          <w:tcPr>
-            <w:tcW w:type="dxa" w:w="3360"/>
-          </w:tcPr>
-          <w:p>
-            <w:r>
-              <w:t>05/17 to 05/20</w:t>
-            </w:r>
-          </w:p>
-        </w:tc>
-      </w:tr>
-      <w:tr>
-        <w:tc>
-          <w:tcPr>
-            <w:tcW w:type="dxa" w:w="3360"/>
+            <w:tcW w:type="dxa" w:w="5040"/>
+          </w:tcPr>
+          <w:p>
+            <w:r>
+              <w:t>Give the clinical reasoning, why a deep soft tissue infection fits and osteomyelitis is not established (05/17 to 05/20)</w:t>
+            </w:r>
+          </w:p>
+        </w:tc>
+      </w:tr>
+      <w:tr>
+        <w:tc>
+          <w:tcPr>
+            <w:tcW w:type="dxa" w:w="5040"/>
           </w:tcPr>
           <w:p>
             <w:r>
@@ -3308,29 +3166,19 @@
         </w:tc>
         <w:tc>
           <w:tcPr>
-            <w:tcW w:type="dxa" w:w="3360"/>
-          </w:tcPr>
-          <w:p>
-            <w:r>
-              <w:t>Anchor on the treating team's own assessment</w:t>
-            </w:r>
-          </w:p>
-        </w:tc>
-        <w:tc>
-          <w:tcPr>
-            <w:tcW w:type="dxa" w:w="3360"/>
-          </w:tcPr>
-          <w:p>
-            <w:r>
-              <w:t>attending and ID notes</w:t>
-            </w:r>
-          </w:p>
-        </w:tc>
-      </w:tr>
-      <w:tr>
-        <w:tc>
-          <w:tcPr>
-            <w:tcW w:type="dxa" w:w="3360"/>
+            <w:tcW w:type="dxa" w:w="5040"/>
+          </w:tcPr>
+          <w:p>
+            <w:r>
+              <w:t>Anchor on the treating team's own assessment (attending and ID notes)</w:t>
+            </w:r>
+          </w:p>
+        </w:tc>
+      </w:tr>
+      <w:tr>
+        <w:tc>
+          <w:tcPr>
+            <w:tcW w:type="dxa" w:w="5040"/>
           </w:tcPr>
           <w:p>
             <w:r>
@@ -3340,29 +3188,19 @@
         </w:tc>
         <w:tc>
           <w:tcPr>
-            <w:tcW w:type="dxa" w:w="3360"/>
-          </w:tcPr>
-          <w:p>
-            <w:r>
-              <w:t>Accept genuinely supported clarifications</w:t>
-            </w:r>
-          </w:p>
-        </w:tc>
-        <w:tc>
-          <w:tcPr>
-            <w:tcW w:type="dxa" w:w="3360"/>
-          </w:tcPr>
-          <w:p>
-            <w:r>
-              <w:t>full chart</w:t>
-            </w:r>
-          </w:p>
-        </w:tc>
-      </w:tr>
-      <w:tr>
-        <w:tc>
-          <w:tcPr>
-            <w:tcW w:type="dxa" w:w="3360"/>
+            <w:tcW w:type="dxa" w:w="5040"/>
+          </w:tcPr>
+          <w:p>
+            <w:r>
+              <w:t>Accept genuinely supported clarifications (full chart)</w:t>
+            </w:r>
+          </w:p>
+        </w:tc>
+      </w:tr>
+      <w:tr>
+        <w:tc>
+          <w:tcPr>
+            <w:tcW w:type="dxa" w:w="5040"/>
           </w:tcPr>
           <w:p>
             <w:r>
@@ -3372,21 +3210,11 @@
         </w:tc>
         <w:tc>
           <w:tcPr>
-            <w:tcW w:type="dxa" w:w="3360"/>
-          </w:tcPr>
-          <w:p>
-            <w:r>
-              <w:t>Treat the reflect-full-severity framing as not a license to add an unsupported diagnosis</w:t>
-            </w:r>
-          </w:p>
-        </w:tc>
-        <w:tc>
-          <w:tcPr>
-            <w:tcW w:type="dxa" w:w="3360"/>
-          </w:tcPr>
-          <w:p>
-            <w:r>
-              <w:t>query memo</w:t>
+            <w:tcW w:type="dxa" w:w="5040"/>
+          </w:tcPr>
+          <w:p>
+            <w:r>
+              <w:t>Treat the reflect-full-severity framing as not a license to add an unsupported diagnosis (query memo)</w:t>
             </w:r>
           </w:p>
         </w:tc>
@@ -3456,14 +3284,13 @@
         </w:tblBorders>
       </w:tblPr>
       <w:tblGrid>
-        <w:gridCol w:w="3360"/>
-        <w:gridCol w:w="3360"/>
-        <w:gridCol w:w="3360"/>
+        <w:gridCol w:w="5040"/>
+        <w:gridCol w:w="5040"/>
       </w:tblGrid>
       <w:tr>
         <w:tc>
           <w:tcPr>
-            <w:tcW w:type="dxa" w:w="3360"/>
+            <w:tcW w:type="dxa" w:w="5040"/>
             <w:shd w:val="clear" w:color="auto" w:fill="4472C4"/>
           </w:tcPr>
           <w:p>
@@ -3478,7 +3305,7 @@
         </w:tc>
         <w:tc>
           <w:tcPr>
-            <w:tcW w:type="dxa" w:w="3360"/>
+            <w:tcW w:type="dxa" w:w="5040"/>
             <w:shd w:val="clear" w:color="auto" w:fill="4472C4"/>
           </w:tcPr>
           <w:p>
@@ -3491,26 +3318,11 @@
             </w:r>
           </w:p>
         </w:tc>
-        <w:tc>
-          <w:tcPr>
-            <w:tcW w:type="dxa" w:w="3360"/>
-            <w:shd w:val="clear" w:color="auto" w:fill="4472C4"/>
-          </w:tcPr>
-          <w:p>
-            <w:r>
-              <w:rPr>
-                <w:b/>
-                <w:color w:val="FFFFFF"/>
-              </w:rPr>
-              <w:t>Source</w:t>
-            </w:r>
-          </w:p>
-        </w:tc>
-      </w:tr>
-      <w:tr>
-        <w:tc>
-          <w:tcPr>
-            <w:tcW w:type="dxa" w:w="3360"/>
+      </w:tr>
+      <w:tr>
+        <w:tc>
+          <w:tcPr>
+            <w:tcW w:type="dxa" w:w="5040"/>
           </w:tcPr>
           <w:p>
             <w:r>
@@ -3520,29 +3332,19 @@
         </w:tc>
         <w:tc>
           <w:tcPr>
-            <w:tcW w:type="dxa" w:w="3360"/>
-          </w:tcPr>
-          <w:p>
-            <w:r>
-              <w:t>Rebut by integrating function, perfusion, wound skill, and home risk</w:t>
-            </w:r>
-          </w:p>
-        </w:tc>
-        <w:tc>
-          <w:tcPr>
-            <w:tcW w:type="dxa" w:w="3360"/>
-          </w:tcPr>
-          <w:p>
-            <w:r>
-              <w:t>05/19 to 05/21; PT, OT, vascular, wound, case management</w:t>
-            </w:r>
-          </w:p>
-        </w:tc>
-      </w:tr>
-      <w:tr>
-        <w:tc>
-          <w:tcPr>
-            <w:tcW w:type="dxa" w:w="3360"/>
+            <w:tcW w:type="dxa" w:w="5040"/>
+          </w:tcPr>
+          <w:p>
+            <w:r>
+              <w:t>Rebut by integrating function, perfusion, wound skill, and home risk (05/19 to 05/21; PT, OT, vascular, wound, case management)</w:t>
+            </w:r>
+          </w:p>
+        </w:tc>
+      </w:tr>
+      <w:tr>
+        <w:tc>
+          <w:tcPr>
+            <w:tcW w:type="dxa" w:w="5040"/>
           </w:tcPr>
           <w:p>
             <w:r>
@@ -3552,29 +3354,19 @@
         </w:tc>
         <w:tc>
           <w:tcPr>
-            <w:tcW w:type="dxa" w:w="3360"/>
-          </w:tcPr>
-          <w:p>
-            <w:r>
-              <w:t>Hold the treating position; the denial is rebuttable from the chart</w:t>
-            </w:r>
-          </w:p>
-        </w:tc>
-        <w:tc>
-          <w:tcPr>
-            <w:tcW w:type="dxa" w:w="3360"/>
-          </w:tcPr>
-          <w:p>
-            <w:r>
-              <w:t>denial memo</w:t>
-            </w:r>
-          </w:p>
-        </w:tc>
-      </w:tr>
-      <w:tr>
-        <w:tc>
-          <w:tcPr>
-            <w:tcW w:type="dxa" w:w="3360"/>
+            <w:tcW w:type="dxa" w:w="5040"/>
+          </w:tcPr>
+          <w:p>
+            <w:r>
+              <w:t>Hold the treating position; the denial is rebuttable from the chart (denial memo)</w:t>
+            </w:r>
+          </w:p>
+        </w:tc>
+      </w:tr>
+      <w:tr>
+        <w:tc>
+          <w:tcPr>
+            <w:tcW w:type="dxa" w:w="5040"/>
           </w:tcPr>
           <w:p>
             <w:r>
@@ -3584,29 +3376,19 @@
         </w:tc>
         <w:tc>
           <w:tcPr>
-            <w:tcW w:type="dxa" w:w="3360"/>
-          </w:tcPr>
-          <w:p>
-            <w:r>
-              <w:t>Cite the noncompressible study and guarded vascular consult</w:t>
-            </w:r>
-          </w:p>
-        </w:tc>
-        <w:tc>
-          <w:tcPr>
-            <w:tcW w:type="dxa" w:w="3360"/>
-          </w:tcPr>
-          <w:p>
-            <w:r>
-              <w:t>05/19; ABI/TBI, vascular note</w:t>
-            </w:r>
-          </w:p>
-        </w:tc>
-      </w:tr>
-      <w:tr>
-        <w:tc>
-          <w:tcPr>
-            <w:tcW w:type="dxa" w:w="3360"/>
+            <w:tcW w:type="dxa" w:w="5040"/>
+          </w:tcPr>
+          <w:p>
+            <w:r>
+              <w:t>Cite the noncompressible study and guarded vascular consult (05/19; ABI/TBI, vascular note)</w:t>
+            </w:r>
+          </w:p>
+        </w:tc>
+      </w:tr>
+      <w:tr>
+        <w:tc>
+          <w:tcPr>
+            <w:tcW w:type="dxa" w:w="5040"/>
           </w:tcPr>
           <w:p>
             <w:r>
@@ -3616,29 +3398,19 @@
         </w:tc>
         <w:tc>
           <w:tcPr>
-            <w:tcW w:type="dxa" w:w="3360"/>
-          </w:tcPr>
-          <w:p>
-            <w:r>
-              <w:t>Make functional and home-environment limits central</w:t>
-            </w:r>
-          </w:p>
-        </w:tc>
-        <w:tc>
-          <w:tcPr>
-            <w:tcW w:type="dxa" w:w="3360"/>
-          </w:tcPr>
-          <w:p>
-            <w:r>
-              <w:t>05/20; PT, OT, case management</w:t>
-            </w:r>
-          </w:p>
-        </w:tc>
-      </w:tr>
-      <w:tr>
-        <w:tc>
-          <w:tcPr>
-            <w:tcW w:type="dxa" w:w="3360"/>
+            <w:tcW w:type="dxa" w:w="5040"/>
+          </w:tcPr>
+          <w:p>
+            <w:r>
+              <w:t>Make functional and home-environment limits central (05/20; PT, OT, case management)</w:t>
+            </w:r>
+          </w:p>
+        </w:tc>
+      </w:tr>
+      <w:tr>
+        <w:tc>
+          <w:tcPr>
+            <w:tcW w:type="dxa" w:w="5040"/>
           </w:tcPr>
           <w:p>
             <w:r>
@@ -3648,21 +3420,11 @@
         </w:tc>
         <w:tc>
           <w:tcPr>
-            <w:tcW w:type="dxa" w:w="3360"/>
-          </w:tcPr>
-          <w:p>
-            <w:r>
-              <w:t>Keep the offloading boot or wound device as supporting evidence</w:t>
-            </w:r>
-          </w:p>
-        </w:tc>
-        <w:tc>
-          <w:tcPr>
-            <w:tcW w:type="dxa" w:w="3360"/>
-          </w:tcPr>
-          <w:p>
-            <w:r>
-              <w:t>wound plan</w:t>
+            <w:tcW w:type="dxa" w:w="5040"/>
+          </w:tcPr>
+          <w:p>
+            <w:r>
+              <w:t>Keep the offloading boot or wound device as supporting evidence (wound plan)</w:t>
             </w:r>
           </w:p>
         </w:tc>
@@ -3732,14 +3494,13 @@
         </w:tblBorders>
       </w:tblPr>
       <w:tblGrid>
-        <w:gridCol w:w="3360"/>
-        <w:gridCol w:w="3360"/>
-        <w:gridCol w:w="3360"/>
+        <w:gridCol w:w="5040"/>
+        <w:gridCol w:w="5040"/>
       </w:tblGrid>
       <w:tr>
         <w:tc>
           <w:tcPr>
-            <w:tcW w:type="dxa" w:w="3360"/>
+            <w:tcW w:type="dxa" w:w="5040"/>
             <w:shd w:val="clear" w:color="auto" w:fill="4472C4"/>
           </w:tcPr>
           <w:p>
@@ -3754,7 +3515,7 @@
         </w:tc>
         <w:tc>
           <w:tcPr>
-            <w:tcW w:type="dxa" w:w="3360"/>
+            <w:tcW w:type="dxa" w:w="5040"/>
             <w:shd w:val="clear" w:color="auto" w:fill="4472C4"/>
           </w:tcPr>
           <w:p>
@@ -3767,26 +3528,11 @@
             </w:r>
           </w:p>
         </w:tc>
-        <w:tc>
-          <w:tcPr>
-            <w:tcW w:type="dxa" w:w="3360"/>
-            <w:shd w:val="clear" w:color="auto" w:fill="4472C4"/>
-          </w:tcPr>
-          <w:p>
-            <w:r>
-              <w:rPr>
-                <w:b/>
-                <w:color w:val="FFFFFF"/>
-              </w:rPr>
-              <w:t>Source</w:t>
-            </w:r>
-          </w:p>
-        </w:tc>
-      </w:tr>
-      <w:tr>
-        <w:tc>
-          <w:tcPr>
-            <w:tcW w:type="dxa" w:w="3360"/>
+      </w:tr>
+      <w:tr>
+        <w:tc>
+          <w:tcPr>
+            <w:tcW w:type="dxa" w:w="5040"/>
           </w:tcPr>
           <w:p>
             <w:r>
@@ -3796,29 +3542,19 @@
         </w:tc>
         <w:tc>
           <w:tcPr>
-            <w:tcW w:type="dxa" w:w="3360"/>
-          </w:tcPr>
-          <w:p>
-            <w:r>
-              <w:t>Decline it on renal or sulfa-allergy grounds with the specific reason</w:t>
-            </w:r>
-          </w:p>
-        </w:tc>
-        <w:tc>
-          <w:tcPr>
-            <w:tcW w:type="dxa" w:w="3360"/>
-          </w:tcPr>
-          <w:p>
-            <w:r>
-              <w:t>1.2 allergy, renal; substitute identity</w:t>
-            </w:r>
-          </w:p>
-        </w:tc>
-      </w:tr>
-      <w:tr>
-        <w:tc>
-          <w:tcPr>
-            <w:tcW w:type="dxa" w:w="3360"/>
+            <w:tcW w:type="dxa" w:w="5040"/>
+          </w:tcPr>
+          <w:p>
+            <w:r>
+              <w:t>Decline it on renal or sulfa-allergy grounds with the specific reason (1.2 allergy, renal; substitute identity)</w:t>
+            </w:r>
+          </w:p>
+        </w:tc>
+      </w:tr>
+      <w:tr>
+        <w:tc>
+          <w:tcPr>
+            <w:tcW w:type="dxa" w:w="5040"/>
           </w:tcPr>
           <w:p>
             <w:r>
@@ -3828,29 +3564,19 @@
         </w:tc>
         <w:tc>
           <w:tcPr>
-            <w:tcW w:type="dxa" w:w="3360"/>
-          </w:tcPr>
-          <w:p>
-            <w:r>
-              <w:t>Dose to current renal function</w:t>
-            </w:r>
-          </w:p>
-        </w:tc>
-        <w:tc>
-          <w:tcPr>
-            <w:tcW w:type="dxa" w:w="3360"/>
-          </w:tcPr>
-          <w:p>
-            <w:r>
-              <w:t>renal trend</w:t>
-            </w:r>
-          </w:p>
-        </w:tc>
-      </w:tr>
-      <w:tr>
-        <w:tc>
-          <w:tcPr>
-            <w:tcW w:type="dxa" w:w="3360"/>
+            <w:tcW w:type="dxa" w:w="5040"/>
+          </w:tcPr>
+          <w:p>
+            <w:r>
+              <w:t>Dose to current renal function (renal trend)</w:t>
+            </w:r>
+          </w:p>
+        </w:tc>
+      </w:tr>
+      <w:tr>
+        <w:tc>
+          <w:tcPr>
+            <w:tcW w:type="dxa" w:w="5040"/>
           </w:tcPr>
           <w:p>
             <w:r>
@@ -3860,29 +3586,19 @@
         </w:tc>
         <w:tc>
           <w:tcPr>
-            <w:tcW w:type="dxa" w:w="3360"/>
-          </w:tcPr>
-          <w:p>
-            <w:r>
-              <w:t>Use the deep-tissue culture</w:t>
-            </w:r>
-          </w:p>
-        </w:tc>
-        <w:tc>
-          <w:tcPr>
-            <w:tcW w:type="dxa" w:w="3360"/>
-          </w:tcPr>
-          <w:p>
-            <w:r>
-              <w:t>05/17 to 05/19; cultures</w:t>
-            </w:r>
-          </w:p>
-        </w:tc>
-      </w:tr>
-      <w:tr>
-        <w:tc>
-          <w:tcPr>
-            <w:tcW w:type="dxa" w:w="3360"/>
+            <w:tcW w:type="dxa" w:w="5040"/>
+          </w:tcPr>
+          <w:p>
+            <w:r>
+              <w:t>Use the deep-tissue culture (05/17 to 05/19; cultures)</w:t>
+            </w:r>
+          </w:p>
+        </w:tc>
+      </w:tr>
+      <w:tr>
+        <w:tc>
+          <w:tcPr>
+            <w:tcW w:type="dxa" w:w="5040"/>
           </w:tcPr>
           <w:p>
             <w:r>
@@ -3892,29 +3608,19 @@
         </w:tc>
         <w:tc>
           <w:tcPr>
-            <w:tcW w:type="dxa" w:w="3360"/>
-          </w:tcPr>
-          <w:p>
-            <w:r>
-              <w:t>Keep effective therapy via exception or safe alternative</w:t>
-            </w:r>
-          </w:p>
-        </w:tc>
-        <w:tc>
-          <w:tcPr>
-            <w:tcW w:type="dxa" w:w="3360"/>
-          </w:tcPr>
-          <w:p>
-            <w:r>
-              <w:t>ID plan</w:t>
-            </w:r>
-          </w:p>
-        </w:tc>
-      </w:tr>
-      <w:tr>
-        <w:tc>
-          <w:tcPr>
-            <w:tcW w:type="dxa" w:w="3360"/>
+            <w:tcW w:type="dxa" w:w="5040"/>
+          </w:tcPr>
+          <w:p>
+            <w:r>
+              <w:t>Keep effective therapy via exception or safe alternative (ID plan)</w:t>
+            </w:r>
+          </w:p>
+        </w:tc>
+      </w:tr>
+      <w:tr>
+        <w:tc>
+          <w:tcPr>
+            <w:tcW w:type="dxa" w:w="5040"/>
           </w:tcPr>
           <w:p>
             <w:r>
@@ -3924,21 +3630,11 @@
         </w:tc>
         <w:tc>
           <w:tcPr>
-            <w:tcW w:type="dxa" w:w="3360"/>
-          </w:tcPr>
-          <w:p>
-            <w:r>
-              <w:t>Honor the sulfa allergy</w:t>
-            </w:r>
-          </w:p>
-        </w:tc>
-        <w:tc>
-          <w:tcPr>
-            <w:tcW w:type="dxa" w:w="3360"/>
-          </w:tcPr>
-          <w:p>
-            <w:r>
-              <w:t>1.2 allergy</w:t>
+            <w:tcW w:type="dxa" w:w="5040"/>
+          </w:tcPr>
+          <w:p>
+            <w:r>
+              <w:t>Honor the sulfa allergy (1.2 allergy)</w:t>
             </w:r>
           </w:p>
         </w:tc>
@@ -4008,14 +3704,13 @@
         </w:tblBorders>
       </w:tblPr>
       <w:tblGrid>
-        <w:gridCol w:w="3360"/>
-        <w:gridCol w:w="3360"/>
-        <w:gridCol w:w="3360"/>
+        <w:gridCol w:w="5040"/>
+        <w:gridCol w:w="5040"/>
       </w:tblGrid>
       <w:tr>
         <w:tc>
           <w:tcPr>
-            <w:tcW w:type="dxa" w:w="3360"/>
+            <w:tcW w:type="dxa" w:w="5040"/>
             <w:shd w:val="clear" w:color="auto" w:fill="4472C4"/>
           </w:tcPr>
           <w:p>
@@ -4030,7 +3725,7 @@
         </w:tc>
         <w:tc>
           <w:tcPr>
-            <w:tcW w:type="dxa" w:w="3360"/>
+            <w:tcW w:type="dxa" w:w="5040"/>
             <w:shd w:val="clear" w:color="auto" w:fill="4472C4"/>
           </w:tcPr>
           <w:p>
@@ -4043,26 +3738,11 @@
             </w:r>
           </w:p>
         </w:tc>
-        <w:tc>
-          <w:tcPr>
-            <w:tcW w:type="dxa" w:w="3360"/>
-            <w:shd w:val="clear" w:color="auto" w:fill="4472C4"/>
-          </w:tcPr>
-          <w:p>
-            <w:r>
-              <w:rPr>
-                <w:b/>
-                <w:color w:val="FFFFFF"/>
-              </w:rPr>
-              <w:t>Source</w:t>
-            </w:r>
-          </w:p>
-        </w:tc>
-      </w:tr>
-      <w:tr>
-        <w:tc>
-          <w:tcPr>
-            <w:tcW w:type="dxa" w:w="3360"/>
+      </w:tr>
+      <w:tr>
+        <w:tc>
+          <w:tcPr>
+            <w:tcW w:type="dxa" w:w="5040"/>
           </w:tcPr>
           <w:p>
             <w:r>
@@ -4072,29 +3752,19 @@
         </w:tc>
         <w:tc>
           <w:tcPr>
-            <w:tcW w:type="dxa" w:w="3360"/>
-          </w:tcPr>
-          <w:p>
-            <w:r>
-              <w:t>Weigh the unresolved operational criteria against the markers</w:t>
-            </w:r>
-          </w:p>
-        </w:tc>
-        <w:tc>
-          <w:tcPr>
-            <w:tcW w:type="dxa" w:w="3360"/>
-          </w:tcPr>
-          <w:p>
-            <w:r>
-              <w:t>05/19 to 05/21; PT, OT, vascular, wound</w:t>
-            </w:r>
-          </w:p>
-        </w:tc>
-      </w:tr>
-      <w:tr>
-        <w:tc>
-          <w:tcPr>
-            <w:tcW w:type="dxa" w:w="3360"/>
+            <w:tcW w:type="dxa" w:w="5040"/>
+          </w:tcPr>
+          <w:p>
+            <w:r>
+              <w:t>Weigh the unresolved operational criteria against the markers (05/19 to 05/21; PT, OT, vascular, wound)</w:t>
+            </w:r>
+          </w:p>
+        </w:tc>
+      </w:tr>
+      <w:tr>
+        <w:tc>
+          <w:tcPr>
+            <w:tcW w:type="dxa" w:w="5040"/>
           </w:tcPr>
           <w:p>
             <w:r>
@@ -4104,29 +3774,19 @@
         </w:tc>
         <w:tc>
           <w:tcPr>
-            <w:tcW w:type="dxa" w:w="3360"/>
-          </w:tcPr>
-          <w:p>
-            <w:r>
-              <w:t>State a binding continued-stay determination</w:t>
-            </w:r>
-          </w:p>
-        </w:tc>
-        <w:tc>
-          <w:tcPr>
-            <w:tcW w:type="dxa" w:w="3360"/>
-          </w:tcPr>
-          <w:p>
-            <w:r>
-              <w:t>physician-advisor role</w:t>
-            </w:r>
-          </w:p>
-        </w:tc>
-      </w:tr>
-      <w:tr>
-        <w:tc>
-          <w:tcPr>
-            <w:tcW w:type="dxa" w:w="3360"/>
+            <w:tcW w:type="dxa" w:w="5040"/>
+          </w:tcPr>
+          <w:p>
+            <w:r>
+              <w:t>State a binding continued-stay determination (physician-advisor role)</w:t>
+            </w:r>
+          </w:p>
+        </w:tc>
+      </w:tr>
+      <w:tr>
+        <w:tc>
+          <w:tcPr>
+            <w:tcW w:type="dxa" w:w="5040"/>
           </w:tcPr>
           <w:p>
             <w:r>
@@ -4136,29 +3796,19 @@
         </w:tc>
         <w:tc>
           <w:tcPr>
-            <w:tcW w:type="dxa" w:w="3360"/>
-          </w:tcPr>
-          <w:p>
-            <w:r>
-              <w:t>Apply criteria to both improvement and unsafety</w:t>
-            </w:r>
-          </w:p>
-        </w:tc>
-        <w:tc>
-          <w:tcPr>
-            <w:tcW w:type="dxa" w:w="3360"/>
-          </w:tcPr>
-          <w:p>
-            <w:r>
-              <w:t>full chart</w:t>
-            </w:r>
-          </w:p>
-        </w:tc>
-      </w:tr>
-      <w:tr>
-        <w:tc>
-          <w:tcPr>
-            <w:tcW w:type="dxa" w:w="3360"/>
+            <w:tcW w:type="dxa" w:w="5040"/>
+          </w:tcPr>
+          <w:p>
+            <w:r>
+              <w:t>Apply criteria to both improvement and unsafety (full chart)</w:t>
+            </w:r>
+          </w:p>
+        </w:tc>
+      </w:tr>
+      <w:tr>
+        <w:tc>
+          <w:tcPr>
+            <w:tcW w:type="dxa" w:w="5040"/>
           </w:tcPr>
           <w:p>
             <w:r>
@@ -4168,29 +3818,19 @@
         </w:tc>
         <w:tc>
           <w:tcPr>
-            <w:tcW w:type="dxa" w:w="3360"/>
-          </w:tcPr>
-          <w:p>
-            <w:r>
-              <w:t>Keep perfusion open per the vascular study</w:t>
-            </w:r>
-          </w:p>
-        </w:tc>
-        <w:tc>
-          <w:tcPr>
-            <w:tcW w:type="dxa" w:w="3360"/>
-          </w:tcPr>
-          <w:p>
-            <w:r>
-              <w:t>05/19; ABI/TBI</w:t>
-            </w:r>
-          </w:p>
-        </w:tc>
-      </w:tr>
-      <w:tr>
-        <w:tc>
-          <w:tcPr>
-            <w:tcW w:type="dxa" w:w="3360"/>
+            <w:tcW w:type="dxa" w:w="5040"/>
+          </w:tcPr>
+          <w:p>
+            <w:r>
+              <w:t>Keep perfusion open per the vascular study (05/19; ABI/TBI)</w:t>
+            </w:r>
+          </w:p>
+        </w:tc>
+      </w:tr>
+      <w:tr>
+        <w:tc>
+          <w:tcPr>
+            <w:tcW w:type="dxa" w:w="5040"/>
           </w:tcPr>
           <w:p>
             <w:r>
@@ -4200,21 +3840,11 @@
         </w:tc>
         <w:tc>
           <w:tcPr>
-            <w:tcW w:type="dxa" w:w="3360"/>
-          </w:tcPr>
-          <w:p>
-            <w:r>
-              <w:t>Use the external concurrent-review request as the prompt, not as the answer</w:t>
-            </w:r>
-          </w:p>
-        </w:tc>
-        <w:tc>
-          <w:tcPr>
-            <w:tcW w:type="dxa" w:w="3360"/>
-          </w:tcPr>
-          <w:p>
-            <w:r>
-              <w:t>E1-T6</w:t>
+            <w:tcW w:type="dxa" w:w="5040"/>
+          </w:tcPr>
+          <w:p>
+            <w:r>
+              <w:t>Use the external concurrent-review request as the prompt, not as the answer (E1-T6)</w:t>
             </w:r>
           </w:p>
         </w:tc>
@@ -4284,14 +3914,13 @@
         </w:tblBorders>
       </w:tblPr>
       <w:tblGrid>
-        <w:gridCol w:w="3360"/>
-        <w:gridCol w:w="3360"/>
-        <w:gridCol w:w="3360"/>
+        <w:gridCol w:w="5040"/>
+        <w:gridCol w:w="5040"/>
       </w:tblGrid>
       <w:tr>
         <w:tc>
           <w:tcPr>
-            <w:tcW w:type="dxa" w:w="3360"/>
+            <w:tcW w:type="dxa" w:w="5040"/>
             <w:shd w:val="clear" w:color="auto" w:fill="4472C4"/>
           </w:tcPr>
           <w:p>
@@ -4306,7 +3935,7 @@
         </w:tc>
         <w:tc>
           <w:tcPr>
-            <w:tcW w:type="dxa" w:w="3360"/>
+            <w:tcW w:type="dxa" w:w="5040"/>
             <w:shd w:val="clear" w:color="auto" w:fill="4472C4"/>
           </w:tcPr>
           <w:p>
@@ -4319,26 +3948,11 @@
             </w:r>
           </w:p>
         </w:tc>
-        <w:tc>
-          <w:tcPr>
-            <w:tcW w:type="dxa" w:w="3360"/>
-            <w:shd w:val="clear" w:color="auto" w:fill="4472C4"/>
-          </w:tcPr>
-          <w:p>
-            <w:r>
-              <w:rPr>
-                <w:b/>
-                <w:color w:val="FFFFFF"/>
-              </w:rPr>
-              <w:t>Source</w:t>
-            </w:r>
-          </w:p>
-        </w:tc>
-      </w:tr>
-      <w:tr>
-        <w:tc>
-          <w:tcPr>
-            <w:tcW w:type="dxa" w:w="3360"/>
+      </w:tr>
+      <w:tr>
+        <w:tc>
+          <w:tcPr>
+            <w:tcW w:type="dxa" w:w="5040"/>
           </w:tcPr>
           <w:p>
             <w:r>
@@ -4348,29 +3962,19 @@
         </w:tc>
         <w:tc>
           <w:tcPr>
-            <w:tcW w:type="dxa" w:w="3360"/>
-          </w:tcPr>
-          <w:p>
-            <w:r>
-              <w:t>Apply the documented date or exclusion that changes capture</w:t>
-            </w:r>
-          </w:p>
-        </w:tc>
-        <w:tc>
-          <w:tcPr>
-            <w:tcW w:type="dxa" w:w="3360"/>
-          </w:tcPr>
-          <w:p>
-            <w:r>
-              <w:t>outpatient record dates</w:t>
-            </w:r>
-          </w:p>
-        </w:tc>
-      </w:tr>
-      <w:tr>
-        <w:tc>
-          <w:tcPr>
-            <w:tcW w:type="dxa" w:w="3360"/>
+            <w:tcW w:type="dxa" w:w="5040"/>
+          </w:tcPr>
+          <w:p>
+            <w:r>
+              <w:t>Apply the documented date or exclusion that changes capture (outpatient record dates)</w:t>
+            </w:r>
+          </w:p>
+        </w:tc>
+      </w:tr>
+      <w:tr>
+        <w:tc>
+          <w:tcPr>
+            <w:tcW w:type="dxa" w:w="5040"/>
           </w:tcPr>
           <w:p>
             <w:r>
@@ -4380,29 +3984,19 @@
         </w:tc>
         <w:tc>
           <w:tcPr>
-            <w:tcW w:type="dxa" w:w="3360"/>
-          </w:tcPr>
-          <w:p>
-            <w:r>
-              <w:t>Mark unable to determine where the record does not support it</w:t>
-            </w:r>
-          </w:p>
-        </w:tc>
-        <w:tc>
-          <w:tcPr>
-            <w:tcW w:type="dxa" w:w="3360"/>
-          </w:tcPr>
-          <w:p>
-            <w:r>
-              <w:t>abstraction fields</w:t>
-            </w:r>
-          </w:p>
-        </w:tc>
-      </w:tr>
-      <w:tr>
-        <w:tc>
-          <w:tcPr>
-            <w:tcW w:type="dxa" w:w="3360"/>
+            <w:tcW w:type="dxa" w:w="5040"/>
+          </w:tcPr>
+          <w:p>
+            <w:r>
+              <w:t>Mark unable to determine where the record does not support it (abstraction fields)</w:t>
+            </w:r>
+          </w:p>
+        </w:tc>
+      </w:tr>
+      <w:tr>
+        <w:tc>
+          <w:tcPr>
+            <w:tcW w:type="dxa" w:w="5040"/>
           </w:tcPr>
           <w:p>
             <w:r>
@@ -4412,29 +4006,19 @@
         </w:tc>
         <w:tc>
           <w:tcPr>
-            <w:tcW w:type="dxa" w:w="3360"/>
-          </w:tcPr>
-          <w:p>
-            <w:r>
-              <w:t>Abstract the mild documented finding to the measure definition, not beyond</w:t>
-            </w:r>
-          </w:p>
-        </w:tc>
-        <w:tc>
-          <w:tcPr>
-            <w:tcW w:type="dxa" w:w="3360"/>
-          </w:tcPr>
-          <w:p>
-            <w:r>
-              <w:t>1.2 retinopathy</w:t>
-            </w:r>
-          </w:p>
-        </w:tc>
-      </w:tr>
-      <w:tr>
-        <w:tc>
-          <w:tcPr>
-            <w:tcW w:type="dxa" w:w="3360"/>
+            <w:tcW w:type="dxa" w:w="5040"/>
+          </w:tcPr>
+          <w:p>
+            <w:r>
+              <w:t>Abstract the mild documented finding to the measure definition, not beyond (1.2 retinopathy)</w:t>
+            </w:r>
+          </w:p>
+        </w:tc>
+      </w:tr>
+      <w:tr>
+        <w:tc>
+          <w:tcPr>
+            <w:tcW w:type="dxa" w:w="5040"/>
           </w:tcPr>
           <w:p>
             <w:r>
@@ -4444,29 +4028,19 @@
         </w:tc>
         <w:tc>
           <w:tcPr>
-            <w:tcW w:type="dxa" w:w="3360"/>
-          </w:tcPr>
-          <w:p>
-            <w:r>
-              <w:t>Use the documented value and date window</w:t>
-            </w:r>
-          </w:p>
-        </w:tc>
-        <w:tc>
-          <w:tcPr>
-            <w:tcW w:type="dxa" w:w="3360"/>
-          </w:tcPr>
-          <w:p>
-            <w:r>
-              <w:t>labs</w:t>
-            </w:r>
-          </w:p>
-        </w:tc>
-      </w:tr>
-      <w:tr>
-        <w:tc>
-          <w:tcPr>
-            <w:tcW w:type="dxa" w:w="3360"/>
+            <w:tcW w:type="dxa" w:w="5040"/>
+          </w:tcPr>
+          <w:p>
+            <w:r>
+              <w:t>Use the documented value and date window (labs)</w:t>
+            </w:r>
+          </w:p>
+        </w:tc>
+      </w:tr>
+      <w:tr>
+        <w:tc>
+          <w:tcPr>
+            <w:tcW w:type="dxa" w:w="5040"/>
           </w:tcPr>
           <w:p>
             <w:r>
@@ -4476,21 +4050,11 @@
         </w:tc>
         <w:tc>
           <w:tcPr>
-            <w:tcW w:type="dxa" w:w="3360"/>
-          </w:tcPr>
-          <w:p>
-            <w:r>
-              <w:t>Capture the documented CKD and proteinuria evidence</w:t>
-            </w:r>
-          </w:p>
-        </w:tc>
-        <w:tc>
-          <w:tcPr>
-            <w:tcW w:type="dxa" w:w="3360"/>
-          </w:tcPr>
-          <w:p>
-            <w:r>
-              <w:t>renal record</w:t>
+            <w:tcW w:type="dxa" w:w="5040"/>
+          </w:tcPr>
+          <w:p>
+            <w:r>
+              <w:t>Capture the documented CKD and proteinuria evidence (renal record)</w:t>
             </w:r>
           </w:p>
         </w:tc>
@@ -4560,14 +4124,13 @@
         </w:tblBorders>
       </w:tblPr>
       <w:tblGrid>
-        <w:gridCol w:w="3360"/>
-        <w:gridCol w:w="3360"/>
-        <w:gridCol w:w="3360"/>
+        <w:gridCol w:w="5040"/>
+        <w:gridCol w:w="5040"/>
       </w:tblGrid>
       <w:tr>
         <w:tc>
           <w:tcPr>
-            <w:tcW w:type="dxa" w:w="3360"/>
+            <w:tcW w:type="dxa" w:w="5040"/>
             <w:shd w:val="clear" w:color="auto" w:fill="4472C4"/>
           </w:tcPr>
           <w:p>
@@ -4582,7 +4145,7 @@
         </w:tc>
         <w:tc>
           <w:tcPr>
-            <w:tcW w:type="dxa" w:w="3360"/>
+            <w:tcW w:type="dxa" w:w="5040"/>
             <w:shd w:val="clear" w:color="auto" w:fill="4472C4"/>
           </w:tcPr>
           <w:p>
@@ -4595,26 +4158,11 @@
             </w:r>
           </w:p>
         </w:tc>
-        <w:tc>
-          <w:tcPr>
-            <w:tcW w:type="dxa" w:w="3360"/>
-            <w:shd w:val="clear" w:color="auto" w:fill="4472C4"/>
-          </w:tcPr>
-          <w:p>
-            <w:r>
-              <w:rPr>
-                <w:b/>
-                <w:color w:val="FFFFFF"/>
-              </w:rPr>
-              <w:t>Source</w:t>
-            </w:r>
-          </w:p>
-        </w:tc>
-      </w:tr>
-      <w:tr>
-        <w:tc>
-          <w:tcPr>
-            <w:tcW w:type="dxa" w:w="3360"/>
+      </w:tr>
+      <w:tr>
+        <w:tc>
+          <w:tcPr>
+            <w:tcW w:type="dxa" w:w="5040"/>
           </w:tcPr>
           <w:p>
             <w:r>
@@ -4624,29 +4172,19 @@
         </w:tc>
         <w:tc>
           <w:tcPr>
-            <w:tcW w:type="dxa" w:w="3360"/>
-          </w:tcPr>
-          <w:p>
-            <w:r>
-              <w:t>Keep the table statuses accurate and open where the chart is open</w:t>
-            </w:r>
-          </w:p>
-        </w:tc>
-        <w:tc>
-          <w:tcPr>
-            <w:tcW w:type="dxa" w:w="3360"/>
-          </w:tcPr>
-          <w:p>
-            <w:r>
-              <w:t>full chart</w:t>
-            </w:r>
-          </w:p>
-        </w:tc>
-      </w:tr>
-      <w:tr>
-        <w:tc>
-          <w:tcPr>
-            <w:tcW w:type="dxa" w:w="3360"/>
+            <w:tcW w:type="dxa" w:w="5040"/>
+          </w:tcPr>
+          <w:p>
+            <w:r>
+              <w:t>Keep the table statuses accurate and open where the chart is open (full chart)</w:t>
+            </w:r>
+          </w:p>
+        </w:tc>
+      </w:tr>
+      <w:tr>
+        <w:tc>
+          <w:tcPr>
+            <w:tcW w:type="dxa" w:w="5040"/>
           </w:tcPr>
           <w:p>
             <w:r>
@@ -4656,29 +4194,19 @@
         </w:tc>
         <w:tc>
           <w:tcPr>
-            <w:tcW w:type="dxa" w:w="3360"/>
-          </w:tcPr>
-          <w:p>
-            <w:r>
-              <w:t>Carry perfusion as unresolved pending vascular evaluation</w:t>
-            </w:r>
-          </w:p>
-        </w:tc>
-        <w:tc>
-          <w:tcPr>
-            <w:tcW w:type="dxa" w:w="3360"/>
-          </w:tcPr>
-          <w:p>
-            <w:r>
-              <w:t>05/19; vascular note</w:t>
-            </w:r>
-          </w:p>
-        </w:tc>
-      </w:tr>
-      <w:tr>
-        <w:tc>
-          <w:tcPr>
-            <w:tcW w:type="dxa" w:w="3360"/>
+            <w:tcW w:type="dxa" w:w="5040"/>
+          </w:tcPr>
+          <w:p>
+            <w:r>
+              <w:t>Carry perfusion as unresolved pending vascular evaluation (05/19; vascular note)</w:t>
+            </w:r>
+          </w:p>
+        </w:tc>
+      </w:tr>
+      <w:tr>
+        <w:tc>
+          <w:tcPr>
+            <w:tcW w:type="dxa" w:w="5040"/>
           </w:tcPr>
           <w:p>
             <w:r>
@@ -4688,29 +4216,19 @@
         </w:tc>
         <w:tc>
           <w:tcPr>
-            <w:tcW w:type="dxa" w:w="3360"/>
-          </w:tcPr>
-          <w:p>
-            <w:r>
-              <w:t>Include the required disposition table with each item</w:t>
-            </w:r>
-          </w:p>
-        </w:tc>
-        <w:tc>
-          <w:tcPr>
-            <w:tcW w:type="dxa" w:w="3360"/>
-          </w:tcPr>
-          <w:p>
-            <w:r>
-              <w:t>task format</w:t>
-            </w:r>
-          </w:p>
-        </w:tc>
-      </w:tr>
-      <w:tr>
-        <w:tc>
-          <w:tcPr>
-            <w:tcW w:type="dxa" w:w="3360"/>
+            <w:tcW w:type="dxa" w:w="5040"/>
+          </w:tcPr>
+          <w:p>
+            <w:r>
+              <w:t>Include the required disposition table with each item (task format)</w:t>
+            </w:r>
+          </w:p>
+        </w:tc>
+      </w:tr>
+      <w:tr>
+        <w:tc>
+          <w:tcPr>
+            <w:tcW w:type="dxa" w:w="5040"/>
           </w:tcPr>
           <w:p>
             <w:r>
@@ -4720,29 +4238,19 @@
         </w:tc>
         <w:tc>
           <w:tcPr>
-            <w:tcW w:type="dxa" w:w="3360"/>
-          </w:tcPr>
-          <w:p>
-            <w:r>
-              <w:t>Reflect the documented unsafe offloading</w:t>
-            </w:r>
-          </w:p>
-        </w:tc>
-        <w:tc>
-          <w:tcPr>
-            <w:tcW w:type="dxa" w:w="3360"/>
-          </w:tcPr>
-          <w:p>
-            <w:r>
-              <w:t>05/20; PT, OT</w:t>
-            </w:r>
-          </w:p>
-        </w:tc>
-      </w:tr>
-      <w:tr>
-        <w:tc>
-          <w:tcPr>
-            <w:tcW w:type="dxa" w:w="3360"/>
+            <w:tcW w:type="dxa" w:w="5040"/>
+          </w:tcPr>
+          <w:p>
+            <w:r>
+              <w:t>Reflect the documented unsafe offloading (05/20; PT, OT)</w:t>
+            </w:r>
+          </w:p>
+        </w:tc>
+      </w:tr>
+      <w:tr>
+        <w:tc>
+          <w:tcPr>
+            <w:tcW w:type="dxa" w:w="5040"/>
           </w:tcPr>
           <w:p>
             <w:r>
@@ -4752,21 +4260,11 @@
         </w:tc>
         <w:tc>
           <w:tcPr>
-            <w:tcW w:type="dxa" w:w="3360"/>
-          </w:tcPr>
-          <w:p>
-            <w:r>
-              <w:t>State the actual course and remaining plan</w:t>
-            </w:r>
-          </w:p>
-        </w:tc>
-        <w:tc>
-          <w:tcPr>
-            <w:tcW w:type="dxa" w:w="3360"/>
-          </w:tcPr>
-          <w:p>
-            <w:r>
-              <w:t>ID notes</w:t>
+            <w:tcW w:type="dxa" w:w="5040"/>
+          </w:tcPr>
+          <w:p>
+            <w:r>
+              <w:t>State the actual course and remaining plan (ID notes)</w:t>
             </w:r>
           </w:p>
         </w:tc>
@@ -4836,14 +4334,13 @@
         </w:tblBorders>
       </w:tblPr>
       <w:tblGrid>
-        <w:gridCol w:w="3360"/>
-        <w:gridCol w:w="3360"/>
-        <w:gridCol w:w="3360"/>
+        <w:gridCol w:w="5040"/>
+        <w:gridCol w:w="5040"/>
       </w:tblGrid>
       <w:tr>
         <w:tc>
           <w:tcPr>
-            <w:tcW w:type="dxa" w:w="3360"/>
+            <w:tcW w:type="dxa" w:w="5040"/>
             <w:shd w:val="clear" w:color="auto" w:fill="4472C4"/>
           </w:tcPr>
           <w:p>
@@ -4858,7 +4355,7 @@
         </w:tc>
         <w:tc>
           <w:tcPr>
-            <w:tcW w:type="dxa" w:w="3360"/>
+            <w:tcW w:type="dxa" w:w="5040"/>
             <w:shd w:val="clear" w:color="auto" w:fill="4472C4"/>
           </w:tcPr>
           <w:p>
@@ -4871,26 +4368,11 @@
             </w:r>
           </w:p>
         </w:tc>
-        <w:tc>
-          <w:tcPr>
-            <w:tcW w:type="dxa" w:w="3360"/>
-            <w:shd w:val="clear" w:color="auto" w:fill="4472C4"/>
-          </w:tcPr>
-          <w:p>
-            <w:r>
-              <w:rPr>
-                <w:b/>
-                <w:color w:val="FFFFFF"/>
-              </w:rPr>
-              <w:t>Source</w:t>
-            </w:r>
-          </w:p>
-        </w:tc>
-      </w:tr>
-      <w:tr>
-        <w:tc>
-          <w:tcPr>
-            <w:tcW w:type="dxa" w:w="3360"/>
+      </w:tr>
+      <w:tr>
+        <w:tc>
+          <w:tcPr>
+            <w:tcW w:type="dxa" w:w="5040"/>
           </w:tcPr>
           <w:p>
             <w:r>
@@ -4900,29 +4382,19 @@
         </w:tc>
         <w:tc>
           <w:tcPr>
-            <w:tcW w:type="dxa" w:w="3360"/>
-          </w:tcPr>
-          <w:p>
-            <w:r>
-              <w:t>Attribute to documented system and process contributors</w:t>
-            </w:r>
-          </w:p>
-        </w:tc>
-        <w:tc>
-          <w:tcPr>
-            <w:tcW w:type="dxa" w:w="3360"/>
-          </w:tcPr>
-          <w:p>
-            <w:r>
-              <w:t>05/20; PT, OT, order, device, home notes</w:t>
-            </w:r>
-          </w:p>
-        </w:tc>
-      </w:tr>
-      <w:tr>
-        <w:tc>
-          <w:tcPr>
-            <w:tcW w:type="dxa" w:w="3360"/>
+            <w:tcW w:type="dxa" w:w="5040"/>
+          </w:tcPr>
+          <w:p>
+            <w:r>
+              <w:t>Attribute to documented system and process contributors (05/20; PT, OT, order, device, home notes)</w:t>
+            </w:r>
+          </w:p>
+        </w:tc>
+      </w:tr>
+      <w:tr>
+        <w:tc>
+          <w:tcPr>
+            <w:tcW w:type="dxa" w:w="5040"/>
           </w:tcPr>
           <w:p>
             <w:r>
@@ -4932,29 +4404,19 @@
         </w:tc>
         <w:tc>
           <w:tcPr>
-            <w:tcW w:type="dxa" w:w="3360"/>
-          </w:tcPr>
-          <w:p>
-            <w:r>
-              <w:t>Keep the attribution multifactorial</w:t>
-            </w:r>
-          </w:p>
-        </w:tc>
-        <w:tc>
-          <w:tcPr>
-            <w:tcW w:type="dxa" w:w="3360"/>
-          </w:tcPr>
-          <w:p>
-            <w:r>
-              <w:t>full chart</w:t>
-            </w:r>
-          </w:p>
-        </w:tc>
-      </w:tr>
-      <w:tr>
-        <w:tc>
-          <w:tcPr>
-            <w:tcW w:type="dxa" w:w="3360"/>
+            <w:tcW w:type="dxa" w:w="5040"/>
+          </w:tcPr>
+          <w:p>
+            <w:r>
+              <w:t>Keep the attribution multifactorial (full chart)</w:t>
+            </w:r>
+          </w:p>
+        </w:tc>
+      </w:tr>
+      <w:tr>
+        <w:tc>
+          <w:tcPr>
+            <w:tcW w:type="dxa" w:w="5040"/>
           </w:tcPr>
           <w:p>
             <w:r>
@@ -4964,29 +4426,19 @@
         </w:tc>
         <w:tc>
           <w:tcPr>
-            <w:tcW w:type="dxa" w:w="3360"/>
-          </w:tcPr>
-          <w:p>
-            <w:r>
-              <w:t>Map prevention to the actual contributors</w:t>
-            </w:r>
-          </w:p>
-        </w:tc>
-        <w:tc>
-          <w:tcPr>
-            <w:tcW w:type="dxa" w:w="3360"/>
-          </w:tcPr>
-          <w:p>
-            <w:r>
-              <w:t>review</w:t>
-            </w:r>
-          </w:p>
-        </w:tc>
-      </w:tr>
-      <w:tr>
-        <w:tc>
-          <w:tcPr>
-            <w:tcW w:type="dxa" w:w="3360"/>
+            <w:tcW w:type="dxa" w:w="5040"/>
+          </w:tcPr>
+          <w:p>
+            <w:r>
+              <w:t>Map prevention to the actual contributors (review)</w:t>
+            </w:r>
+          </w:p>
+        </w:tc>
+      </w:tr>
+      <w:tr>
+        <w:tc>
+          <w:tcPr>
+            <w:tcW w:type="dxa" w:w="5040"/>
           </w:tcPr>
           <w:p>
             <w:r>
@@ -4996,29 +4448,19 @@
         </w:tc>
         <w:tc>
           <w:tcPr>
-            <w:tcW w:type="dxa" w:w="3360"/>
-          </w:tcPr>
-          <w:p>
-            <w:r>
-              <w:t>Include the offloading teach-back failure</w:t>
-            </w:r>
-          </w:p>
-        </w:tc>
-        <w:tc>
-          <w:tcPr>
-            <w:tcW w:type="dxa" w:w="3360"/>
-          </w:tcPr>
-          <w:p>
-            <w:r>
-              <w:t>05/20; OT</w:t>
-            </w:r>
-          </w:p>
-        </w:tc>
-      </w:tr>
-      <w:tr>
-        <w:tc>
-          <w:tcPr>
-            <w:tcW w:type="dxa" w:w="3360"/>
+            <w:tcW w:type="dxa" w:w="5040"/>
+          </w:tcPr>
+          <w:p>
+            <w:r>
+              <w:t>Include the offloading teach-back failure (05/20; OT)</w:t>
+            </w:r>
+          </w:p>
+        </w:tc>
+      </w:tr>
+      <w:tr>
+        <w:tc>
+          <w:tcPr>
+            <w:tcW w:type="dxa" w:w="5040"/>
           </w:tcPr>
           <w:p>
             <w:r>
@@ -5028,21 +4470,11 @@
         </w:tc>
         <w:tc>
           <w:tcPr>
-            <w:tcW w:type="dxa" w:w="3360"/>
-          </w:tcPr>
-          <w:p>
-            <w:r>
-              <w:t>Include the device-availability and order contributors</w:t>
-            </w:r>
-          </w:p>
-        </w:tc>
-        <w:tc>
-          <w:tcPr>
-            <w:tcW w:type="dxa" w:w="3360"/>
-          </w:tcPr>
-          <w:p>
-            <w:r>
-              <w:t>wound and order notes</w:t>
+            <w:tcW w:type="dxa" w:w="5040"/>
+          </w:tcPr>
+          <w:p>
+            <w:r>
+              <w:t>Include the device-availability and order contributors (wound and order notes)</w:t>
             </w:r>
           </w:p>
         </w:tc>
@@ -5112,14 +4544,13 @@
         </w:tblBorders>
       </w:tblPr>
       <w:tblGrid>
-        <w:gridCol w:w="3360"/>
-        <w:gridCol w:w="3360"/>
-        <w:gridCol w:w="3360"/>
+        <w:gridCol w:w="5040"/>
+        <w:gridCol w:w="5040"/>
       </w:tblGrid>
       <w:tr>
         <w:tc>
           <w:tcPr>
-            <w:tcW w:type="dxa" w:w="3360"/>
+            <w:tcW w:type="dxa" w:w="5040"/>
             <w:shd w:val="clear" w:color="auto" w:fill="4472C4"/>
           </w:tcPr>
           <w:p>
@@ -5134,7 +4565,7 @@
         </w:tc>
         <w:tc>
           <w:tcPr>
-            <w:tcW w:type="dxa" w:w="3360"/>
+            <w:tcW w:type="dxa" w:w="5040"/>
             <w:shd w:val="clear" w:color="auto" w:fill="4472C4"/>
           </w:tcPr>
           <w:p>
@@ -5147,26 +4578,11 @@
             </w:r>
           </w:p>
         </w:tc>
-        <w:tc>
-          <w:tcPr>
-            <w:tcW w:type="dxa" w:w="3360"/>
-            <w:shd w:val="clear" w:color="auto" w:fill="4472C4"/>
-          </w:tcPr>
-          <w:p>
-            <w:r>
-              <w:rPr>
-                <w:b/>
-                <w:color w:val="FFFFFF"/>
-              </w:rPr>
-              <w:t>Source</w:t>
-            </w:r>
-          </w:p>
-        </w:tc>
-      </w:tr>
-      <w:tr>
-        <w:tc>
-          <w:tcPr>
-            <w:tcW w:type="dxa" w:w="3360"/>
+      </w:tr>
+      <w:tr>
+        <w:tc>
+          <w:tcPr>
+            <w:tcW w:type="dxa" w:w="5040"/>
           </w:tcPr>
           <w:p>
             <w:r>
@@ -5176,29 +4592,19 @@
         </w:tc>
         <w:tc>
           <w:tcPr>
-            <w:tcW w:type="dxa" w:w="3360"/>
-          </w:tcPr>
-          <w:p>
-            <w:r>
-              <w:t>Fill with the documented unsafe-offloading restriction and supervised plan</w:t>
-            </w:r>
-          </w:p>
-        </w:tc>
-        <w:tc>
-          <w:tcPr>
-            <w:tcW w:type="dxa" w:w="3360"/>
-          </w:tcPr>
-          <w:p>
-            <w:r>
-              <w:t>05/20; PT, OT</w:t>
-            </w:r>
-          </w:p>
-        </w:tc>
-      </w:tr>
-      <w:tr>
-        <w:tc>
-          <w:tcPr>
-            <w:tcW w:type="dxa" w:w="3360"/>
+            <w:tcW w:type="dxa" w:w="5040"/>
+          </w:tcPr>
+          <w:p>
+            <w:r>
+              <w:t>Fill with the documented unsafe-offloading restriction and supervised plan (05/20; PT, OT)</w:t>
+            </w:r>
+          </w:p>
+        </w:tc>
+      </w:tr>
+      <w:tr>
+        <w:tc>
+          <w:tcPr>
+            <w:tcW w:type="dxa" w:w="5040"/>
           </w:tcPr>
           <w:p>
             <w:r>
@@ -5208,29 +4614,19 @@
         </w:tc>
         <w:tc>
           <w:tcPr>
-            <w:tcW w:type="dxa" w:w="3360"/>
-          </w:tcPr>
-          <w:p>
-            <w:r>
-              <w:t>Leave open items open</w:t>
-            </w:r>
-          </w:p>
-        </w:tc>
-        <w:tc>
-          <w:tcPr>
-            <w:tcW w:type="dxa" w:w="3360"/>
-          </w:tcPr>
-          <w:p>
-            <w:r>
-              <w:t>full chart</w:t>
-            </w:r>
-          </w:p>
-        </w:tc>
-      </w:tr>
-      <w:tr>
-        <w:tc>
-          <w:tcPr>
-            <w:tcW w:type="dxa" w:w="3360"/>
+            <w:tcW w:type="dxa" w:w="5040"/>
+          </w:tcPr>
+          <w:p>
+            <w:r>
+              <w:t>Leave open items open (full chart)</w:t>
+            </w:r>
+          </w:p>
+        </w:tc>
+      </w:tr>
+      <w:tr>
+        <w:tc>
+          <w:tcPr>
+            <w:tcW w:type="dxa" w:w="5040"/>
           </w:tcPr>
           <w:p>
             <w:r>
@@ -5240,29 +4636,19 @@
         </w:tc>
         <w:tc>
           <w:tcPr>
-            <w:tcW w:type="dxa" w:w="3360"/>
-          </w:tcPr>
-          <w:p>
-            <w:r>
-              <w:t>Finalize the rest faithfully</w:t>
-            </w:r>
-          </w:p>
-        </w:tc>
-        <w:tc>
-          <w:tcPr>
-            <w:tcW w:type="dxa" w:w="3360"/>
-          </w:tcPr>
-          <w:p>
-            <w:r>
-              <w:t>E1-T10 draft</w:t>
-            </w:r>
-          </w:p>
-        </w:tc>
-      </w:tr>
-      <w:tr>
-        <w:tc>
-          <w:tcPr>
-            <w:tcW w:type="dxa" w:w="3360"/>
+            <w:tcW w:type="dxa" w:w="5040"/>
+          </w:tcPr>
+          <w:p>
+            <w:r>
+              <w:t>Finalize the rest faithfully (E1-T10 draft)</w:t>
+            </w:r>
+          </w:p>
+        </w:tc>
+      </w:tr>
+      <w:tr>
+        <w:tc>
+          <w:tcPr>
+            <w:tcW w:type="dxa" w:w="5040"/>
           </w:tcPr>
           <w:p>
             <w:r>
@@ -5272,29 +4658,19 @@
         </w:tc>
         <w:tc>
           <w:tcPr>
-            <w:tcW w:type="dxa" w:w="3360"/>
-          </w:tcPr>
-          <w:p>
-            <w:r>
-              <w:t>Keep the documented home and caregiver limits</w:t>
-            </w:r>
-          </w:p>
-        </w:tc>
-        <w:tc>
-          <w:tcPr>
-            <w:tcW w:type="dxa" w:w="3360"/>
-          </w:tcPr>
-          <w:p>
-            <w:r>
-              <w:t>case management</w:t>
-            </w:r>
-          </w:p>
-        </w:tc>
-      </w:tr>
-      <w:tr>
-        <w:tc>
-          <w:tcPr>
-            <w:tcW w:type="dxa" w:w="3360"/>
+            <w:tcW w:type="dxa" w:w="5040"/>
+          </w:tcPr>
+          <w:p>
+            <w:r>
+              <w:t>Keep the documented home and caregiver limits (case management)</w:t>
+            </w:r>
+          </w:p>
+        </w:tc>
+      </w:tr>
+      <w:tr>
+        <w:tc>
+          <w:tcPr>
+            <w:tcW w:type="dxa" w:w="5040"/>
           </w:tcPr>
           <w:p>
             <w:r>
@@ -5304,21 +4680,11 @@
         </w:tc>
         <w:tc>
           <w:tcPr>
-            <w:tcW w:type="dxa" w:w="3360"/>
-          </w:tcPr>
-          <w:p>
-            <w:r>
-              <w:t>Align activity with offloading and wound care</w:t>
-            </w:r>
-          </w:p>
-        </w:tc>
-        <w:tc>
-          <w:tcPr>
-            <w:tcW w:type="dxa" w:w="3360"/>
-          </w:tcPr>
-          <w:p>
-            <w:r>
-              <w:t>wound plan</w:t>
+            <w:tcW w:type="dxa" w:w="5040"/>
+          </w:tcPr>
+          <w:p>
+            <w:r>
+              <w:t>Align activity with offloading and wound care (wound plan)</w:t>
             </w:r>
           </w:p>
         </w:tc>
@@ -5452,7 +4818,7 @@
                 <w:b/>
                 <w:color w:val="FFFFFF"/>
               </w:rPr>
-              <w:t>Origin</w:t>
+              <w:t>Reference File Origin</w:t>
             </w:r>
           </w:p>
         </w:tc>
@@ -5482,7 +4848,7 @@
                 <w:b/>
                 <w:color w:val="FFFFFF"/>
               </w:rPr>
-              <w:t>Pearls, traps, friction</w:t>
+              <w:t>Pearls, Traps, and Friction</w:t>
             </w:r>
           </w:p>
         </w:tc>
@@ -7822,7 +7188,7 @@
                 <w:b/>
                 <w:color w:val="FFFFFF"/>
               </w:rPr>
-              <w:t>Origin</w:t>
+              <w:t>Reference File Origin</w:t>
             </w:r>
           </w:p>
         </w:tc>
@@ -7852,7 +7218,7 @@
                 <w:b/>
                 <w:color w:val="FFFFFF"/>
               </w:rPr>
-              <w:t>Serves</w:t>
+              <w:t>Pearls, Traps, and Friction</w:t>
             </w:r>
           </w:p>
         </w:tc>
@@ -8608,7 +7974,7 @@
                 <w:b/>
                 <w:color w:val="FFFFFF"/>
               </w:rPr>
-              <w:t>Origin</w:t>
+              <w:t>Reference File Origin</w:t>
             </w:r>
           </w:p>
         </w:tc>
@@ -8638,7 +8004,7 @@
                 <w:b/>
                 <w:color w:val="FFFFFF"/>
               </w:rPr>
-              <w:t>Litmus</w:t>
+              <w:t>Pearls, Traps, and Friction</w:t>
             </w:r>
           </w:p>
         </w:tc>
@@ -8880,6 +8246,36 @@
         <w:t>This world evaluates whether a clinician can hold two true things at once, that the infection is improving and that the patient is not safe to go home, and act on the second across ten independent administrative and clinical encounters. The trap architecture works because every scored judgment has a documented contradiction or a documented restraint behind it: improving markers against unresolved perfusion and unsafe function, a severity-forward coding worksheet and CDI query against a treating record that never establishes osteomyelitis, a payer-preferred antibiotic against renal and allergy safety, and admission renal dosing against an improved current value. The world is hard for an AI agent because the safe answer is almost never the most available one: the reassuring marker, the reassuring pulse, the higher-severity code, and the easy substitute are all locally reasonable and all wrong here, and rejecting them requires synthesizing across notes, labs, imaging, therapy evaluations, and external documents while honoring a stated source-of-truth order rather than the single most recent or most reassuring line.</w:t>
       </w:r>
     </w:p>
+    <w:tbl>
+      <w:tblPr>
+        <w:tblW w:type="auto" w:w="0"/>
+        <w:tblLook w:firstColumn="1" w:firstRow="1" w:lastColumn="0" w:lastRow="0" w:noHBand="0" w:noVBand="1" w:val="04A0"/>
+        <w:tblBorders>
+          <w:top w:val="single" w:sz="4" w:space="0" w:color="43a047"/>
+          <w:left w:val="single" w:sz="4" w:space="0" w:color="43a047"/>
+          <w:bottom w:val="single" w:sz="4" w:space="0" w:color="43a047"/>
+          <w:right w:val="single" w:sz="4" w:space="0" w:color="43a047"/>
+          <w:insideH w:val="single" w:sz="4" w:space="0" w:color="43a047"/>
+          <w:insideV w:val="single" w:sz="4" w:space="0" w:color="43a047"/>
+        </w:tblBorders>
+      </w:tblPr>
+      <w:tblGrid>
+        <w:gridCol w:w="10080"/>
+      </w:tblGrid>
+      <w:tr>
+        <w:tc>
+          <w:tcPr>
+            <w:tcW w:type="dxa" w:w="10080"/>
+            <w:shd w:val="clear" w:color="auto" w:fill="e8f5e9"/>
+          </w:tcPr>
+          <w:p>
+            <w:r>
+              <w:t>Self-Containment Principle: every claim in a task's correct answer is traceable to the task prompt, the task-level files, and the world-level files. A seasoned clinician could solve every task from the intended files alone, no task requires public knowledge published after July 31, 2025, and any fact not supported by those sources is either fabrication if asserted or must be acknowledged as uncertain. This principle governs golden-response construction and grader-guideline calibration downstream.</w:t>
+            </w:r>
+          </w:p>
+        </w:tc>
+      </w:tr>
+    </w:tbl>
     <w:sectPr>
       <w:pgSz w:h="15840" w:w="12240"/>
       <w:pgMar w:bottom="1080" w:top="1080" w:left="1080" w:right="1080" w:header="708" w:footer="708"/>

</xml_diff>

<commit_message>
Content audit pass 1 vs shipped KM spec: added Comorbidity Profile table (13 conditions x clinical role, KM-standard element that was missing), Baseline clinical anchors profile row (creatinine/eGFR/Hgb/A1c as comparators, load-bearing for the renal trap), procedural-history statement; converted all 10 Expected Outputs from page estimates to explicit Format/Register/Length word counts (AutoQC 2.32); added file-synthesis justifications to all 10 time estimates (AutoQC 2.93). Fingerprint empty, 13 pages, dates/leak/banned-char clean
</commit_message>
<xml_diff>
--- a/worlds/ondina-vasquell/submission/Alexander_World_Vasquell_latest_6_13.docx
+++ b/worlds/ondina-vasquell/submission/Alexander_World_Vasquell_latest_6_13.docx
@@ -715,6 +715,36 @@
                 <w:sz w:val="16"/>
               </w:rPr>
               <w:t>Limb-threatening left diabetic foot infection with deep soft tissue involvement; equivocal osteomyelitis, unconfirmed; acute kidney injury on CKD 3b, improving; anemia of CKD; perfusion adequacy unresolved (peripheral arterial disease); HFpEF, euvolemic at snapshot; insulin-managed diabetes with held oral agents; deconditioning with unsafe home-disposition picture</w:t>
+            </w:r>
+          </w:p>
+        </w:tc>
+      </w:tr>
+      <w:tr>
+        <w:tc>
+          <w:tcPr>
+            <w:tcW w:type="dxa" w:w="5040"/>
+          </w:tcPr>
+          <w:p>
+            <w:r>
+              <w:rPr>
+                <w:color w:val="262B33"/>
+                <w:sz w:val="16"/>
+              </w:rPr>
+              <w:t>Baseline clinical anchors</w:t>
+            </w:r>
+          </w:p>
+        </w:tc>
+        <w:tc>
+          <w:tcPr>
+            <w:tcW w:type="dxa" w:w="5040"/>
+          </w:tcPr>
+          <w:p>
+            <w:r>
+              <w:rPr>
+                <w:color w:val="262B33"/>
+                <w:sz w:val="16"/>
+              </w:rPr>
+              <w:t>Outpatient creatinine 1.5 mg/dL, eGFR about 38 (CKD 3b); hemoglobin about 9.8 (anemia of CKD); HbA1c 8.6 percent; ambulates with a cane at home. These are comparators, not admission or hospital-course values, and distinguish chronic disease from the acute episode</w:t>
             </w:r>
           </w:p>
         </w:tc>
@@ -2641,9 +2671,668 @@
           <w:color w:val="262B33"/>
           <w:sz w:val="16"/>
         </w:rPr>
-        <w:t>The world snapshot freezes the chart at 18:00 on May 21, 2026, hospital day six, at this medically improving but operationally unsafe point. There is no surgical history beyond the index debridement. Every task in the world is an independent encounter that occurs strictly after this snapshot.</w:t>
+        <w:t>The world snapshot freezes the chart at 18:00 on May 21, 2026, hospital day six, at this medically improving but operationally unsafe point. Every task in the world is an independent encounter that occurs strictly after this snapshot.</w:t>
       </w:r>
     </w:p>
+    <w:p>
+      <w:pPr/>
+      <w:r>
+        <w:rPr>
+          <w:color w:val="262B33"/>
+          <w:sz w:val="16"/>
+        </w:rPr>
+        <w:t>Procedural history is intentionally limited: the only procedure this admission is the hospital-day-two podiatry soft-tissue debridement. There is no prior amputation, no revascularization or bypass, no dialysis access, and no other major surgical history; the absence of a prior amputation is itself relevant, because this is her first limb-threat presentation.</w:t>
+      </w:r>
+    </w:p>
+    <w:p>
+      <w:pPr>
+        <w:pStyle w:val="Heading2"/>
+      </w:pPr>
+      <w:r>
+        <w:t>Comorbidity Profile</w:t>
+      </w:r>
+    </w:p>
+    <w:tbl>
+      <w:tblPr>
+        <w:tblW w:type="auto" w:w="0"/>
+        <w:tblLook w:firstColumn="1" w:firstRow="1" w:lastColumn="0" w:lastRow="0" w:noHBand="0" w:noVBand="1" w:val="04A0"/>
+        <w:tblBorders>
+          <w:top w:val="single" w:sz="4" w:space="0" w:color="4472C4"/>
+          <w:left w:val="single" w:sz="4" w:space="0" w:color="4472C4"/>
+          <w:bottom w:val="single" w:sz="4" w:space="0" w:color="4472C4"/>
+          <w:right w:val="single" w:sz="4" w:space="0" w:color="4472C4"/>
+          <w:insideH w:val="single" w:sz="4" w:space="0" w:color="CCCCCC"/>
+          <w:insideV w:val="single" w:sz="4" w:space="0" w:color="CCCCCC"/>
+        </w:tblBorders>
+      </w:tblPr>
+      <w:tblGrid>
+        <w:gridCol w:w="3360"/>
+        <w:gridCol w:w="3360"/>
+        <w:gridCol w:w="3360"/>
+      </w:tblGrid>
+      <w:tr>
+        <w:tc>
+          <w:tcPr>
+            <w:tcW w:type="dxa" w:w="3360"/>
+            <w:shd w:val="clear" w:color="auto" w:fill="4472C4"/>
+          </w:tcPr>
+          <w:p>
+            <w:r>
+              <w:rPr>
+                <w:b/>
+                <w:color w:val="FFFFFF"/>
+                <w:sz w:val="16"/>
+              </w:rPr>
+              <w:t>#</w:t>
+            </w:r>
+          </w:p>
+        </w:tc>
+        <w:tc>
+          <w:tcPr>
+            <w:tcW w:type="dxa" w:w="3360"/>
+            <w:shd w:val="clear" w:color="auto" w:fill="4472C4"/>
+          </w:tcPr>
+          <w:p>
+            <w:r>
+              <w:rPr>
+                <w:b/>
+                <w:color w:val="FFFFFF"/>
+                <w:sz w:val="16"/>
+              </w:rPr>
+              <w:t>Condition</w:t>
+            </w:r>
+          </w:p>
+        </w:tc>
+        <w:tc>
+          <w:tcPr>
+            <w:tcW w:type="dxa" w:w="3360"/>
+            <w:shd w:val="clear" w:color="auto" w:fill="4472C4"/>
+          </w:tcPr>
+          <w:p>
+            <w:r>
+              <w:rPr>
+                <w:b/>
+                <w:color w:val="FFFFFF"/>
+                <w:sz w:val="16"/>
+              </w:rPr>
+              <w:t>Clinical role in this world</w:t>
+            </w:r>
+          </w:p>
+        </w:tc>
+      </w:tr>
+      <w:tr>
+        <w:tc>
+          <w:tcPr>
+            <w:tcW w:type="dxa" w:w="3360"/>
+          </w:tcPr>
+          <w:p>
+            <w:r>
+              <w:rPr>
+                <w:color w:val="262B33"/>
+                <w:sz w:val="16"/>
+              </w:rPr>
+              <w:t>1</w:t>
+            </w:r>
+          </w:p>
+        </w:tc>
+        <w:tc>
+          <w:tcPr>
+            <w:tcW w:type="dxa" w:w="3360"/>
+          </w:tcPr>
+          <w:p>
+            <w:r>
+              <w:rPr>
+                <w:color w:val="262B33"/>
+                <w:sz w:val="16"/>
+              </w:rPr>
+              <w:t>Insulin-dependent type 2 diabetes</w:t>
+            </w:r>
+          </w:p>
+        </w:tc>
+        <w:tc>
+          <w:tcPr>
+            <w:tcW w:type="dxa" w:w="3360"/>
+          </w:tcPr>
+          <w:p>
+            <w:r>
+              <w:rPr>
+                <w:color w:val="262B33"/>
+                <w:sz w:val="16"/>
+              </w:rPr>
+              <w:t>The core disease; drives the foot infection, the insulin regimen continued inpatient, and the diabetes quality-measure abstraction</w:t>
+            </w:r>
+          </w:p>
+        </w:tc>
+      </w:tr>
+      <w:tr>
+        <w:tc>
+          <w:tcPr>
+            <w:tcW w:type="dxa" w:w="3360"/>
+          </w:tcPr>
+          <w:p>
+            <w:r>
+              <w:rPr>
+                <w:color w:val="262B33"/>
+                <w:sz w:val="16"/>
+              </w:rPr>
+              <w:t>2</w:t>
+            </w:r>
+          </w:p>
+        </w:tc>
+        <w:tc>
+          <w:tcPr>
+            <w:tcW w:type="dxa" w:w="3360"/>
+          </w:tcPr>
+          <w:p>
+            <w:r>
+              <w:rPr>
+                <w:color w:val="262B33"/>
+                <w:sz w:val="16"/>
+              </w:rPr>
+              <w:t>Diabetic peripheral neuropathy</w:t>
+            </w:r>
+          </w:p>
+        </w:tc>
+        <w:tc>
+          <w:tcPr>
+            <w:tcW w:type="dxa" w:w="3360"/>
+          </w:tcPr>
+          <w:p>
+            <w:r>
+              <w:rPr>
+                <w:color w:val="262B33"/>
+                <w:sz w:val="16"/>
+              </w:rPr>
+              <w:t>Why she could not feel the worsening wound; contributes to fall and offloading risk</w:t>
+            </w:r>
+          </w:p>
+        </w:tc>
+      </w:tr>
+      <w:tr>
+        <w:tc>
+          <w:tcPr>
+            <w:tcW w:type="dxa" w:w="3360"/>
+          </w:tcPr>
+          <w:p>
+            <w:r>
+              <w:rPr>
+                <w:color w:val="262B33"/>
+                <w:sz w:val="16"/>
+              </w:rPr>
+              <w:t>3</w:t>
+            </w:r>
+          </w:p>
+        </w:tc>
+        <w:tc>
+          <w:tcPr>
+            <w:tcW w:type="dxa" w:w="3360"/>
+          </w:tcPr>
+          <w:p>
+            <w:r>
+              <w:rPr>
+                <w:color w:val="262B33"/>
+                <w:sz w:val="16"/>
+              </w:rPr>
+              <w:t>Mild non-proliferative diabetic retinopathy</w:t>
+            </w:r>
+          </w:p>
+        </w:tc>
+        <w:tc>
+          <w:tcPr>
+            <w:tcW w:type="dxa" w:w="3360"/>
+          </w:tcPr>
+          <w:p>
+            <w:r>
+              <w:rPr>
+                <w:color w:val="262B33"/>
+                <w:sz w:val="16"/>
+              </w:rPr>
+              <w:t>Diabetes end-organ context; the documented eye-exam date governs the quality-measure capture</w:t>
+            </w:r>
+          </w:p>
+        </w:tc>
+      </w:tr>
+      <w:tr>
+        <w:tc>
+          <w:tcPr>
+            <w:tcW w:type="dxa" w:w="3360"/>
+          </w:tcPr>
+          <w:p>
+            <w:r>
+              <w:rPr>
+                <w:color w:val="262B33"/>
+                <w:sz w:val="16"/>
+              </w:rPr>
+              <w:t>4</w:t>
+            </w:r>
+          </w:p>
+        </w:tc>
+        <w:tc>
+          <w:tcPr>
+            <w:tcW w:type="dxa" w:w="3360"/>
+          </w:tcPr>
+          <w:p>
+            <w:r>
+              <w:rPr>
+                <w:color w:val="262B33"/>
+                <w:sz w:val="16"/>
+              </w:rPr>
+              <w:t>CKD stage 3b</w:t>
+            </w:r>
+          </w:p>
+        </w:tc>
+        <w:tc>
+          <w:tcPr>
+            <w:tcW w:type="dxa" w:w="3360"/>
+          </w:tcPr>
+          <w:p>
+            <w:r>
+              <w:rPr>
+                <w:color w:val="262B33"/>
+                <w:sz w:val="16"/>
+              </w:rPr>
+              <w:t>Governs renal antibiotic dosing, the held-agent restart judgment, and contrast caution; makes NSAIDs unsafe</w:t>
+            </w:r>
+          </w:p>
+        </w:tc>
+      </w:tr>
+      <w:tr>
+        <w:tc>
+          <w:tcPr>
+            <w:tcW w:type="dxa" w:w="3360"/>
+          </w:tcPr>
+          <w:p>
+            <w:r>
+              <w:rPr>
+                <w:color w:val="262B33"/>
+                <w:sz w:val="16"/>
+              </w:rPr>
+              <w:t>5</w:t>
+            </w:r>
+          </w:p>
+        </w:tc>
+        <w:tc>
+          <w:tcPr>
+            <w:tcW w:type="dxa" w:w="3360"/>
+          </w:tcPr>
+          <w:p>
+            <w:r>
+              <w:rPr>
+                <w:color w:val="262B33"/>
+                <w:sz w:val="16"/>
+              </w:rPr>
+              <w:t>Anemia of CKD</w:t>
+            </w:r>
+          </w:p>
+        </w:tc>
+        <w:tc>
+          <w:tcPr>
+            <w:tcW w:type="dxa" w:w="3360"/>
+          </w:tcPr>
+          <w:p>
+            <w:r>
+              <w:rPr>
+                <w:color w:val="262B33"/>
+                <w:sz w:val="16"/>
+              </w:rPr>
+              <w:t>Reduced reserve; an intentionally open management item, never closed in the chart</w:t>
+            </w:r>
+          </w:p>
+        </w:tc>
+      </w:tr>
+      <w:tr>
+        <w:tc>
+          <w:tcPr>
+            <w:tcW w:type="dxa" w:w="3360"/>
+          </w:tcPr>
+          <w:p>
+            <w:r>
+              <w:rPr>
+                <w:color w:val="262B33"/>
+                <w:sz w:val="16"/>
+              </w:rPr>
+              <w:t>6</w:t>
+            </w:r>
+          </w:p>
+        </w:tc>
+        <w:tc>
+          <w:tcPr>
+            <w:tcW w:type="dxa" w:w="3360"/>
+          </w:tcPr>
+          <w:p>
+            <w:r>
+              <w:rPr>
+                <w:color w:val="262B33"/>
+                <w:sz w:val="16"/>
+              </w:rPr>
+              <w:t>Peripheral arterial disease</w:t>
+            </w:r>
+          </w:p>
+        </w:tc>
+        <w:tc>
+          <w:tcPr>
+            <w:tcW w:type="dxa" w:w="3360"/>
+          </w:tcPr>
+          <w:p>
+            <w:r>
+              <w:rPr>
+                <w:color w:val="262B33"/>
+                <w:sz w:val="16"/>
+              </w:rPr>
+              <w:t>The perfusion question central to limb threat, the appeal, the determination, and the referral</w:t>
+            </w:r>
+          </w:p>
+        </w:tc>
+      </w:tr>
+      <w:tr>
+        <w:tc>
+          <w:tcPr>
+            <w:tcW w:type="dxa" w:w="3360"/>
+          </w:tcPr>
+          <w:p>
+            <w:r>
+              <w:rPr>
+                <w:color w:val="262B33"/>
+                <w:sz w:val="16"/>
+              </w:rPr>
+              <w:t>7</w:t>
+            </w:r>
+          </w:p>
+        </w:tc>
+        <w:tc>
+          <w:tcPr>
+            <w:tcW w:type="dxa" w:w="3360"/>
+          </w:tcPr>
+          <w:p>
+            <w:r>
+              <w:rPr>
+                <w:color w:val="262B33"/>
+                <w:sz w:val="16"/>
+              </w:rPr>
+              <w:t>HFpEF</w:t>
+            </w:r>
+          </w:p>
+        </w:tc>
+        <w:tc>
+          <w:tcPr>
+            <w:tcW w:type="dxa" w:w="3360"/>
+          </w:tcPr>
+          <w:p>
+            <w:r>
+              <w:rPr>
+                <w:color w:val="262B33"/>
+                <w:sz w:val="16"/>
+              </w:rPr>
+              <w:t>Volume and diuretic context; restart caution for empagliflozin and lisinopril</w:t>
+            </w:r>
+          </w:p>
+        </w:tc>
+      </w:tr>
+      <w:tr>
+        <w:tc>
+          <w:tcPr>
+            <w:tcW w:type="dxa" w:w="3360"/>
+          </w:tcPr>
+          <w:p>
+            <w:r>
+              <w:rPr>
+                <w:color w:val="262B33"/>
+                <w:sz w:val="16"/>
+              </w:rPr>
+              <w:t>8</w:t>
+            </w:r>
+          </w:p>
+        </w:tc>
+        <w:tc>
+          <w:tcPr>
+            <w:tcW w:type="dxa" w:w="3360"/>
+          </w:tcPr>
+          <w:p>
+            <w:r>
+              <w:rPr>
+                <w:color w:val="262B33"/>
+                <w:sz w:val="16"/>
+              </w:rPr>
+              <w:t>Hypertension</w:t>
+            </w:r>
+          </w:p>
+        </w:tc>
+        <w:tc>
+          <w:tcPr>
+            <w:tcW w:type="dxa" w:w="3360"/>
+          </w:tcPr>
+          <w:p>
+            <w:r>
+              <w:rPr>
+                <w:color w:val="262B33"/>
+                <w:sz w:val="16"/>
+              </w:rPr>
+              <w:t>Cardiorenal context; supports the held lisinopril and the volume picture</w:t>
+            </w:r>
+          </w:p>
+        </w:tc>
+      </w:tr>
+      <w:tr>
+        <w:tc>
+          <w:tcPr>
+            <w:tcW w:type="dxa" w:w="3360"/>
+          </w:tcPr>
+          <w:p>
+            <w:r>
+              <w:rPr>
+                <w:color w:val="262B33"/>
+                <w:sz w:val="16"/>
+              </w:rPr>
+              <w:t>9</w:t>
+            </w:r>
+          </w:p>
+        </w:tc>
+        <w:tc>
+          <w:tcPr>
+            <w:tcW w:type="dxa" w:w="3360"/>
+          </w:tcPr>
+          <w:p>
+            <w:r>
+              <w:rPr>
+                <w:color w:val="262B33"/>
+                <w:sz w:val="16"/>
+              </w:rPr>
+              <w:t>Dyslipidemia</w:t>
+            </w:r>
+          </w:p>
+        </w:tc>
+        <w:tc>
+          <w:tcPr>
+            <w:tcW w:type="dxa" w:w="3360"/>
+          </w:tcPr>
+          <w:p>
+            <w:r>
+              <w:rPr>
+                <w:color w:val="262B33"/>
+                <w:sz w:val="16"/>
+              </w:rPr>
+              <w:t>Chronic ASCVD risk; supports statin and antiplatelet continuation</w:t>
+            </w:r>
+          </w:p>
+        </w:tc>
+      </w:tr>
+      <w:tr>
+        <w:tc>
+          <w:tcPr>
+            <w:tcW w:type="dxa" w:w="3360"/>
+          </w:tcPr>
+          <w:p>
+            <w:r>
+              <w:rPr>
+                <w:color w:val="262B33"/>
+                <w:sz w:val="16"/>
+              </w:rPr>
+              <w:t>10</w:t>
+            </w:r>
+          </w:p>
+        </w:tc>
+        <w:tc>
+          <w:tcPr>
+            <w:tcW w:type="dxa" w:w="3360"/>
+          </w:tcPr>
+          <w:p>
+            <w:r>
+              <w:rPr>
+                <w:color w:val="262B33"/>
+                <w:sz w:val="16"/>
+              </w:rPr>
+              <w:t>Obesity (class I)</w:t>
+            </w:r>
+          </w:p>
+        </w:tc>
+        <w:tc>
+          <w:tcPr>
+            <w:tcW w:type="dxa" w:w="3360"/>
+          </w:tcPr>
+          <w:p>
+            <w:r>
+              <w:rPr>
+                <w:color w:val="262B33"/>
+                <w:sz w:val="16"/>
+              </w:rPr>
+              <w:t>Cardiometabolic and mobility burden; compounds offloading difficulty</w:t>
+            </w:r>
+          </w:p>
+        </w:tc>
+      </w:tr>
+      <w:tr>
+        <w:tc>
+          <w:tcPr>
+            <w:tcW w:type="dxa" w:w="3360"/>
+          </w:tcPr>
+          <w:p>
+            <w:r>
+              <w:rPr>
+                <w:color w:val="262B33"/>
+                <w:sz w:val="16"/>
+              </w:rPr>
+              <w:t>11</w:t>
+            </w:r>
+          </w:p>
+        </w:tc>
+        <w:tc>
+          <w:tcPr>
+            <w:tcW w:type="dxa" w:w="3360"/>
+          </w:tcPr>
+          <w:p>
+            <w:r>
+              <w:rPr>
+                <w:color w:val="262B33"/>
+                <w:sz w:val="16"/>
+              </w:rPr>
+              <w:t>Obstructive sleep apnea on CPAP</w:t>
+            </w:r>
+          </w:p>
+        </w:tc>
+        <w:tc>
+          <w:tcPr>
+            <w:tcW w:type="dxa" w:w="3360"/>
+          </w:tcPr>
+          <w:p>
+            <w:r>
+              <w:rPr>
+                <w:color w:val="262B33"/>
+                <w:sz w:val="16"/>
+              </w:rPr>
+              <w:t>Chronic reserve burden; equipment continuity at discharge</w:t>
+            </w:r>
+          </w:p>
+        </w:tc>
+      </w:tr>
+      <w:tr>
+        <w:tc>
+          <w:tcPr>
+            <w:tcW w:type="dxa" w:w="3360"/>
+          </w:tcPr>
+          <w:p>
+            <w:r>
+              <w:rPr>
+                <w:color w:val="262B33"/>
+                <w:sz w:val="16"/>
+              </w:rPr>
+              <w:t>12</w:t>
+            </w:r>
+          </w:p>
+        </w:tc>
+        <w:tc>
+          <w:tcPr>
+            <w:tcW w:type="dxa" w:w="3360"/>
+          </w:tcPr>
+          <w:p>
+            <w:r>
+              <w:rPr>
+                <w:color w:val="262B33"/>
+                <w:sz w:val="16"/>
+              </w:rPr>
+              <w:t>Knee osteoarthritis</w:t>
+            </w:r>
+          </w:p>
+        </w:tc>
+        <w:tc>
+          <w:tcPr>
+            <w:tcW w:type="dxa" w:w="3360"/>
+          </w:tcPr>
+          <w:p>
+            <w:r>
+              <w:rPr>
+                <w:color w:val="262B33"/>
+                <w:sz w:val="16"/>
+              </w:rPr>
+              <w:t>Why an NSAID is tempting but unsafe in CKD; acetaminophen-only is the quiet correct expectation</w:t>
+            </w:r>
+          </w:p>
+        </w:tc>
+      </w:tr>
+      <w:tr>
+        <w:tc>
+          <w:tcPr>
+            <w:tcW w:type="dxa" w:w="3360"/>
+          </w:tcPr>
+          <w:p>
+            <w:r>
+              <w:rPr>
+                <w:color w:val="262B33"/>
+                <w:sz w:val="16"/>
+              </w:rPr>
+              <w:t>13</w:t>
+            </w:r>
+          </w:p>
+        </w:tc>
+        <w:tc>
+          <w:tcPr>
+            <w:tcW w:type="dxa" w:w="3360"/>
+          </w:tcPr>
+          <w:p>
+            <w:r>
+              <w:rPr>
+                <w:color w:val="262B33"/>
+                <w:sz w:val="16"/>
+              </w:rPr>
+              <w:t>Limited mobility at baseline</w:t>
+            </w:r>
+          </w:p>
+        </w:tc>
+        <w:tc>
+          <w:tcPr>
+            <w:tcW w:type="dxa" w:w="3360"/>
+          </w:tcPr>
+          <w:p>
+            <w:r>
+              <w:rPr>
+                <w:color w:val="262B33"/>
+                <w:sz w:val="16"/>
+              </w:rPr>
+              <w:t>Compounds offloading and stairs; central to the disposition-safety tasks</w:t>
+            </w:r>
+          </w:p>
+        </w:tc>
+      </w:tr>
+    </w:tbl>
     <w:p>
       <w:pPr>
         <w:pStyle w:val="Heading2"/>
@@ -3427,7 +4116,7 @@
           <w:color w:val="262B33"/>
           <w:sz w:val="19"/>
         </w:rPr>
-        <w:t>Anchor: 05/22/2026 at 08:30. Priority: P0. Difficulty: medium-high. Time estimate: 25 to 35 minutes.</w:t>
+        <w:t>Anchor: 05/22/2026 at 08:30. Priority: P0. Difficulty: medium-high. Time estimate: 25 to 35 minutes, reconciling the home list, MAR, renal trend, and the ID and pharmacy notes.</w:t>
       </w:r>
     </w:p>
     <w:p>
@@ -3437,7 +4126,7 @@
           <w:color w:val="262B33"/>
           <w:sz w:val="16"/>
         </w:rPr>
-        <w:t>Expected Output: a reconciled discharge medication list, one row per drug with a disposition of continue, hold, change, stop, or defer and a short rationale, plus patient-facing instructions, in professional clinical register, roughly one to two pages. Correct responses dose to current renal function rather than admission values, keep the held cardiorenal and diabetes agents (metformin, empagliflozin, lisinopril) as deliberate restart judgments tied to renal recovery and outpatient follow-up rather than silently resuming or discontinuing them, continue acetaminophen and not an NSAID for the knee, and surface the discharge antibiotic plan at a renally correct dose. Grader anchors: renal-correct antibiotic dose; metformin and empagliflozin and lisinopril each handled as an explicit deferred restart, not a silent continue or stop; NSAID avoidance; insulin continued; no fabricated doses.</w:t>
+        <w:t>Expected Output: a reconciled discharge medication list, one row per drug with a disposition of continue, hold, change, stop, or defer and a short rationale, plus patient-facing instructions. Format: a headed reconciliation note with a disposition-per-medication structure. Register: hospitalist and pharmacist professional. Length: 450 to 700 words. Correct responses dose to current renal function rather than admission values, keep the held cardiorenal and diabetes agents (metformin, empagliflozin, lisinopril) as deliberate restart judgments tied to renal recovery and outpatient follow-up rather than silently resuming or discontinuing them, continue acetaminophen and not an NSAID for the knee, and surface the discharge antibiotic plan at a renally correct dose. Grader anchors: renal-correct antibiotic dose; metformin and empagliflozin and lisinopril each handled as an explicit deferred restart, not a silent continue or stop; NSAID avoidance; insulin continued; no fabricated doses.</w:t>
       </w:r>
     </w:p>
     <w:p>
@@ -3731,7 +4420,7 @@
           <w:color w:val="262B33"/>
           <w:sz w:val="19"/>
         </w:rPr>
-        <w:t>Anchor: 05/22/2026 at 09:00. Priority: P0. Difficulty: high. Time estimate: 25 to 35 minutes.</w:t>
+        <w:t>Anchor: 05/22/2026 at 09:00. Priority: P0. Difficulty: high. Time estimate: 25 to 35 minutes, cross-checking the wound, podiatry, imaging, pathology, and the external coding worksheet.</w:t>
       </w:r>
     </w:p>
     <w:p>
@@ -3741,7 +4430,7 @@
           <w:color w:val="262B33"/>
           <w:sz w:val="16"/>
         </w:rPr>
-        <w:t>Expected Output: a physician coding attestation responding to the health information worksheet, one line per diagnosis with principal diagnosis, present-on-admission status, and code family, in coding-attestation register, roughly one page. Correct responses code the diabetic foot ulcer with deep soft tissue infection or cellulitis family rather than a pressure-injury family, decline to attest acute osteomyelitis as present on admission because the treating record does not establish it, keep the diabetes and CKD codes consistent with the record, and do not adopt the worksheet's severity-forward framing. Grader anchors: diabetic foot ulcer or deep soft-tissue-infection family selected, not pressure injury; osteomyelitis not attested as established or POA; no upcoding to an unsupported DRG; supported secondary diagnoses retained.</w:t>
+        <w:t>Expected Output: a physician coding attestation responding to the health information worksheet, one line per diagnosis with principal diagnosis, present-on-admission status, and code family. Format: a line-by-line physician coding attestation. Register: coding-attestation professional. Length: 350 to 550 words. Correct responses code the diabetic foot ulcer with deep soft tissue infection or cellulitis family rather than a pressure-injury family, decline to attest acute osteomyelitis as present on admission because the treating record does not establish it, keep the diabetes and CKD codes consistent with the record, and do not adopt the worksheet's severity-forward framing. Grader anchors: diabetic foot ulcer or deep soft-tissue-infection family selected, not pressure injury; osteomyelitis not attested as established or POA; no upcoding to an unsupported DRG; supported secondary diagnoses retained.</w:t>
       </w:r>
     </w:p>
     <w:p>
@@ -4035,7 +4724,7 @@
           <w:color w:val="262B33"/>
           <w:sz w:val="19"/>
         </w:rPr>
-        <w:t>Anchor: 05/24/2026 at 10:00. Priority: P0. Difficulty: high. Time estimate: 20 to 30 minutes.</w:t>
+        <w:t>Anchor: 05/24/2026 at 10:00. Priority: P0. Difficulty: high. Time estimate: 20 to 30 minutes, weighing the imaging, pathology, and treating notes against the query items.</w:t>
       </w:r>
     </w:p>
     <w:p>
@@ -4045,7 +4734,7 @@
           <w:color w:val="262B33"/>
           <w:sz w:val="16"/>
         </w:rPr>
-        <w:t>Expected Output: an attending response to a CDI query set, one reasoned answer per item, agreeing where the record supports it and declining on clinical grounds where it does not, in the treating attending's voice, roughly one page. Correct responses decline to add acute osteomyelitis because the treating team characterized the process as a deep soft tissue infection with equivocal imaging and no bone confirmation, engage the indicators rather than restating their absence, anchor the reasoning on the team's own documentation, and accept any genuinely supported clarification. Grader anchors: osteomyelitis declined on clinical grounds with reasoning, not a bare or procedural decline; the decline is anchored on the treating record; supported items answered; no agreement to unsupported severity language.</w:t>
+        <w:t>Expected Output: an attending response to a CDI query set, one reasoned answer per item, agreeing where the record supports it and declining on clinical grounds where it does not. Format: an item-by-item attending query response. Register: treating attending. Length: 350 to 600 words. Correct responses decline to add acute osteomyelitis because the treating team characterized the process as a deep soft tissue infection with equivocal imaging and no bone confirmation, engage the indicators rather than restating their absence, anchor the reasoning on the team's own documentation, and accept any genuinely supported clarification. Grader anchors: osteomyelitis declined on clinical grounds with reasoning, not a bare or procedural decline; the decline is anchored on the treating record; supported items answered; no agreement to unsupported severity language.</w:t>
       </w:r>
     </w:p>
     <w:p>
@@ -4339,7 +5028,7 @@
           <w:color w:val="262B33"/>
           <w:sz w:val="19"/>
         </w:rPr>
-        <w:t>Anchor: 05/24/2026 at 15:00. Priority: P0. Difficulty: high. Time estimate: 30 to 40 minutes.</w:t>
+        <w:t>Anchor: 05/24/2026 at 15:00. Priority: P0. Difficulty: high. Time estimate: 30 to 40 minutes, synthesizing the PT, OT, vascular, wound, case-management, and denial documents.</w:t>
       </w:r>
     </w:p>
     <w:p>
@@ -4349,7 +5038,7 @@
           <w:color w:val="262B33"/>
           <w:sz w:val="16"/>
         </w:rPr>
-        <w:t>Expected Output: a physician appeal letter rebutting the Medicare Advantage denial of skilled-nursing-facility authorization, in formal physician-to-payer register, roughly one to two pages, with a clear appeal position and clinical rationale. Correct responses rebut the improving-markers-equal-home framing by synthesizing the unresolved perfusion study, the frequency and skill of required wound care, the physical and occupational therapy findings on offloading and stairs, the second-floor walk-up, the night-working caregiver, and infection-relapse risk, and do not over-defer to the payer's authority. Grader anchors: appeal grounded in PT and OT functional findings and offloading need; perfusion uncertainty cited from the vascular study, not a reassuring pulse; wound-care skill and frequency stated; home and caregiver limits integrated; offloading boot or wound device used as support, not as the whole case.</w:t>
+        <w:t>Expected Output: a physician appeal letter rebutting the Medicare Advantage denial of skilled-nursing-facility authorization, with a clear appeal position and clinical rationale. Format: a physician appeal letter. Register: formal physician-to-payer. Length: 500 to 800 words. Correct responses rebut the improving-markers-equal-home framing by synthesizing the unresolved perfusion study, the frequency and skill of required wound care, the physical and occupational therapy findings on offloading and stairs, the second-floor walk-up, the night-working caregiver, and infection-relapse risk, and do not over-defer to the payer's authority. Grader anchors: appeal grounded in PT and OT functional findings and offloading need; perfusion uncertainty cited from the vascular study, not a reassuring pulse; wound-care skill and frequency stated; home and caregiver limits integrated; offloading boot or wound device used as support, not as the whole case.</w:t>
       </w:r>
     </w:p>
     <w:p>
@@ -4643,7 +5332,7 @@
           <w:color w:val="262B33"/>
           <w:sz w:val="19"/>
         </w:rPr>
-        <w:t>Anchor: 05/25/2026 at 09:00. Priority: P0. Difficulty: medium-high. Time estimate: 20 to 30 minutes.</w:t>
+        <w:t>Anchor: 05/25/2026 at 09:00. Priority: P0. Difficulty: medium-high. Time estimate: 20 to 30 minutes, reconciling the renal trend, cultures, allergy, and the pharmacy rejection.</w:t>
       </w:r>
     </w:p>
     <w:p>
@@ -4653,7 +5342,7 @@
           <w:color w:val="262B33"/>
           <w:sz w:val="16"/>
         </w:rPr>
-        <w:t>Expected Output: a response to a pharmacy benefit rejection of the planned discharge antibiotic, choosing among substitute, appeal, hold, or exception request with rationale, in pharmacist-to-prescriber clinical register, under one page. Correct responses reject the formulary-preferred substitute because it is unsafe for this patient on renal or sulfa-allergy grounds, propose a renally appropriate and allergy-safe alternative or a formulary-exception appeal, and tie the choice to current renal function and the deep-tissue culture rather than the superficial swab. Grader anchors: the unsafe substitute is declined with the specific reason, renal or sulfa; a safe alternative or exception is proposed; dosing reflects current renal function; culture hierarchy respected.</w:t>
+        <w:t>Expected Output: a response to a pharmacy benefit rejection of the planned discharge antibiotic, choosing among substitute, appeal, hold, or exception request with rationale. Format: a pharmacist-to-prescriber response note. Register: pharmacist-to-prescriber clinical. Length: 300 to 500 words. Correct responses reject the formulary-preferred substitute because it is unsafe for this patient on renal or sulfa-allergy grounds, propose a renally appropriate and allergy-safe alternative or a formulary-exception appeal, and tie the choice to current renal function and the deep-tissue culture rather than the superficial swab. Grader anchors: the unsafe substitute is declined with the specific reason, renal or sulfa; a safe alternative or exception is proposed; dosing reflects current renal function; culture hierarchy respected.</w:t>
       </w:r>
     </w:p>
     <w:p>
@@ -4947,7 +5636,7 @@
           <w:color w:val="262B33"/>
           <w:sz w:val="19"/>
         </w:rPr>
-        <w:t>Anchor: 05/26/2026 at 11:00. Priority: P1. Difficulty: medium. Time estimate: 20 to 30 minutes.</w:t>
+        <w:t>Anchor: 05/26/2026 at 11:00. Priority: P1. Difficulty: medium. Time estimate: 20 to 30 minutes, applying criteria across the improvement and the unresolved-operational evidence.</w:t>
       </w:r>
     </w:p>
     <w:p>
@@ -4957,7 +5646,7 @@
           <w:color w:val="262B33"/>
           <w:sz w:val="16"/>
         </w:rPr>
-        <w:t>Expected Output: a physician-advisor continued-stay determination with an explicit verdict and criteria-based rationale, in utilization-review register, roughly one page. Correct responses find continued skilled-level need justified because the operational picture (unresolved perfusion, skilled wound-care frequency, unsafe offloading and home environment) outweighs the improving infection markers, and apply criteria to both sides rather than reading improvement alone as readiness. Grader anchors: a binding determination is stated; both the improvement and the unresolved-operational criteria are weighed; the verdict rests on documented function and perfusion, not markers alone; no discharge-ready verdict from improvement alone.</w:t>
+        <w:t>Expected Output: a physician-advisor continued-stay determination with an explicit verdict and criteria-based rationale. Format: a physician-advisor continued-stay determination. Register: utilization-review. Length: 350 to 550 words. Correct responses find continued skilled-level need justified because the operational picture (unresolved perfusion, skilled wound-care frequency, unsafe offloading and home environment) outweighs the improving infection markers, and apply criteria to both sides rather than reading improvement alone as readiness. Grader anchors: a binding determination is stated; both the improvement and the unresolved-operational criteria are weighed; the verdict rests on documented function and perfusion, not markers alone; no discharge-ready verdict from improvement alone.</w:t>
       </w:r>
     </w:p>
     <w:p>
@@ -5251,7 +5940,7 @@
           <w:color w:val="262B33"/>
           <w:sz w:val="19"/>
         </w:rPr>
-        <w:t>Anchor: 06/04/2026 at 09:00. Priority: P0. Difficulty: medium-high. Time estimate: 20 to 30 minutes.</w:t>
+        <w:t>Anchor: 06/04/2026 at 09:00. Priority: P0. Difficulty: medium-high. Time estimate: 20 to 30 minutes, abstracting the outpatient summary, eye-exam, and lab records against the measure logic.</w:t>
       </w:r>
     </w:p>
     <w:p>
@@ -5261,7 +5950,7 @@
           <w:color w:val="262B33"/>
           <w:sz w:val="16"/>
         </w:rPr>
-        <w:t>Expected Output: a completed diabetes quality-measure abstraction, one value, exclusion, or unable-to-determine per field, in abstraction register, structured form. Correct responses apply the measure logic honestly, catch the quiet lookback-window or exclusion detail that changes capture, and do not force a numerator or denominator the record does not support. Grader anchors: the quiet disqualifier is caught and applied; fields are valued, excluded, or marked unable to determine per the record; no unsupported capture; the eye-exam, HbA1c, and nephropathy fields are abstracted to the documented evidence.</w:t>
+        <w:t>Expected Output: a completed diabetes quality-measure abstraction, one value, exclusion, or unable-to-determine per field. Format: a completed structured abstraction form. Register: quality-abstraction. Length: 250 to 450 words across the fields. Correct responses apply the measure logic honestly, catch the quiet lookback-window or exclusion detail that changes capture, and do not force a numerator or denominator the record does not support. Grader anchors: the quiet disqualifier is caught and applied; fields are valued, excluded, or marked unable to determine per the record; no unsupported capture; the eye-exam, HbA1c, and nephropathy fields are abstracted to the documented evidence.</w:t>
       </w:r>
     </w:p>
     <w:p>
@@ -5555,7 +6244,7 @@
           <w:color w:val="262B33"/>
           <w:sz w:val="19"/>
         </w:rPr>
-        <w:t>Anchor: 06/08/2026 at 14:00. Priority: P0. Difficulty: medium. Time estimate: 25 to 35 minutes.</w:t>
+        <w:t>Anchor: 06/08/2026 at 14:00. Priority: P0. Difficulty: medium. Time estimate: 25 to 35 minutes, assembling the source-control, perfusion, antibiotic, offloading, and follow-up statuses.</w:t>
       </w:r>
     </w:p>
     <w:p>
@@ -5565,7 +6254,7 @@
           <w:color w:val="262B33"/>
           <w:sz w:val="16"/>
         </w:rPr>
-        <w:t>Expected Output: a vascular surgery referral letter that includes a required disposition table for source control, perfusion, antibiotics, offloading, and follow-up, in referral register, roughly one to two pages. Correct responses keep each unresolved limb-threat item explicitly open in the table rather than letting the letter's narrative make the case sound settled, carry perfusion as unresolved, and ask the specialist the genuinely open questions. Grader anchors: the disposition table is present and each status is accurate, with perfusion and any pending item kept open; the narrative does not assert resolution the chart does not support; the referral asks the open perfusion and revascularization questions.</w:t>
+        <w:t>Expected Output: a vascular surgery referral letter that includes a required disposition table for source control, perfusion, antibiotics, offloading, and follow-up. Format: a referral letter with an embedded disposition table. Register: referral. Length: 450 to 700 words. Correct responses keep each unresolved limb-threat item explicitly open in the table rather than letting the letter's narrative make the case sound settled, carry perfusion as unresolved, and ask the specialist the genuinely open questions. Grader anchors: the disposition table is present and each status is accurate, with perfusion and any pending item kept open; the narrative does not assert resolution the chart does not support; the referral asks the open perfusion and revascularization questions.</w:t>
       </w:r>
     </w:p>
     <w:p>
@@ -5859,7 +6548,7 @@
           <w:color w:val="262B33"/>
           <w:sz w:val="19"/>
         </w:rPr>
-        <w:t>Anchor: 06/11/2026 at 10:00. Priority: P0. Difficulty: medium-low. Time estimate: 25 to 35 minutes.</w:t>
+        <w:t>Anchor: 06/11/2026 at 10:00. Priority: P0. Difficulty: medium-low. Time estimate: 25 to 35 minutes, tracing the order, teaching, device, and home-layout contributors to the event.</w:t>
       </w:r>
     </w:p>
     <w:p>
@@ -5869,7 +6558,7 @@
           <w:color w:val="262B33"/>
           <w:sz w:val="16"/>
         </w:rPr>
-        <w:t>Expected Output: a safety review of a missed-offloading event with an attribution and prevention finding, in safety-review register, roughly one to two pages. Correct responses attribute the miss to multifactorial system causes (order, teaching, device availability, and home-layout factors documented in the chart) rather than to patient nonadherence alone, and propose prevention tied to those system causes. Grader anchors: attribution is multifactorial and system-level, not single-person blame; the prevention plan maps to the documented contributors; the review engages the chart rather than asserting a cause.</w:t>
+        <w:t>Expected Output: a safety review of a missed-offloading event with an attribution and prevention finding. Format: a structured root-cause review. Register: patient-safety review. Length: 450 to 700 words. Correct responses attribute the miss to multifactorial system causes (order, teaching, device availability, and home-layout factors documented in the chart) rather than to patient nonadherence alone, and propose prevention tied to those system causes. Grader anchors: attribution is multifactorial and system-level, not single-person blame; the prevention plan maps to the documented contributors; the review engages the chart rather than asserting a cause.</w:t>
       </w:r>
     </w:p>
     <w:p>
@@ -6163,7 +6852,7 @@
           <w:color w:val="262B33"/>
           <w:sz w:val="19"/>
         </w:rPr>
-        <w:t>Anchor: 05/22/2026 at 10:00. Priority: P0. Difficulty: medium. Time estimate: 20 to 30 minutes.</w:t>
+        <w:t>Anchor: 05/22/2026 at 10:00. Priority: P0. Difficulty: medium. Time estimate: 20 to 30 minutes, completing the placeholder from the PT, OT, and wound documentation.</w:t>
       </w:r>
     </w:p>
     <w:p>
@@ -6173,7 +6862,7 @@
           <w:color w:val="262B33"/>
           <w:sz w:val="16"/>
         </w:rPr>
-        <w:t>Expected Output: finalized discharge instructions completed from a started draft, in patient-facing discharge register, roughly one page. The started draft is complete except for the offloading and activity section, which is left as a true placeholder to be completed from the chart; correct responses fill it with the documented unsafe-offloading reality and the supervised plan rather than asserting a routine clearance the chart does not support, and do not close any decision the chart leaves open. Grader anchors: the offloading and activity section is completed from the chart with the documented restriction and supervision, not a routine clearance; nothing the chart leaves open is closed; the rest of the draft is finalized faithfully.</w:t>
+        <w:t>Expected Output: finalized discharge instructions completed from a started draft. Format: a finalized patient-facing discharge instruction sheet. Register: patient-facing discharge. Length: 300 to 500 words. The started draft is complete except for the offloading and activity section, which is left as a true placeholder to be completed from the chart; correct responses fill it with the documented unsafe-offloading reality and the supervised plan rather than asserting a routine clearance the chart does not support, and do not close any decision the chart leaves open. Grader anchors: the offloading and activity section is completed from the chart with the documented restriction and supervision, not a routine clearance; nothing the chart leaves open is closed; the rest of the draft is finalized faithfully.</w:t>
       </w:r>
     </w:p>
     <w:p>

</xml_diff>

<commit_message>
Content audit pass 2: cross-reference coherence verified clean (eGFR/creatinine/WBC/dates/HD-labels/roster all agree across sections); home medication list expanded to KM granular form, explicit Dose/Route/Frequency columns (AutoQC 2.12) plus the load-bearing inpatient-status column. Fingerprint empty, 13 pages render-verified
</commit_message>
<xml_diff>
--- a/worlds/ondina-vasquell/submission/Alexander_World_Vasquell_latest_6_13.docx
+++ b/worlds/ondina-vasquell/submission/Alexander_World_Vasquell_latest_6_13.docx
@@ -25,22 +25,40 @@
             <w:shd w:val="clear" w:color="auto" w:fill="D6E4F0"/>
           </w:tcPr>
           <w:p>
+            <w:pPr>
+              <w:jc w:val="center"/>
+            </w:pPr>
             <w:r>
               <w:rPr>
                 <w:b/>
                 <w:color w:val="4472C4"/>
                 <w:sz w:val="32"/>
               </w:rPr>
-              <w:t>WORLD SPECIFICATION DOCUMENT. Limb-Threat Diabetic Foot Infection.</w:t>
-            </w:r>
-          </w:p>
-          <w:p>
+              <w:t>ONDINA VASQUELL WORLD SPECIFICATION DOCUMENT</w:t>
+            </w:r>
+          </w:p>
+          <w:p>
+            <w:pPr>
+              <w:jc w:val="center"/>
+            </w:pPr>
             <w:r>
               <w:rPr>
                 <w:color w:val="666666"/>
                 <w:sz w:val="20"/>
               </w:rPr>
-              <w:t>World Title: Limb-Threat Diabetic Foot Infection. Patient: Ondina Vasquell. World Type: Typical Clinical World. Setting: inpatient hospital medicine. Snapshot: May 21, 2026 at 18:00. 10 Tasks. Project Sanctum. Version 1.0. June 13, 2026.</w:t>
+              <w:t>World Title: Limb-Threat Diabetic Foot Infection | World Type: Typical Clinical World | Snapshot: May 21, 2026 at 18:00 | 10 Tasks</w:t>
+            </w:r>
+          </w:p>
+          <w:p>
+            <w:pPr>
+              <w:jc w:val="center"/>
+            </w:pPr>
+            <w:r>
+              <w:rPr>
+                <w:color w:val="666666"/>
+                <w:sz w:val="20"/>
+              </w:rPr>
+              <w:t>Clinical domain: inpatient hospital medicine, vascular and wound care, health information and payer operations | Project Sanctum | Version 1.0 | June 13, 2026</w:t>
             </w:r>
           </w:p>
         </w:tc>
@@ -755,7 +773,7 @@
         <w:pStyle w:val="Heading2"/>
       </w:pPr>
       <w:r>
-        <w:t>Home medication list (pre-admission baseline, with inpatient change)</w:t>
+        <w:t>Home medication list (pre-admission baseline, with inpatient status)</w:t>
       </w:r>
     </w:p>
     <w:tbl>
@@ -772,14 +790,18 @@
         </w:tblBorders>
       </w:tblPr>
       <w:tblGrid>
-        <w:gridCol w:w="3360"/>
-        <w:gridCol w:w="3360"/>
-        <w:gridCol w:w="3360"/>
+        <w:gridCol w:w="1440"/>
+        <w:gridCol w:w="1440"/>
+        <w:gridCol w:w="1440"/>
+        <w:gridCol w:w="1440"/>
+        <w:gridCol w:w="1440"/>
+        <w:gridCol w:w="1440"/>
+        <w:gridCol w:w="1440"/>
       </w:tblGrid>
       <w:tr>
         <w:tc>
           <w:tcPr>
-            <w:tcW w:type="dxa" w:w="3360"/>
+            <w:tcW w:type="dxa" w:w="1440"/>
             <w:shd w:val="clear" w:color="auto" w:fill="4472C4"/>
           </w:tcPr>
           <w:p>
@@ -789,13 +811,13 @@
                 <w:color w:val="FFFFFF"/>
                 <w:sz w:val="16"/>
               </w:rPr>
-              <w:t>Medication (dose, route, frequency)</w:t>
-            </w:r>
-          </w:p>
-        </w:tc>
-        <w:tc>
-          <w:tcPr>
-            <w:tcW w:type="dxa" w:w="3360"/>
+              <w:t>#</w:t>
+            </w:r>
+          </w:p>
+        </w:tc>
+        <w:tc>
+          <w:tcPr>
+            <w:tcW w:type="dxa" w:w="1440"/>
             <w:shd w:val="clear" w:color="auto" w:fill="4472C4"/>
           </w:tcPr>
           <w:p>
@@ -805,13 +827,13 @@
                 <w:color w:val="FFFFFF"/>
                 <w:sz w:val="16"/>
               </w:rPr>
-              <w:t>Indication</w:t>
-            </w:r>
-          </w:p>
-        </w:tc>
-        <w:tc>
-          <w:tcPr>
-            <w:tcW w:type="dxa" w:w="3360"/>
+              <w:t>Medication</w:t>
+            </w:r>
+          </w:p>
+        </w:tc>
+        <w:tc>
+          <w:tcPr>
+            <w:tcW w:type="dxa" w:w="1440"/>
             <w:shd w:val="clear" w:color="auto" w:fill="4472C4"/>
           </w:tcPr>
           <w:p>
@@ -821,29 +843,149 @@
                 <w:color w:val="FFFFFF"/>
                 <w:sz w:val="16"/>
               </w:rPr>
-              <w:t>Inpatient change</w:t>
-            </w:r>
-          </w:p>
-        </w:tc>
-      </w:tr>
-      <w:tr>
-        <w:tc>
-          <w:tcPr>
-            <w:tcW w:type="dxa" w:w="3360"/>
-          </w:tcPr>
-          <w:p>
-            <w:r>
-              <w:rPr>
-                <w:color w:val="262B33"/>
-                <w:sz w:val="16"/>
-              </w:rPr>
-              <w:t>Insulin glargine 26 units subcutaneous nightly</w:t>
-            </w:r>
-          </w:p>
-        </w:tc>
-        <w:tc>
-          <w:tcPr>
-            <w:tcW w:type="dxa" w:w="3360"/>
+              <w:t>Dose</w:t>
+            </w:r>
+          </w:p>
+        </w:tc>
+        <w:tc>
+          <w:tcPr>
+            <w:tcW w:type="dxa" w:w="1440"/>
+            <w:shd w:val="clear" w:color="auto" w:fill="4472C4"/>
+          </w:tcPr>
+          <w:p>
+            <w:r>
+              <w:rPr>
+                <w:b/>
+                <w:color w:val="FFFFFF"/>
+                <w:sz w:val="16"/>
+              </w:rPr>
+              <w:t>Route</w:t>
+            </w:r>
+          </w:p>
+        </w:tc>
+        <w:tc>
+          <w:tcPr>
+            <w:tcW w:type="dxa" w:w="1440"/>
+            <w:shd w:val="clear" w:color="auto" w:fill="4472C4"/>
+          </w:tcPr>
+          <w:p>
+            <w:r>
+              <w:rPr>
+                <w:b/>
+                <w:color w:val="FFFFFF"/>
+                <w:sz w:val="16"/>
+              </w:rPr>
+              <w:t>Frequency</w:t>
+            </w:r>
+          </w:p>
+        </w:tc>
+        <w:tc>
+          <w:tcPr>
+            <w:tcW w:type="dxa" w:w="1440"/>
+            <w:shd w:val="clear" w:color="auto" w:fill="4472C4"/>
+          </w:tcPr>
+          <w:p>
+            <w:r>
+              <w:rPr>
+                <w:b/>
+                <w:color w:val="FFFFFF"/>
+                <w:sz w:val="16"/>
+              </w:rPr>
+              <w:t>Indication</w:t>
+            </w:r>
+          </w:p>
+        </w:tc>
+        <w:tc>
+          <w:tcPr>
+            <w:tcW w:type="dxa" w:w="1440"/>
+            <w:shd w:val="clear" w:color="auto" w:fill="4472C4"/>
+          </w:tcPr>
+          <w:p>
+            <w:r>
+              <w:rPr>
+                <w:b/>
+                <w:color w:val="FFFFFF"/>
+                <w:sz w:val="16"/>
+              </w:rPr>
+              <w:t>Inpatient status</w:t>
+            </w:r>
+          </w:p>
+        </w:tc>
+      </w:tr>
+      <w:tr>
+        <w:tc>
+          <w:tcPr>
+            <w:tcW w:type="dxa" w:w="1440"/>
+          </w:tcPr>
+          <w:p>
+            <w:r>
+              <w:rPr>
+                <w:color w:val="262B33"/>
+                <w:sz w:val="16"/>
+              </w:rPr>
+              <w:t>1</w:t>
+            </w:r>
+          </w:p>
+        </w:tc>
+        <w:tc>
+          <w:tcPr>
+            <w:tcW w:type="dxa" w:w="1440"/>
+          </w:tcPr>
+          <w:p>
+            <w:r>
+              <w:rPr>
+                <w:color w:val="262B33"/>
+                <w:sz w:val="16"/>
+              </w:rPr>
+              <w:t>Insulin glargine</w:t>
+            </w:r>
+          </w:p>
+        </w:tc>
+        <w:tc>
+          <w:tcPr>
+            <w:tcW w:type="dxa" w:w="1440"/>
+          </w:tcPr>
+          <w:p>
+            <w:r>
+              <w:rPr>
+                <w:color w:val="262B33"/>
+                <w:sz w:val="16"/>
+              </w:rPr>
+              <w:t>26 units</w:t>
+            </w:r>
+          </w:p>
+        </w:tc>
+        <w:tc>
+          <w:tcPr>
+            <w:tcW w:type="dxa" w:w="1440"/>
+          </w:tcPr>
+          <w:p>
+            <w:r>
+              <w:rPr>
+                <w:color w:val="262B33"/>
+                <w:sz w:val="16"/>
+              </w:rPr>
+              <w:t>Subcutaneous</w:t>
+            </w:r>
+          </w:p>
+        </w:tc>
+        <w:tc>
+          <w:tcPr>
+            <w:tcW w:type="dxa" w:w="1440"/>
+          </w:tcPr>
+          <w:p>
+            <w:r>
+              <w:rPr>
+                <w:color w:val="262B33"/>
+                <w:sz w:val="16"/>
+              </w:rPr>
+              <w:t>Nightly</w:t>
+            </w:r>
+          </w:p>
+        </w:tc>
+        <w:tc>
+          <w:tcPr>
+            <w:tcW w:type="dxa" w:w="1440"/>
           </w:tcPr>
           <w:p>
             <w:r>
@@ -857,7 +999,7 @@
         </w:tc>
         <w:tc>
           <w:tcPr>
-            <w:tcW w:type="dxa" w:w="3360"/>
+            <w:tcW w:type="dxa" w:w="1440"/>
           </w:tcPr>
           <w:p>
             <w:r>
@@ -873,21 +1015,77 @@
       <w:tr>
         <w:tc>
           <w:tcPr>
-            <w:tcW w:type="dxa" w:w="3360"/>
-          </w:tcPr>
-          <w:p>
-            <w:r>
-              <w:rPr>
-                <w:color w:val="262B33"/>
-                <w:sz w:val="16"/>
-              </w:rPr>
-              <w:t>Insulin aspart sliding scale subcutaneous three times daily with meals</w:t>
-            </w:r>
-          </w:p>
-        </w:tc>
-        <w:tc>
-          <w:tcPr>
-            <w:tcW w:type="dxa" w:w="3360"/>
+            <w:tcW w:type="dxa" w:w="1440"/>
+          </w:tcPr>
+          <w:p>
+            <w:r>
+              <w:rPr>
+                <w:color w:val="262B33"/>
+                <w:sz w:val="16"/>
+              </w:rPr>
+              <w:t>2</w:t>
+            </w:r>
+          </w:p>
+        </w:tc>
+        <w:tc>
+          <w:tcPr>
+            <w:tcW w:type="dxa" w:w="1440"/>
+          </w:tcPr>
+          <w:p>
+            <w:r>
+              <w:rPr>
+                <w:color w:val="262B33"/>
+                <w:sz w:val="16"/>
+              </w:rPr>
+              <w:t>Insulin aspart</w:t>
+            </w:r>
+          </w:p>
+        </w:tc>
+        <w:tc>
+          <w:tcPr>
+            <w:tcW w:type="dxa" w:w="1440"/>
+          </w:tcPr>
+          <w:p>
+            <w:r>
+              <w:rPr>
+                <w:color w:val="262B33"/>
+                <w:sz w:val="16"/>
+              </w:rPr>
+              <w:t>Sliding scale</w:t>
+            </w:r>
+          </w:p>
+        </w:tc>
+        <w:tc>
+          <w:tcPr>
+            <w:tcW w:type="dxa" w:w="1440"/>
+          </w:tcPr>
+          <w:p>
+            <w:r>
+              <w:rPr>
+                <w:color w:val="262B33"/>
+                <w:sz w:val="16"/>
+              </w:rPr>
+              <w:t>Subcutaneous</w:t>
+            </w:r>
+          </w:p>
+        </w:tc>
+        <w:tc>
+          <w:tcPr>
+            <w:tcW w:type="dxa" w:w="1440"/>
+          </w:tcPr>
+          <w:p>
+            <w:r>
+              <w:rPr>
+                <w:color w:val="262B33"/>
+                <w:sz w:val="16"/>
+              </w:rPr>
+              <w:t>Three times daily with meals</w:t>
+            </w:r>
+          </w:p>
+        </w:tc>
+        <w:tc>
+          <w:tcPr>
+            <w:tcW w:type="dxa" w:w="1440"/>
           </w:tcPr>
           <w:p>
             <w:r>
@@ -901,7 +1099,7 @@
         </w:tc>
         <w:tc>
           <w:tcPr>
-            <w:tcW w:type="dxa" w:w="3360"/>
+            <w:tcW w:type="dxa" w:w="1440"/>
           </w:tcPr>
           <w:p>
             <w:r>
@@ -917,21 +1115,77 @@
       <w:tr>
         <w:tc>
           <w:tcPr>
-            <w:tcW w:type="dxa" w:w="3360"/>
-          </w:tcPr>
-          <w:p>
-            <w:r>
-              <w:rPr>
-                <w:color w:val="262B33"/>
-                <w:sz w:val="16"/>
-              </w:rPr>
-              <w:t>Metformin 500 mg Oral twice daily</w:t>
-            </w:r>
-          </w:p>
-        </w:tc>
-        <w:tc>
-          <w:tcPr>
-            <w:tcW w:type="dxa" w:w="3360"/>
+            <w:tcW w:type="dxa" w:w="1440"/>
+          </w:tcPr>
+          <w:p>
+            <w:r>
+              <w:rPr>
+                <w:color w:val="262B33"/>
+                <w:sz w:val="16"/>
+              </w:rPr>
+              <w:t>3</w:t>
+            </w:r>
+          </w:p>
+        </w:tc>
+        <w:tc>
+          <w:tcPr>
+            <w:tcW w:type="dxa" w:w="1440"/>
+          </w:tcPr>
+          <w:p>
+            <w:r>
+              <w:rPr>
+                <w:color w:val="262B33"/>
+                <w:sz w:val="16"/>
+              </w:rPr>
+              <w:t>Metformin</w:t>
+            </w:r>
+          </w:p>
+        </w:tc>
+        <w:tc>
+          <w:tcPr>
+            <w:tcW w:type="dxa" w:w="1440"/>
+          </w:tcPr>
+          <w:p>
+            <w:r>
+              <w:rPr>
+                <w:color w:val="262B33"/>
+                <w:sz w:val="16"/>
+              </w:rPr>
+              <w:t>500 mg</w:t>
+            </w:r>
+          </w:p>
+        </w:tc>
+        <w:tc>
+          <w:tcPr>
+            <w:tcW w:type="dxa" w:w="1440"/>
+          </w:tcPr>
+          <w:p>
+            <w:r>
+              <w:rPr>
+                <w:color w:val="262B33"/>
+                <w:sz w:val="16"/>
+              </w:rPr>
+              <w:t>Oral</w:t>
+            </w:r>
+          </w:p>
+        </w:tc>
+        <w:tc>
+          <w:tcPr>
+            <w:tcW w:type="dxa" w:w="1440"/>
+          </w:tcPr>
+          <w:p>
+            <w:r>
+              <w:rPr>
+                <w:color w:val="262B33"/>
+                <w:sz w:val="16"/>
+              </w:rPr>
+              <w:t>Twice daily</w:t>
+            </w:r>
+          </w:p>
+        </w:tc>
+        <w:tc>
+          <w:tcPr>
+            <w:tcW w:type="dxa" w:w="1440"/>
           </w:tcPr>
           <w:p>
             <w:r>
@@ -945,7 +1199,7 @@
         </w:tc>
         <w:tc>
           <w:tcPr>
-            <w:tcW w:type="dxa" w:w="3360"/>
+            <w:tcW w:type="dxa" w:w="1440"/>
           </w:tcPr>
           <w:p>
             <w:r>
@@ -961,21 +1215,77 @@
       <w:tr>
         <w:tc>
           <w:tcPr>
-            <w:tcW w:type="dxa" w:w="3360"/>
-          </w:tcPr>
-          <w:p>
-            <w:r>
-              <w:rPr>
-                <w:color w:val="262B33"/>
-                <w:sz w:val="16"/>
-              </w:rPr>
-              <w:t>Empagliflozin 10 mg Oral daily</w:t>
-            </w:r>
-          </w:p>
-        </w:tc>
-        <w:tc>
-          <w:tcPr>
-            <w:tcW w:type="dxa" w:w="3360"/>
+            <w:tcW w:type="dxa" w:w="1440"/>
+          </w:tcPr>
+          <w:p>
+            <w:r>
+              <w:rPr>
+                <w:color w:val="262B33"/>
+                <w:sz w:val="16"/>
+              </w:rPr>
+              <w:t>4</w:t>
+            </w:r>
+          </w:p>
+        </w:tc>
+        <w:tc>
+          <w:tcPr>
+            <w:tcW w:type="dxa" w:w="1440"/>
+          </w:tcPr>
+          <w:p>
+            <w:r>
+              <w:rPr>
+                <w:color w:val="262B33"/>
+                <w:sz w:val="16"/>
+              </w:rPr>
+              <w:t>Empagliflozin</w:t>
+            </w:r>
+          </w:p>
+        </w:tc>
+        <w:tc>
+          <w:tcPr>
+            <w:tcW w:type="dxa" w:w="1440"/>
+          </w:tcPr>
+          <w:p>
+            <w:r>
+              <w:rPr>
+                <w:color w:val="262B33"/>
+                <w:sz w:val="16"/>
+              </w:rPr>
+              <w:t>10 mg</w:t>
+            </w:r>
+          </w:p>
+        </w:tc>
+        <w:tc>
+          <w:tcPr>
+            <w:tcW w:type="dxa" w:w="1440"/>
+          </w:tcPr>
+          <w:p>
+            <w:r>
+              <w:rPr>
+                <w:color w:val="262B33"/>
+                <w:sz w:val="16"/>
+              </w:rPr>
+              <w:t>Oral</w:t>
+            </w:r>
+          </w:p>
+        </w:tc>
+        <w:tc>
+          <w:tcPr>
+            <w:tcW w:type="dxa" w:w="1440"/>
+          </w:tcPr>
+          <w:p>
+            <w:r>
+              <w:rPr>
+                <w:color w:val="262B33"/>
+                <w:sz w:val="16"/>
+              </w:rPr>
+              <w:t>Daily</w:t>
+            </w:r>
+          </w:p>
+        </w:tc>
+        <w:tc>
+          <w:tcPr>
+            <w:tcW w:type="dxa" w:w="1440"/>
           </w:tcPr>
           <w:p>
             <w:r>
@@ -989,7 +1299,7 @@
         </w:tc>
         <w:tc>
           <w:tcPr>
-            <w:tcW w:type="dxa" w:w="3360"/>
+            <w:tcW w:type="dxa" w:w="1440"/>
           </w:tcPr>
           <w:p>
             <w:r>
@@ -1005,21 +1315,77 @@
       <w:tr>
         <w:tc>
           <w:tcPr>
-            <w:tcW w:type="dxa" w:w="3360"/>
-          </w:tcPr>
-          <w:p>
-            <w:r>
-              <w:rPr>
-                <w:color w:val="262B33"/>
-                <w:sz w:val="16"/>
-              </w:rPr>
-              <w:t>Lisinopril 20 mg Oral daily</w:t>
-            </w:r>
-          </w:p>
-        </w:tc>
-        <w:tc>
-          <w:tcPr>
-            <w:tcW w:type="dxa" w:w="3360"/>
+            <w:tcW w:type="dxa" w:w="1440"/>
+          </w:tcPr>
+          <w:p>
+            <w:r>
+              <w:rPr>
+                <w:color w:val="262B33"/>
+                <w:sz w:val="16"/>
+              </w:rPr>
+              <w:t>5</w:t>
+            </w:r>
+          </w:p>
+        </w:tc>
+        <w:tc>
+          <w:tcPr>
+            <w:tcW w:type="dxa" w:w="1440"/>
+          </w:tcPr>
+          <w:p>
+            <w:r>
+              <w:rPr>
+                <w:color w:val="262B33"/>
+                <w:sz w:val="16"/>
+              </w:rPr>
+              <w:t>Lisinopril</w:t>
+            </w:r>
+          </w:p>
+        </w:tc>
+        <w:tc>
+          <w:tcPr>
+            <w:tcW w:type="dxa" w:w="1440"/>
+          </w:tcPr>
+          <w:p>
+            <w:r>
+              <w:rPr>
+                <w:color w:val="262B33"/>
+                <w:sz w:val="16"/>
+              </w:rPr>
+              <w:t>20 mg</w:t>
+            </w:r>
+          </w:p>
+        </w:tc>
+        <w:tc>
+          <w:tcPr>
+            <w:tcW w:type="dxa" w:w="1440"/>
+          </w:tcPr>
+          <w:p>
+            <w:r>
+              <w:rPr>
+                <w:color w:val="262B33"/>
+                <w:sz w:val="16"/>
+              </w:rPr>
+              <w:t>Oral</w:t>
+            </w:r>
+          </w:p>
+        </w:tc>
+        <w:tc>
+          <w:tcPr>
+            <w:tcW w:type="dxa" w:w="1440"/>
+          </w:tcPr>
+          <w:p>
+            <w:r>
+              <w:rPr>
+                <w:color w:val="262B33"/>
+                <w:sz w:val="16"/>
+              </w:rPr>
+              <w:t>Daily</w:t>
+            </w:r>
+          </w:p>
+        </w:tc>
+        <w:tc>
+          <w:tcPr>
+            <w:tcW w:type="dxa" w:w="1440"/>
           </w:tcPr>
           <w:p>
             <w:r>
@@ -1033,7 +1399,7 @@
         </w:tc>
         <w:tc>
           <w:tcPr>
-            <w:tcW w:type="dxa" w:w="3360"/>
+            <w:tcW w:type="dxa" w:w="1440"/>
           </w:tcPr>
           <w:p>
             <w:r>
@@ -1049,21 +1415,77 @@
       <w:tr>
         <w:tc>
           <w:tcPr>
-            <w:tcW w:type="dxa" w:w="3360"/>
-          </w:tcPr>
-          <w:p>
-            <w:r>
-              <w:rPr>
-                <w:color w:val="262B33"/>
-                <w:sz w:val="16"/>
-              </w:rPr>
-              <w:t>Furosemide 20 mg Oral daily</w:t>
-            </w:r>
-          </w:p>
-        </w:tc>
-        <w:tc>
-          <w:tcPr>
-            <w:tcW w:type="dxa" w:w="3360"/>
+            <w:tcW w:type="dxa" w:w="1440"/>
+          </w:tcPr>
+          <w:p>
+            <w:r>
+              <w:rPr>
+                <w:color w:val="262B33"/>
+                <w:sz w:val="16"/>
+              </w:rPr>
+              <w:t>6</w:t>
+            </w:r>
+          </w:p>
+        </w:tc>
+        <w:tc>
+          <w:tcPr>
+            <w:tcW w:type="dxa" w:w="1440"/>
+          </w:tcPr>
+          <w:p>
+            <w:r>
+              <w:rPr>
+                <w:color w:val="262B33"/>
+                <w:sz w:val="16"/>
+              </w:rPr>
+              <w:t>Furosemide</w:t>
+            </w:r>
+          </w:p>
+        </w:tc>
+        <w:tc>
+          <w:tcPr>
+            <w:tcW w:type="dxa" w:w="1440"/>
+          </w:tcPr>
+          <w:p>
+            <w:r>
+              <w:rPr>
+                <w:color w:val="262B33"/>
+                <w:sz w:val="16"/>
+              </w:rPr>
+              <w:t>20 mg</w:t>
+            </w:r>
+          </w:p>
+        </w:tc>
+        <w:tc>
+          <w:tcPr>
+            <w:tcW w:type="dxa" w:w="1440"/>
+          </w:tcPr>
+          <w:p>
+            <w:r>
+              <w:rPr>
+                <w:color w:val="262B33"/>
+                <w:sz w:val="16"/>
+              </w:rPr>
+              <w:t>Oral</w:t>
+            </w:r>
+          </w:p>
+        </w:tc>
+        <w:tc>
+          <w:tcPr>
+            <w:tcW w:type="dxa" w:w="1440"/>
+          </w:tcPr>
+          <w:p>
+            <w:r>
+              <w:rPr>
+                <w:color w:val="262B33"/>
+                <w:sz w:val="16"/>
+              </w:rPr>
+              <w:t>Daily</w:t>
+            </w:r>
+          </w:p>
+        </w:tc>
+        <w:tc>
+          <w:tcPr>
+            <w:tcW w:type="dxa" w:w="1440"/>
           </w:tcPr>
           <w:p>
             <w:r>
@@ -1077,7 +1499,7 @@
         </w:tc>
         <w:tc>
           <w:tcPr>
-            <w:tcW w:type="dxa" w:w="3360"/>
+            <w:tcW w:type="dxa" w:w="1440"/>
           </w:tcPr>
           <w:p>
             <w:r>
@@ -1093,21 +1515,77 @@
       <w:tr>
         <w:tc>
           <w:tcPr>
-            <w:tcW w:type="dxa" w:w="3360"/>
-          </w:tcPr>
-          <w:p>
-            <w:r>
-              <w:rPr>
-                <w:color w:val="262B33"/>
-                <w:sz w:val="16"/>
-              </w:rPr>
-              <w:t>Atorvastatin 40 mg Oral nightly</w:t>
-            </w:r>
-          </w:p>
-        </w:tc>
-        <w:tc>
-          <w:tcPr>
-            <w:tcW w:type="dxa" w:w="3360"/>
+            <w:tcW w:type="dxa" w:w="1440"/>
+          </w:tcPr>
+          <w:p>
+            <w:r>
+              <w:rPr>
+                <w:color w:val="262B33"/>
+                <w:sz w:val="16"/>
+              </w:rPr>
+              <w:t>7</w:t>
+            </w:r>
+          </w:p>
+        </w:tc>
+        <w:tc>
+          <w:tcPr>
+            <w:tcW w:type="dxa" w:w="1440"/>
+          </w:tcPr>
+          <w:p>
+            <w:r>
+              <w:rPr>
+                <w:color w:val="262B33"/>
+                <w:sz w:val="16"/>
+              </w:rPr>
+              <w:t>Atorvastatin</w:t>
+            </w:r>
+          </w:p>
+        </w:tc>
+        <w:tc>
+          <w:tcPr>
+            <w:tcW w:type="dxa" w:w="1440"/>
+          </w:tcPr>
+          <w:p>
+            <w:r>
+              <w:rPr>
+                <w:color w:val="262B33"/>
+                <w:sz w:val="16"/>
+              </w:rPr>
+              <w:t>40 mg</w:t>
+            </w:r>
+          </w:p>
+        </w:tc>
+        <w:tc>
+          <w:tcPr>
+            <w:tcW w:type="dxa" w:w="1440"/>
+          </w:tcPr>
+          <w:p>
+            <w:r>
+              <w:rPr>
+                <w:color w:val="262B33"/>
+                <w:sz w:val="16"/>
+              </w:rPr>
+              <w:t>Oral</w:t>
+            </w:r>
+          </w:p>
+        </w:tc>
+        <w:tc>
+          <w:tcPr>
+            <w:tcW w:type="dxa" w:w="1440"/>
+          </w:tcPr>
+          <w:p>
+            <w:r>
+              <w:rPr>
+                <w:color w:val="262B33"/>
+                <w:sz w:val="16"/>
+              </w:rPr>
+              <w:t>Nightly</w:t>
+            </w:r>
+          </w:p>
+        </w:tc>
+        <w:tc>
+          <w:tcPr>
+            <w:tcW w:type="dxa" w:w="1440"/>
           </w:tcPr>
           <w:p>
             <w:r>
@@ -1121,7 +1599,7 @@
         </w:tc>
         <w:tc>
           <w:tcPr>
-            <w:tcW w:type="dxa" w:w="3360"/>
+            <w:tcW w:type="dxa" w:w="1440"/>
           </w:tcPr>
           <w:p>
             <w:r>
@@ -1137,21 +1615,77 @@
       <w:tr>
         <w:tc>
           <w:tcPr>
-            <w:tcW w:type="dxa" w:w="3360"/>
-          </w:tcPr>
-          <w:p>
-            <w:r>
-              <w:rPr>
-                <w:color w:val="262B33"/>
-                <w:sz w:val="16"/>
-              </w:rPr>
-              <w:t>Aspirin 81 mg Oral daily</w:t>
-            </w:r>
-          </w:p>
-        </w:tc>
-        <w:tc>
-          <w:tcPr>
-            <w:tcW w:type="dxa" w:w="3360"/>
+            <w:tcW w:type="dxa" w:w="1440"/>
+          </w:tcPr>
+          <w:p>
+            <w:r>
+              <w:rPr>
+                <w:color w:val="262B33"/>
+                <w:sz w:val="16"/>
+              </w:rPr>
+              <w:t>8</w:t>
+            </w:r>
+          </w:p>
+        </w:tc>
+        <w:tc>
+          <w:tcPr>
+            <w:tcW w:type="dxa" w:w="1440"/>
+          </w:tcPr>
+          <w:p>
+            <w:r>
+              <w:rPr>
+                <w:color w:val="262B33"/>
+                <w:sz w:val="16"/>
+              </w:rPr>
+              <w:t>Aspirin</w:t>
+            </w:r>
+          </w:p>
+        </w:tc>
+        <w:tc>
+          <w:tcPr>
+            <w:tcW w:type="dxa" w:w="1440"/>
+          </w:tcPr>
+          <w:p>
+            <w:r>
+              <w:rPr>
+                <w:color w:val="262B33"/>
+                <w:sz w:val="16"/>
+              </w:rPr>
+              <w:t>81 mg</w:t>
+            </w:r>
+          </w:p>
+        </w:tc>
+        <w:tc>
+          <w:tcPr>
+            <w:tcW w:type="dxa" w:w="1440"/>
+          </w:tcPr>
+          <w:p>
+            <w:r>
+              <w:rPr>
+                <w:color w:val="262B33"/>
+                <w:sz w:val="16"/>
+              </w:rPr>
+              <w:t>Oral</w:t>
+            </w:r>
+          </w:p>
+        </w:tc>
+        <w:tc>
+          <w:tcPr>
+            <w:tcW w:type="dxa" w:w="1440"/>
+          </w:tcPr>
+          <w:p>
+            <w:r>
+              <w:rPr>
+                <w:color w:val="262B33"/>
+                <w:sz w:val="16"/>
+              </w:rPr>
+              <w:t>Daily</w:t>
+            </w:r>
+          </w:p>
+        </w:tc>
+        <w:tc>
+          <w:tcPr>
+            <w:tcW w:type="dxa" w:w="1440"/>
           </w:tcPr>
           <w:p>
             <w:r>
@@ -1165,7 +1699,7 @@
         </w:tc>
         <w:tc>
           <w:tcPr>
-            <w:tcW w:type="dxa" w:w="3360"/>
+            <w:tcW w:type="dxa" w:w="1440"/>
           </w:tcPr>
           <w:p>
             <w:r>
@@ -1181,21 +1715,77 @@
       <w:tr>
         <w:tc>
           <w:tcPr>
-            <w:tcW w:type="dxa" w:w="3360"/>
-          </w:tcPr>
-          <w:p>
-            <w:r>
-              <w:rPr>
-                <w:color w:val="262B33"/>
-                <w:sz w:val="16"/>
-              </w:rPr>
-              <w:t>Clopidogrel 75 mg Oral daily</w:t>
-            </w:r>
-          </w:p>
-        </w:tc>
-        <w:tc>
-          <w:tcPr>
-            <w:tcW w:type="dxa" w:w="3360"/>
+            <w:tcW w:type="dxa" w:w="1440"/>
+          </w:tcPr>
+          <w:p>
+            <w:r>
+              <w:rPr>
+                <w:color w:val="262B33"/>
+                <w:sz w:val="16"/>
+              </w:rPr>
+              <w:t>9</w:t>
+            </w:r>
+          </w:p>
+        </w:tc>
+        <w:tc>
+          <w:tcPr>
+            <w:tcW w:type="dxa" w:w="1440"/>
+          </w:tcPr>
+          <w:p>
+            <w:r>
+              <w:rPr>
+                <w:color w:val="262B33"/>
+                <w:sz w:val="16"/>
+              </w:rPr>
+              <w:t>Clopidogrel</w:t>
+            </w:r>
+          </w:p>
+        </w:tc>
+        <w:tc>
+          <w:tcPr>
+            <w:tcW w:type="dxa" w:w="1440"/>
+          </w:tcPr>
+          <w:p>
+            <w:r>
+              <w:rPr>
+                <w:color w:val="262B33"/>
+                <w:sz w:val="16"/>
+              </w:rPr>
+              <w:t>75 mg</w:t>
+            </w:r>
+          </w:p>
+        </w:tc>
+        <w:tc>
+          <w:tcPr>
+            <w:tcW w:type="dxa" w:w="1440"/>
+          </w:tcPr>
+          <w:p>
+            <w:r>
+              <w:rPr>
+                <w:color w:val="262B33"/>
+                <w:sz w:val="16"/>
+              </w:rPr>
+              <w:t>Oral</w:t>
+            </w:r>
+          </w:p>
+        </w:tc>
+        <w:tc>
+          <w:tcPr>
+            <w:tcW w:type="dxa" w:w="1440"/>
+          </w:tcPr>
+          <w:p>
+            <w:r>
+              <w:rPr>
+                <w:color w:val="262B33"/>
+                <w:sz w:val="16"/>
+              </w:rPr>
+              <w:t>Daily</w:t>
+            </w:r>
+          </w:p>
+        </w:tc>
+        <w:tc>
+          <w:tcPr>
+            <w:tcW w:type="dxa" w:w="1440"/>
           </w:tcPr>
           <w:p>
             <w:r>
@@ -1209,7 +1799,7 @@
         </w:tc>
         <w:tc>
           <w:tcPr>
-            <w:tcW w:type="dxa" w:w="3360"/>
+            <w:tcW w:type="dxa" w:w="1440"/>
           </w:tcPr>
           <w:p>
             <w:r>
@@ -1225,21 +1815,77 @@
       <w:tr>
         <w:tc>
           <w:tcPr>
-            <w:tcW w:type="dxa" w:w="3360"/>
-          </w:tcPr>
-          <w:p>
-            <w:r>
-              <w:rPr>
-                <w:color w:val="262B33"/>
-                <w:sz w:val="16"/>
-              </w:rPr>
-              <w:t>Gabapentin 300 mg Oral three times daily</w:t>
-            </w:r>
-          </w:p>
-        </w:tc>
-        <w:tc>
-          <w:tcPr>
-            <w:tcW w:type="dxa" w:w="3360"/>
+            <w:tcW w:type="dxa" w:w="1440"/>
+          </w:tcPr>
+          <w:p>
+            <w:r>
+              <w:rPr>
+                <w:color w:val="262B33"/>
+                <w:sz w:val="16"/>
+              </w:rPr>
+              <w:t>10</w:t>
+            </w:r>
+          </w:p>
+        </w:tc>
+        <w:tc>
+          <w:tcPr>
+            <w:tcW w:type="dxa" w:w="1440"/>
+          </w:tcPr>
+          <w:p>
+            <w:r>
+              <w:rPr>
+                <w:color w:val="262B33"/>
+                <w:sz w:val="16"/>
+              </w:rPr>
+              <w:t>Gabapentin</w:t>
+            </w:r>
+          </w:p>
+        </w:tc>
+        <w:tc>
+          <w:tcPr>
+            <w:tcW w:type="dxa" w:w="1440"/>
+          </w:tcPr>
+          <w:p>
+            <w:r>
+              <w:rPr>
+                <w:color w:val="262B33"/>
+                <w:sz w:val="16"/>
+              </w:rPr>
+              <w:t>300 mg</w:t>
+            </w:r>
+          </w:p>
+        </w:tc>
+        <w:tc>
+          <w:tcPr>
+            <w:tcW w:type="dxa" w:w="1440"/>
+          </w:tcPr>
+          <w:p>
+            <w:r>
+              <w:rPr>
+                <w:color w:val="262B33"/>
+                <w:sz w:val="16"/>
+              </w:rPr>
+              <w:t>Oral</w:t>
+            </w:r>
+          </w:p>
+        </w:tc>
+        <w:tc>
+          <w:tcPr>
+            <w:tcW w:type="dxa" w:w="1440"/>
+          </w:tcPr>
+          <w:p>
+            <w:r>
+              <w:rPr>
+                <w:color w:val="262B33"/>
+                <w:sz w:val="16"/>
+              </w:rPr>
+              <w:t>Three times daily</w:t>
+            </w:r>
+          </w:p>
+        </w:tc>
+        <w:tc>
+          <w:tcPr>
+            <w:tcW w:type="dxa" w:w="1440"/>
           </w:tcPr>
           <w:p>
             <w:r>
@@ -1253,7 +1899,7 @@
         </w:tc>
         <w:tc>
           <w:tcPr>
-            <w:tcW w:type="dxa" w:w="3360"/>
+            <w:tcW w:type="dxa" w:w="1440"/>
           </w:tcPr>
           <w:p>
             <w:r>
@@ -1269,21 +1915,77 @@
       <w:tr>
         <w:tc>
           <w:tcPr>
-            <w:tcW w:type="dxa" w:w="3360"/>
-          </w:tcPr>
-          <w:p>
-            <w:r>
-              <w:rPr>
-                <w:color w:val="262B33"/>
-                <w:sz w:val="16"/>
-              </w:rPr>
-              <w:t>Ferrous sulfate 325 mg Oral daily</w:t>
-            </w:r>
-          </w:p>
-        </w:tc>
-        <w:tc>
-          <w:tcPr>
-            <w:tcW w:type="dxa" w:w="3360"/>
+            <w:tcW w:type="dxa" w:w="1440"/>
+          </w:tcPr>
+          <w:p>
+            <w:r>
+              <w:rPr>
+                <w:color w:val="262B33"/>
+                <w:sz w:val="16"/>
+              </w:rPr>
+              <w:t>11</w:t>
+            </w:r>
+          </w:p>
+        </w:tc>
+        <w:tc>
+          <w:tcPr>
+            <w:tcW w:type="dxa" w:w="1440"/>
+          </w:tcPr>
+          <w:p>
+            <w:r>
+              <w:rPr>
+                <w:color w:val="262B33"/>
+                <w:sz w:val="16"/>
+              </w:rPr>
+              <w:t>Ferrous sulfate</w:t>
+            </w:r>
+          </w:p>
+        </w:tc>
+        <w:tc>
+          <w:tcPr>
+            <w:tcW w:type="dxa" w:w="1440"/>
+          </w:tcPr>
+          <w:p>
+            <w:r>
+              <w:rPr>
+                <w:color w:val="262B33"/>
+                <w:sz w:val="16"/>
+              </w:rPr>
+              <w:t>325 mg</w:t>
+            </w:r>
+          </w:p>
+        </w:tc>
+        <w:tc>
+          <w:tcPr>
+            <w:tcW w:type="dxa" w:w="1440"/>
+          </w:tcPr>
+          <w:p>
+            <w:r>
+              <w:rPr>
+                <w:color w:val="262B33"/>
+                <w:sz w:val="16"/>
+              </w:rPr>
+              <w:t>Oral</w:t>
+            </w:r>
+          </w:p>
+        </w:tc>
+        <w:tc>
+          <w:tcPr>
+            <w:tcW w:type="dxa" w:w="1440"/>
+          </w:tcPr>
+          <w:p>
+            <w:r>
+              <w:rPr>
+                <w:color w:val="262B33"/>
+                <w:sz w:val="16"/>
+              </w:rPr>
+              <w:t>Daily</w:t>
+            </w:r>
+          </w:p>
+        </w:tc>
+        <w:tc>
+          <w:tcPr>
+            <w:tcW w:type="dxa" w:w="1440"/>
           </w:tcPr>
           <w:p>
             <w:r>
@@ -1297,7 +1999,7 @@
         </w:tc>
         <w:tc>
           <w:tcPr>
-            <w:tcW w:type="dxa" w:w="3360"/>
+            <w:tcW w:type="dxa" w:w="1440"/>
           </w:tcPr>
           <w:p>
             <w:r>
@@ -1313,21 +2015,77 @@
       <w:tr>
         <w:tc>
           <w:tcPr>
-            <w:tcW w:type="dxa" w:w="3360"/>
-          </w:tcPr>
-          <w:p>
-            <w:r>
-              <w:rPr>
-                <w:color w:val="262B33"/>
-                <w:sz w:val="16"/>
-              </w:rPr>
-              <w:t>Cholecalciferol 2000 units Oral daily</w:t>
-            </w:r>
-          </w:p>
-        </w:tc>
-        <w:tc>
-          <w:tcPr>
-            <w:tcW w:type="dxa" w:w="3360"/>
+            <w:tcW w:type="dxa" w:w="1440"/>
+          </w:tcPr>
+          <w:p>
+            <w:r>
+              <w:rPr>
+                <w:color w:val="262B33"/>
+                <w:sz w:val="16"/>
+              </w:rPr>
+              <w:t>12</w:t>
+            </w:r>
+          </w:p>
+        </w:tc>
+        <w:tc>
+          <w:tcPr>
+            <w:tcW w:type="dxa" w:w="1440"/>
+          </w:tcPr>
+          <w:p>
+            <w:r>
+              <w:rPr>
+                <w:color w:val="262B33"/>
+                <w:sz w:val="16"/>
+              </w:rPr>
+              <w:t>Cholecalciferol</w:t>
+            </w:r>
+          </w:p>
+        </w:tc>
+        <w:tc>
+          <w:tcPr>
+            <w:tcW w:type="dxa" w:w="1440"/>
+          </w:tcPr>
+          <w:p>
+            <w:r>
+              <w:rPr>
+                <w:color w:val="262B33"/>
+                <w:sz w:val="16"/>
+              </w:rPr>
+              <w:t>2000 units</w:t>
+            </w:r>
+          </w:p>
+        </w:tc>
+        <w:tc>
+          <w:tcPr>
+            <w:tcW w:type="dxa" w:w="1440"/>
+          </w:tcPr>
+          <w:p>
+            <w:r>
+              <w:rPr>
+                <w:color w:val="262B33"/>
+                <w:sz w:val="16"/>
+              </w:rPr>
+              <w:t>Oral</w:t>
+            </w:r>
+          </w:p>
+        </w:tc>
+        <w:tc>
+          <w:tcPr>
+            <w:tcW w:type="dxa" w:w="1440"/>
+          </w:tcPr>
+          <w:p>
+            <w:r>
+              <w:rPr>
+                <w:color w:val="262B33"/>
+                <w:sz w:val="16"/>
+              </w:rPr>
+              <w:t>Daily</w:t>
+            </w:r>
+          </w:p>
+        </w:tc>
+        <w:tc>
+          <w:tcPr>
+            <w:tcW w:type="dxa" w:w="1440"/>
           </w:tcPr>
           <w:p>
             <w:r>
@@ -1341,7 +2099,7 @@
         </w:tc>
         <w:tc>
           <w:tcPr>
-            <w:tcW w:type="dxa" w:w="3360"/>
+            <w:tcW w:type="dxa" w:w="1440"/>
           </w:tcPr>
           <w:p>
             <w:r>
@@ -1357,21 +2115,77 @@
       <w:tr>
         <w:tc>
           <w:tcPr>
-            <w:tcW w:type="dxa" w:w="3360"/>
-          </w:tcPr>
-          <w:p>
-            <w:r>
-              <w:rPr>
-                <w:color w:val="262B33"/>
-                <w:sz w:val="16"/>
-              </w:rPr>
-              <w:t>Pantoprazole 40 mg Oral daily</w:t>
-            </w:r>
-          </w:p>
-        </w:tc>
-        <w:tc>
-          <w:tcPr>
-            <w:tcW w:type="dxa" w:w="3360"/>
+            <w:tcW w:type="dxa" w:w="1440"/>
+          </w:tcPr>
+          <w:p>
+            <w:r>
+              <w:rPr>
+                <w:color w:val="262B33"/>
+                <w:sz w:val="16"/>
+              </w:rPr>
+              <w:t>13</w:t>
+            </w:r>
+          </w:p>
+        </w:tc>
+        <w:tc>
+          <w:tcPr>
+            <w:tcW w:type="dxa" w:w="1440"/>
+          </w:tcPr>
+          <w:p>
+            <w:r>
+              <w:rPr>
+                <w:color w:val="262B33"/>
+                <w:sz w:val="16"/>
+              </w:rPr>
+              <w:t>Pantoprazole</w:t>
+            </w:r>
+          </w:p>
+        </w:tc>
+        <w:tc>
+          <w:tcPr>
+            <w:tcW w:type="dxa" w:w="1440"/>
+          </w:tcPr>
+          <w:p>
+            <w:r>
+              <w:rPr>
+                <w:color w:val="262B33"/>
+                <w:sz w:val="16"/>
+              </w:rPr>
+              <w:t>40 mg</w:t>
+            </w:r>
+          </w:p>
+        </w:tc>
+        <w:tc>
+          <w:tcPr>
+            <w:tcW w:type="dxa" w:w="1440"/>
+          </w:tcPr>
+          <w:p>
+            <w:r>
+              <w:rPr>
+                <w:color w:val="262B33"/>
+                <w:sz w:val="16"/>
+              </w:rPr>
+              <w:t>Oral</w:t>
+            </w:r>
+          </w:p>
+        </w:tc>
+        <w:tc>
+          <w:tcPr>
+            <w:tcW w:type="dxa" w:w="1440"/>
+          </w:tcPr>
+          <w:p>
+            <w:r>
+              <w:rPr>
+                <w:color w:val="262B33"/>
+                <w:sz w:val="16"/>
+              </w:rPr>
+              <w:t>Daily</w:t>
+            </w:r>
+          </w:p>
+        </w:tc>
+        <w:tc>
+          <w:tcPr>
+            <w:tcW w:type="dxa" w:w="1440"/>
           </w:tcPr>
           <w:p>
             <w:r>
@@ -1385,7 +2199,7 @@
         </w:tc>
         <w:tc>
           <w:tcPr>
-            <w:tcW w:type="dxa" w:w="3360"/>
+            <w:tcW w:type="dxa" w:w="1440"/>
           </w:tcPr>
           <w:p>
             <w:r>
@@ -1401,21 +2215,77 @@
       <w:tr>
         <w:tc>
           <w:tcPr>
-            <w:tcW w:type="dxa" w:w="3360"/>
-          </w:tcPr>
-          <w:p>
-            <w:r>
-              <w:rPr>
-                <w:color w:val="262B33"/>
-                <w:sz w:val="16"/>
-              </w:rPr>
-              <w:t>Acetaminophen 650 mg Oral three times daily as needed</w:t>
-            </w:r>
-          </w:p>
-        </w:tc>
-        <w:tc>
-          <w:tcPr>
-            <w:tcW w:type="dxa" w:w="3360"/>
+            <w:tcW w:type="dxa" w:w="1440"/>
+          </w:tcPr>
+          <w:p>
+            <w:r>
+              <w:rPr>
+                <w:color w:val="262B33"/>
+                <w:sz w:val="16"/>
+              </w:rPr>
+              <w:t>14</w:t>
+            </w:r>
+          </w:p>
+        </w:tc>
+        <w:tc>
+          <w:tcPr>
+            <w:tcW w:type="dxa" w:w="1440"/>
+          </w:tcPr>
+          <w:p>
+            <w:r>
+              <w:rPr>
+                <w:color w:val="262B33"/>
+                <w:sz w:val="16"/>
+              </w:rPr>
+              <w:t>Acetaminophen</w:t>
+            </w:r>
+          </w:p>
+        </w:tc>
+        <w:tc>
+          <w:tcPr>
+            <w:tcW w:type="dxa" w:w="1440"/>
+          </w:tcPr>
+          <w:p>
+            <w:r>
+              <w:rPr>
+                <w:color w:val="262B33"/>
+                <w:sz w:val="16"/>
+              </w:rPr>
+              <w:t>650 mg</w:t>
+            </w:r>
+          </w:p>
+        </w:tc>
+        <w:tc>
+          <w:tcPr>
+            <w:tcW w:type="dxa" w:w="1440"/>
+          </w:tcPr>
+          <w:p>
+            <w:r>
+              <w:rPr>
+                <w:color w:val="262B33"/>
+                <w:sz w:val="16"/>
+              </w:rPr>
+              <w:t>Oral</w:t>
+            </w:r>
+          </w:p>
+        </w:tc>
+        <w:tc>
+          <w:tcPr>
+            <w:tcW w:type="dxa" w:w="1440"/>
+          </w:tcPr>
+          <w:p>
+            <w:r>
+              <w:rPr>
+                <w:color w:val="262B33"/>
+                <w:sz w:val="16"/>
+              </w:rPr>
+              <w:t>Three times daily as needed</w:t>
+            </w:r>
+          </w:p>
+        </w:tc>
+        <w:tc>
+          <w:tcPr>
+            <w:tcW w:type="dxa" w:w="1440"/>
           </w:tcPr>
           <w:p>
             <w:r>
@@ -1429,7 +2299,7 @@
         </w:tc>
         <w:tc>
           <w:tcPr>
-            <w:tcW w:type="dxa" w:w="3360"/>
+            <w:tcW w:type="dxa" w:w="1440"/>
           </w:tcPr>
           <w:p>
             <w:r>
@@ -1445,21 +2315,77 @@
       <w:tr>
         <w:tc>
           <w:tcPr>
-            <w:tcW w:type="dxa" w:w="3360"/>
-          </w:tcPr>
-          <w:p>
-            <w:r>
-              <w:rPr>
-                <w:color w:val="262B33"/>
-                <w:sz w:val="16"/>
-              </w:rPr>
-              <w:t>CPAP nightly</w:t>
-            </w:r>
-          </w:p>
-        </w:tc>
-        <w:tc>
-          <w:tcPr>
-            <w:tcW w:type="dxa" w:w="3360"/>
+            <w:tcW w:type="dxa" w:w="1440"/>
+          </w:tcPr>
+          <w:p>
+            <w:r>
+              <w:rPr>
+                <w:color w:val="262B33"/>
+                <w:sz w:val="16"/>
+              </w:rPr>
+              <w:t>15</w:t>
+            </w:r>
+          </w:p>
+        </w:tc>
+        <w:tc>
+          <w:tcPr>
+            <w:tcW w:type="dxa" w:w="1440"/>
+          </w:tcPr>
+          <w:p>
+            <w:r>
+              <w:rPr>
+                <w:color w:val="262B33"/>
+                <w:sz w:val="16"/>
+              </w:rPr>
+              <w:t>CPAP</w:t>
+            </w:r>
+          </w:p>
+        </w:tc>
+        <w:tc>
+          <w:tcPr>
+            <w:tcW w:type="dxa" w:w="1440"/>
+          </w:tcPr>
+          <w:p>
+            <w:r>
+              <w:rPr>
+                <w:color w:val="262B33"/>
+                <w:sz w:val="16"/>
+              </w:rPr>
+              <w:t>Device</w:t>
+            </w:r>
+          </w:p>
+        </w:tc>
+        <w:tc>
+          <w:tcPr>
+            <w:tcW w:type="dxa" w:w="1440"/>
+          </w:tcPr>
+          <w:p>
+            <w:r>
+              <w:rPr>
+                <w:color w:val="262B33"/>
+                <w:sz w:val="16"/>
+              </w:rPr>
+              <w:t>Mask</w:t>
+            </w:r>
+          </w:p>
+        </w:tc>
+        <w:tc>
+          <w:tcPr>
+            <w:tcW w:type="dxa" w:w="1440"/>
+          </w:tcPr>
+          <w:p>
+            <w:r>
+              <w:rPr>
+                <w:color w:val="262B33"/>
+                <w:sz w:val="16"/>
+              </w:rPr>
+              <w:t>Nightly</w:t>
+            </w:r>
+          </w:p>
+        </w:tc>
+        <w:tc>
+          <w:tcPr>
+            <w:tcW w:type="dxa" w:w="1440"/>
           </w:tcPr>
           <w:p>
             <w:r>
@@ -1473,7 +2399,7 @@
         </w:tc>
         <w:tc>
           <w:tcPr>
-            <w:tcW w:type="dxa" w:w="3360"/>
+            <w:tcW w:type="dxa" w:w="1440"/>
           </w:tcPr>
           <w:p>
             <w:r>
@@ -4054,6 +4980,7 @@
             </w:r>
             <w:r>
               <w:rPr>
+                <w:i/>
                 <w:color w:val="808080"/>
                 <w:sz w:val="16"/>
               </w:rPr>
@@ -11935,6 +12862,7 @@
             </w:r>
             <w:r>
               <w:rPr>
+                <w:i/>
                 <w:color w:val="808080"/>
                 <w:sz w:val="16"/>
               </w:rPr>

</xml_diff>

<commit_message>
auto-checkpoint: 12 paths (WORKSPACE_FILE_MAP.md, dashboard, worlds) 2026-06-13 05:38 UTC
</commit_message>
<xml_diff>
--- a/worlds/ondina-vasquell/submission/Alexander_World_Vasquell_latest_6_13.docx
+++ b/worlds/ondina-vasquell/submission/Alexander_World_Vasquell_latest_6_13.docx
@@ -8063,7 +8063,7 @@
           <w:color w:val="262B33"/>
           <w:sz w:val="16"/>
         </w:rPr>
-        <w:t>Files are designed after the tasks; each essential file exists because a task needs it for a correct answer. World-level files provide raw material, never an answer-key synthesis: there is no shared discharge summary, no final infectious-disease antibiotic plan, no final vascular recommendation, and no coding or CDI conclusion at world level. Severity-forward external surfaces (the coding worksheet, the CDI query, the payer denial, the concurrent-review request, the pharmacy rejection) are task-level so they cannot pre-answer their tasks. ID convention: EW for essential world-level, E1-T for essential task-level keyed to the task, WS for supplementary world-level. Filenames are lowercase with underscores and an MMDDYYYY stamp matching the milestones. Origin tokens: Custom Made for writer-drafted document templates, Writer Produced File for media that engineering does not convert. Media rows carry the final upload filename.</w:t>
+        <w:t>Files are designed after the tasks; each essential file exists because a task needs it for a correct answer. World-level files provide raw material, never an answer-key synthesis: there is no shared discharge summary, no final infectious-disease antibiotic plan, no final vascular recommendation, and no coding or CDI conclusion at world level. Severity-forward external surfaces (the coding worksheet, the CDI query, the payer denial, the concurrent-review request, the pharmacy rejection) are task-level so they cannot pre-answer their tasks. ID convention: EW for essential world-level, E1-T for essential task-level keyed to the task, WS for supplementary world-level. Filenames are lowercase with underscores and an MMDDYYYY stamp matching the milestones. Source is Custom Built by Writer for document rows and Writer Produced Media for image rows. Tool is DOCX Template for document rows and Writer Image Tool for image rows. Origin tokens: Custom Made for writer-drafted document templates, Writer Produced File for media that engineering does not convert. Media rows carry the final upload filename.</w:t>
       </w:r>
     </w:p>
     <w:p>
@@ -8088,18 +8088,19 @@
         </w:tblBorders>
       </w:tblPr>
       <w:tblGrid>
-        <w:gridCol w:w="1440"/>
-        <w:gridCol w:w="1440"/>
-        <w:gridCol w:w="1440"/>
-        <w:gridCol w:w="1440"/>
-        <w:gridCol w:w="1440"/>
-        <w:gridCol w:w="1440"/>
-        <w:gridCol w:w="1440"/>
+        <w:gridCol w:w="1260"/>
+        <w:gridCol w:w="1260"/>
+        <w:gridCol w:w="1260"/>
+        <w:gridCol w:w="1260"/>
+        <w:gridCol w:w="1260"/>
+        <w:gridCol w:w="1260"/>
+        <w:gridCol w:w="1260"/>
+        <w:gridCol w:w="1260"/>
       </w:tblGrid>
       <w:tr>
         <w:tc>
           <w:tcPr>
-            <w:tcW w:type="dxa" w:w="1440"/>
+            <w:tcW w:type="dxa" w:w="1260"/>
             <w:shd w:val="clear" w:color="auto" w:fill="4472C4"/>
           </w:tcPr>
           <w:p>
@@ -8115,7 +8116,7 @@
         </w:tc>
         <w:tc>
           <w:tcPr>
-            <w:tcW w:type="dxa" w:w="1440"/>
+            <w:tcW w:type="dxa" w:w="1260"/>
             <w:shd w:val="clear" w:color="auto" w:fill="4472C4"/>
           </w:tcPr>
           <w:p>
@@ -8131,7 +8132,7 @@
         </w:tc>
         <w:tc>
           <w:tcPr>
-            <w:tcW w:type="dxa" w:w="1440"/>
+            <w:tcW w:type="dxa" w:w="1260"/>
             <w:shd w:val="clear" w:color="auto" w:fill="4472C4"/>
           </w:tcPr>
           <w:p>
@@ -8147,7 +8148,7 @@
         </w:tc>
         <w:tc>
           <w:tcPr>
-            <w:tcW w:type="dxa" w:w="1440"/>
+            <w:tcW w:type="dxa" w:w="1260"/>
             <w:shd w:val="clear" w:color="auto" w:fill="4472C4"/>
           </w:tcPr>
           <w:p>
@@ -8157,13 +8158,13 @@
                 <w:color w:val="FFFFFF"/>
                 <w:sz w:val="16"/>
               </w:rPr>
-              <w:t>Date</w:t>
-            </w:r>
-          </w:p>
-        </w:tc>
-        <w:tc>
-          <w:tcPr>
-            <w:tcW w:type="dxa" w:w="1440"/>
+              <w:t>Source</w:t>
+            </w:r>
+          </w:p>
+        </w:tc>
+        <w:tc>
+          <w:tcPr>
+            <w:tcW w:type="dxa" w:w="1260"/>
             <w:shd w:val="clear" w:color="auto" w:fill="4472C4"/>
           </w:tcPr>
           <w:p>
@@ -8173,13 +8174,13 @@
                 <w:color w:val="FFFFFF"/>
                 <w:sz w:val="16"/>
               </w:rPr>
-              <w:t>Reference File Origin</w:t>
-            </w:r>
-          </w:p>
-        </w:tc>
-        <w:tc>
-          <w:tcPr>
-            <w:tcW w:type="dxa" w:w="1440"/>
+              <w:t>Tool</w:t>
+            </w:r>
+          </w:p>
+        </w:tc>
+        <w:tc>
+          <w:tcPr>
+            <w:tcW w:type="dxa" w:w="1260"/>
             <w:shd w:val="clear" w:color="auto" w:fill="4472C4"/>
           </w:tcPr>
           <w:p>
@@ -8189,13 +8190,13 @@
                 <w:color w:val="FFFFFF"/>
                 <w:sz w:val="16"/>
               </w:rPr>
-              <w:t>Description</w:t>
-            </w:r>
-          </w:p>
-        </w:tc>
-        <w:tc>
-          <w:tcPr>
-            <w:tcW w:type="dxa" w:w="1440"/>
+              <w:t>Reference File Origin</w:t>
+            </w:r>
+          </w:p>
+        </w:tc>
+        <w:tc>
+          <w:tcPr>
+            <w:tcW w:type="dxa" w:w="1260"/>
             <w:shd w:val="clear" w:color="auto" w:fill="4472C4"/>
           </w:tcPr>
           <w:p>
@@ -8205,6 +8206,22 @@
                 <w:color w:val="FFFFFF"/>
                 <w:sz w:val="16"/>
               </w:rPr>
+              <w:t>Description</w:t>
+            </w:r>
+          </w:p>
+        </w:tc>
+        <w:tc>
+          <w:tcPr>
+            <w:tcW w:type="dxa" w:w="1260"/>
+            <w:shd w:val="clear" w:color="auto" w:fill="4472C4"/>
+          </w:tcPr>
+          <w:p>
+            <w:r>
+              <w:rPr>
+                <w:b/>
+                <w:color w:val="FFFFFF"/>
+                <w:sz w:val="16"/>
+              </w:rPr>
               <w:t>Pearls, Traps, and Friction</w:t>
             </w:r>
           </w:p>
@@ -8213,7 +8230,7 @@
       <w:tr>
         <w:tc>
           <w:tcPr>
-            <w:tcW w:type="dxa" w:w="1440"/>
+            <w:tcW w:type="dxa" w:w="1260"/>
           </w:tcPr>
           <w:p>
             <w:r>
@@ -8227,7 +8244,7 @@
         </w:tc>
         <w:tc>
           <w:tcPr>
-            <w:tcW w:type="dxa" w:w="1440"/>
+            <w:tcW w:type="dxa" w:w="1260"/>
           </w:tcPr>
           <w:p>
             <w:r>
@@ -8241,7 +8258,7 @@
         </w:tc>
         <w:tc>
           <w:tcPr>
-            <w:tcW w:type="dxa" w:w="1440"/>
+            <w:tcW w:type="dxa" w:w="1260"/>
           </w:tcPr>
           <w:p>
             <w:r>
@@ -8255,21 +8272,35 @@
         </w:tc>
         <w:tc>
           <w:tcPr>
-            <w:tcW w:type="dxa" w:w="1440"/>
-          </w:tcPr>
-          <w:p>
-            <w:r>
-              <w:rPr>
-                <w:color w:val="262B33"/>
-                <w:sz w:val="16"/>
-              </w:rPr>
-              <w:t>05/16/2026</w:t>
-            </w:r>
-          </w:p>
-        </w:tc>
-        <w:tc>
-          <w:tcPr>
-            <w:tcW w:type="dxa" w:w="1440"/>
+            <w:tcW w:type="dxa" w:w="1260"/>
+          </w:tcPr>
+          <w:p>
+            <w:r>
+              <w:rPr>
+                <w:color w:val="262B33"/>
+                <w:sz w:val="16"/>
+              </w:rPr>
+              <w:t>Custom Built by Writer</w:t>
+            </w:r>
+          </w:p>
+        </w:tc>
+        <w:tc>
+          <w:tcPr>
+            <w:tcW w:type="dxa" w:w="1260"/>
+          </w:tcPr>
+          <w:p>
+            <w:r>
+              <w:rPr>
+                <w:color w:val="262B33"/>
+                <w:sz w:val="16"/>
+              </w:rPr>
+              <w:t>DOCX Template</w:t>
+            </w:r>
+          </w:p>
+        </w:tc>
+        <w:tc>
+          <w:tcPr>
+            <w:tcW w:type="dxa" w:w="1260"/>
           </w:tcPr>
           <w:p>
             <w:r>
@@ -8283,7 +8314,7 @@
         </w:tc>
         <w:tc>
           <w:tcPr>
-            <w:tcW w:type="dxa" w:w="1440"/>
+            <w:tcW w:type="dxa" w:w="1260"/>
           </w:tcPr>
           <w:p>
             <w:r>
@@ -8297,7 +8328,7 @@
         </w:tc>
         <w:tc>
           <w:tcPr>
-            <w:tcW w:type="dxa" w:w="1440"/>
+            <w:tcW w:type="dxa" w:w="1260"/>
           </w:tcPr>
           <w:p>
             <w:r>
@@ -8313,7 +8344,7 @@
       <w:tr>
         <w:tc>
           <w:tcPr>
-            <w:tcW w:type="dxa" w:w="1440"/>
+            <w:tcW w:type="dxa" w:w="1260"/>
           </w:tcPr>
           <w:p>
             <w:r>
@@ -8327,7 +8358,7 @@
         </w:tc>
         <w:tc>
           <w:tcPr>
-            <w:tcW w:type="dxa" w:w="1440"/>
+            <w:tcW w:type="dxa" w:w="1260"/>
           </w:tcPr>
           <w:p>
             <w:r>
@@ -8341,7 +8372,7 @@
         </w:tc>
         <w:tc>
           <w:tcPr>
-            <w:tcW w:type="dxa" w:w="1440"/>
+            <w:tcW w:type="dxa" w:w="1260"/>
           </w:tcPr>
           <w:p>
             <w:r>
@@ -8355,21 +8386,35 @@
         </w:tc>
         <w:tc>
           <w:tcPr>
-            <w:tcW w:type="dxa" w:w="1440"/>
-          </w:tcPr>
-          <w:p>
-            <w:r>
-              <w:rPr>
-                <w:color w:val="262B33"/>
-                <w:sz w:val="16"/>
-              </w:rPr>
-              <w:t>05/16/2026</w:t>
-            </w:r>
-          </w:p>
-        </w:tc>
-        <w:tc>
-          <w:tcPr>
-            <w:tcW w:type="dxa" w:w="1440"/>
+            <w:tcW w:type="dxa" w:w="1260"/>
+          </w:tcPr>
+          <w:p>
+            <w:r>
+              <w:rPr>
+                <w:color w:val="262B33"/>
+                <w:sz w:val="16"/>
+              </w:rPr>
+              <w:t>Custom Built by Writer</w:t>
+            </w:r>
+          </w:p>
+        </w:tc>
+        <w:tc>
+          <w:tcPr>
+            <w:tcW w:type="dxa" w:w="1260"/>
+          </w:tcPr>
+          <w:p>
+            <w:r>
+              <w:rPr>
+                <w:color w:val="262B33"/>
+                <w:sz w:val="16"/>
+              </w:rPr>
+              <w:t>DOCX Template</w:t>
+            </w:r>
+          </w:p>
+        </w:tc>
+        <w:tc>
+          <w:tcPr>
+            <w:tcW w:type="dxa" w:w="1260"/>
           </w:tcPr>
           <w:p>
             <w:r>
@@ -8383,7 +8428,7 @@
         </w:tc>
         <w:tc>
           <w:tcPr>
-            <w:tcW w:type="dxa" w:w="1440"/>
+            <w:tcW w:type="dxa" w:w="1260"/>
           </w:tcPr>
           <w:p>
             <w:r>
@@ -8397,7 +8442,7 @@
         </w:tc>
         <w:tc>
           <w:tcPr>
-            <w:tcW w:type="dxa" w:w="1440"/>
+            <w:tcW w:type="dxa" w:w="1260"/>
           </w:tcPr>
           <w:p>
             <w:r>
@@ -8413,7 +8458,7 @@
       <w:tr>
         <w:tc>
           <w:tcPr>
-            <w:tcW w:type="dxa" w:w="1440"/>
+            <w:tcW w:type="dxa" w:w="1260"/>
           </w:tcPr>
           <w:p>
             <w:r>
@@ -8427,7 +8472,7 @@
         </w:tc>
         <w:tc>
           <w:tcPr>
-            <w:tcW w:type="dxa" w:w="1440"/>
+            <w:tcW w:type="dxa" w:w="1260"/>
           </w:tcPr>
           <w:p>
             <w:r>
@@ -8441,7 +8486,7 @@
         </w:tc>
         <w:tc>
           <w:tcPr>
-            <w:tcW w:type="dxa" w:w="1440"/>
+            <w:tcW w:type="dxa" w:w="1260"/>
           </w:tcPr>
           <w:p>
             <w:r>
@@ -8455,21 +8500,35 @@
         </w:tc>
         <w:tc>
           <w:tcPr>
-            <w:tcW w:type="dxa" w:w="1440"/>
-          </w:tcPr>
-          <w:p>
-            <w:r>
-              <w:rPr>
-                <w:color w:val="262B33"/>
-                <w:sz w:val="16"/>
-              </w:rPr>
-              <w:t>05/17/2026</w:t>
-            </w:r>
-          </w:p>
-        </w:tc>
-        <w:tc>
-          <w:tcPr>
-            <w:tcW w:type="dxa" w:w="1440"/>
+            <w:tcW w:type="dxa" w:w="1260"/>
+          </w:tcPr>
+          <w:p>
+            <w:r>
+              <w:rPr>
+                <w:color w:val="262B33"/>
+                <w:sz w:val="16"/>
+              </w:rPr>
+              <w:t>Custom Built by Writer</w:t>
+            </w:r>
+          </w:p>
+        </w:tc>
+        <w:tc>
+          <w:tcPr>
+            <w:tcW w:type="dxa" w:w="1260"/>
+          </w:tcPr>
+          <w:p>
+            <w:r>
+              <w:rPr>
+                <w:color w:val="262B33"/>
+                <w:sz w:val="16"/>
+              </w:rPr>
+              <w:t>DOCX Template</w:t>
+            </w:r>
+          </w:p>
+        </w:tc>
+        <w:tc>
+          <w:tcPr>
+            <w:tcW w:type="dxa" w:w="1260"/>
           </w:tcPr>
           <w:p>
             <w:r>
@@ -8483,7 +8542,7 @@
         </w:tc>
         <w:tc>
           <w:tcPr>
-            <w:tcW w:type="dxa" w:w="1440"/>
+            <w:tcW w:type="dxa" w:w="1260"/>
           </w:tcPr>
           <w:p>
             <w:r>
@@ -8497,7 +8556,7 @@
         </w:tc>
         <w:tc>
           <w:tcPr>
-            <w:tcW w:type="dxa" w:w="1440"/>
+            <w:tcW w:type="dxa" w:w="1260"/>
           </w:tcPr>
           <w:p>
             <w:r>
@@ -8513,7 +8572,7 @@
       <w:tr>
         <w:tc>
           <w:tcPr>
-            <w:tcW w:type="dxa" w:w="1440"/>
+            <w:tcW w:type="dxa" w:w="1260"/>
           </w:tcPr>
           <w:p>
             <w:r>
@@ -8527,7 +8586,7 @@
         </w:tc>
         <w:tc>
           <w:tcPr>
-            <w:tcW w:type="dxa" w:w="1440"/>
+            <w:tcW w:type="dxa" w:w="1260"/>
           </w:tcPr>
           <w:p>
             <w:r>
@@ -8541,7 +8600,7 @@
         </w:tc>
         <w:tc>
           <w:tcPr>
-            <w:tcW w:type="dxa" w:w="1440"/>
+            <w:tcW w:type="dxa" w:w="1260"/>
           </w:tcPr>
           <w:p>
             <w:r>
@@ -8555,21 +8614,35 @@
         </w:tc>
         <w:tc>
           <w:tcPr>
-            <w:tcW w:type="dxa" w:w="1440"/>
-          </w:tcPr>
-          <w:p>
-            <w:r>
-              <w:rPr>
-                <w:color w:val="262B33"/>
-                <w:sz w:val="16"/>
-              </w:rPr>
-              <w:t>05/19/2026</w:t>
-            </w:r>
-          </w:p>
-        </w:tc>
-        <w:tc>
-          <w:tcPr>
-            <w:tcW w:type="dxa" w:w="1440"/>
+            <w:tcW w:type="dxa" w:w="1260"/>
+          </w:tcPr>
+          <w:p>
+            <w:r>
+              <w:rPr>
+                <w:color w:val="262B33"/>
+                <w:sz w:val="16"/>
+              </w:rPr>
+              <w:t>Custom Built by Writer</w:t>
+            </w:r>
+          </w:p>
+        </w:tc>
+        <w:tc>
+          <w:tcPr>
+            <w:tcW w:type="dxa" w:w="1260"/>
+          </w:tcPr>
+          <w:p>
+            <w:r>
+              <w:rPr>
+                <w:color w:val="262B33"/>
+                <w:sz w:val="16"/>
+              </w:rPr>
+              <w:t>DOCX Template</w:t>
+            </w:r>
+          </w:p>
+        </w:tc>
+        <w:tc>
+          <w:tcPr>
+            <w:tcW w:type="dxa" w:w="1260"/>
           </w:tcPr>
           <w:p>
             <w:r>
@@ -8583,7 +8656,7 @@
         </w:tc>
         <w:tc>
           <w:tcPr>
-            <w:tcW w:type="dxa" w:w="1440"/>
+            <w:tcW w:type="dxa" w:w="1260"/>
           </w:tcPr>
           <w:p>
             <w:r>
@@ -8597,7 +8670,7 @@
         </w:tc>
         <w:tc>
           <w:tcPr>
-            <w:tcW w:type="dxa" w:w="1440"/>
+            <w:tcW w:type="dxa" w:w="1260"/>
           </w:tcPr>
           <w:p>
             <w:r>
@@ -8613,7 +8686,7 @@
       <w:tr>
         <w:tc>
           <w:tcPr>
-            <w:tcW w:type="dxa" w:w="1440"/>
+            <w:tcW w:type="dxa" w:w="1260"/>
           </w:tcPr>
           <w:p>
             <w:r>
@@ -8627,7 +8700,7 @@
         </w:tc>
         <w:tc>
           <w:tcPr>
-            <w:tcW w:type="dxa" w:w="1440"/>
+            <w:tcW w:type="dxa" w:w="1260"/>
           </w:tcPr>
           <w:p>
             <w:r>
@@ -8641,7 +8714,7 @@
         </w:tc>
         <w:tc>
           <w:tcPr>
-            <w:tcW w:type="dxa" w:w="1440"/>
+            <w:tcW w:type="dxa" w:w="1260"/>
           </w:tcPr>
           <w:p>
             <w:r>
@@ -8655,21 +8728,35 @@
         </w:tc>
         <w:tc>
           <w:tcPr>
-            <w:tcW w:type="dxa" w:w="1440"/>
-          </w:tcPr>
-          <w:p>
-            <w:r>
-              <w:rPr>
-                <w:color w:val="262B33"/>
-                <w:sz w:val="16"/>
-              </w:rPr>
-              <w:t>05/21/2026</w:t>
-            </w:r>
-          </w:p>
-        </w:tc>
-        <w:tc>
-          <w:tcPr>
-            <w:tcW w:type="dxa" w:w="1440"/>
+            <w:tcW w:type="dxa" w:w="1260"/>
+          </w:tcPr>
+          <w:p>
+            <w:r>
+              <w:rPr>
+                <w:color w:val="262B33"/>
+                <w:sz w:val="16"/>
+              </w:rPr>
+              <w:t>Custom Built by Writer</w:t>
+            </w:r>
+          </w:p>
+        </w:tc>
+        <w:tc>
+          <w:tcPr>
+            <w:tcW w:type="dxa" w:w="1260"/>
+          </w:tcPr>
+          <w:p>
+            <w:r>
+              <w:rPr>
+                <w:color w:val="262B33"/>
+                <w:sz w:val="16"/>
+              </w:rPr>
+              <w:t>DOCX Template</w:t>
+            </w:r>
+          </w:p>
+        </w:tc>
+        <w:tc>
+          <w:tcPr>
+            <w:tcW w:type="dxa" w:w="1260"/>
           </w:tcPr>
           <w:p>
             <w:r>
@@ -8683,7 +8770,7 @@
         </w:tc>
         <w:tc>
           <w:tcPr>
-            <w:tcW w:type="dxa" w:w="1440"/>
+            <w:tcW w:type="dxa" w:w="1260"/>
           </w:tcPr>
           <w:p>
             <w:r>
@@ -8697,7 +8784,7 @@
         </w:tc>
         <w:tc>
           <w:tcPr>
-            <w:tcW w:type="dxa" w:w="1440"/>
+            <w:tcW w:type="dxa" w:w="1260"/>
           </w:tcPr>
           <w:p>
             <w:r>
@@ -8713,7 +8800,7 @@
       <w:tr>
         <w:tc>
           <w:tcPr>
-            <w:tcW w:type="dxa" w:w="1440"/>
+            <w:tcW w:type="dxa" w:w="1260"/>
           </w:tcPr>
           <w:p>
             <w:r>
@@ -8727,7 +8814,7 @@
         </w:tc>
         <w:tc>
           <w:tcPr>
-            <w:tcW w:type="dxa" w:w="1440"/>
+            <w:tcW w:type="dxa" w:w="1260"/>
           </w:tcPr>
           <w:p>
             <w:r>
@@ -8741,7 +8828,7 @@
         </w:tc>
         <w:tc>
           <w:tcPr>
-            <w:tcW w:type="dxa" w:w="1440"/>
+            <w:tcW w:type="dxa" w:w="1260"/>
           </w:tcPr>
           <w:p>
             <w:r>
@@ -8755,21 +8842,35 @@
         </w:tc>
         <w:tc>
           <w:tcPr>
-            <w:tcW w:type="dxa" w:w="1440"/>
-          </w:tcPr>
-          <w:p>
-            <w:r>
-              <w:rPr>
-                <w:color w:val="262B33"/>
-                <w:sz w:val="16"/>
-              </w:rPr>
-              <w:t>05/17/2026</w:t>
-            </w:r>
-          </w:p>
-        </w:tc>
-        <w:tc>
-          <w:tcPr>
-            <w:tcW w:type="dxa" w:w="1440"/>
+            <w:tcW w:type="dxa" w:w="1260"/>
+          </w:tcPr>
+          <w:p>
+            <w:r>
+              <w:rPr>
+                <w:color w:val="262B33"/>
+                <w:sz w:val="16"/>
+              </w:rPr>
+              <w:t>Custom Built by Writer</w:t>
+            </w:r>
+          </w:p>
+        </w:tc>
+        <w:tc>
+          <w:tcPr>
+            <w:tcW w:type="dxa" w:w="1260"/>
+          </w:tcPr>
+          <w:p>
+            <w:r>
+              <w:rPr>
+                <w:color w:val="262B33"/>
+                <w:sz w:val="16"/>
+              </w:rPr>
+              <w:t>DOCX Template</w:t>
+            </w:r>
+          </w:p>
+        </w:tc>
+        <w:tc>
+          <w:tcPr>
+            <w:tcW w:type="dxa" w:w="1260"/>
           </w:tcPr>
           <w:p>
             <w:r>
@@ -8783,7 +8884,7 @@
         </w:tc>
         <w:tc>
           <w:tcPr>
-            <w:tcW w:type="dxa" w:w="1440"/>
+            <w:tcW w:type="dxa" w:w="1260"/>
           </w:tcPr>
           <w:p>
             <w:r>
@@ -8797,7 +8898,7 @@
         </w:tc>
         <w:tc>
           <w:tcPr>
-            <w:tcW w:type="dxa" w:w="1440"/>
+            <w:tcW w:type="dxa" w:w="1260"/>
           </w:tcPr>
           <w:p>
             <w:r>
@@ -8813,7 +8914,7 @@
       <w:tr>
         <w:tc>
           <w:tcPr>
-            <w:tcW w:type="dxa" w:w="1440"/>
+            <w:tcW w:type="dxa" w:w="1260"/>
           </w:tcPr>
           <w:p>
             <w:r>
@@ -8827,7 +8928,7 @@
         </w:tc>
         <w:tc>
           <w:tcPr>
-            <w:tcW w:type="dxa" w:w="1440"/>
+            <w:tcW w:type="dxa" w:w="1260"/>
           </w:tcPr>
           <w:p>
             <w:r>
@@ -8841,7 +8942,7 @@
         </w:tc>
         <w:tc>
           <w:tcPr>
-            <w:tcW w:type="dxa" w:w="1440"/>
+            <w:tcW w:type="dxa" w:w="1260"/>
           </w:tcPr>
           <w:p>
             <w:r>
@@ -8855,21 +8956,35 @@
         </w:tc>
         <w:tc>
           <w:tcPr>
-            <w:tcW w:type="dxa" w:w="1440"/>
-          </w:tcPr>
-          <w:p>
-            <w:r>
-              <w:rPr>
-                <w:color w:val="262B33"/>
-                <w:sz w:val="16"/>
-              </w:rPr>
-              <w:t>05/18/2026</w:t>
-            </w:r>
-          </w:p>
-        </w:tc>
-        <w:tc>
-          <w:tcPr>
-            <w:tcW w:type="dxa" w:w="1440"/>
+            <w:tcW w:type="dxa" w:w="1260"/>
+          </w:tcPr>
+          <w:p>
+            <w:r>
+              <w:rPr>
+                <w:color w:val="262B33"/>
+                <w:sz w:val="16"/>
+              </w:rPr>
+              <w:t>Custom Built by Writer</w:t>
+            </w:r>
+          </w:p>
+        </w:tc>
+        <w:tc>
+          <w:tcPr>
+            <w:tcW w:type="dxa" w:w="1260"/>
+          </w:tcPr>
+          <w:p>
+            <w:r>
+              <w:rPr>
+                <w:color w:val="262B33"/>
+                <w:sz w:val="16"/>
+              </w:rPr>
+              <w:t>DOCX Template</w:t>
+            </w:r>
+          </w:p>
+        </w:tc>
+        <w:tc>
+          <w:tcPr>
+            <w:tcW w:type="dxa" w:w="1260"/>
           </w:tcPr>
           <w:p>
             <w:r>
@@ -8883,7 +8998,7 @@
         </w:tc>
         <w:tc>
           <w:tcPr>
-            <w:tcW w:type="dxa" w:w="1440"/>
+            <w:tcW w:type="dxa" w:w="1260"/>
           </w:tcPr>
           <w:p>
             <w:r>
@@ -8897,7 +9012,7 @@
         </w:tc>
         <w:tc>
           <w:tcPr>
-            <w:tcW w:type="dxa" w:w="1440"/>
+            <w:tcW w:type="dxa" w:w="1260"/>
           </w:tcPr>
           <w:p>
             <w:r>
@@ -8913,7 +9028,7 @@
       <w:tr>
         <w:tc>
           <w:tcPr>
-            <w:tcW w:type="dxa" w:w="1440"/>
+            <w:tcW w:type="dxa" w:w="1260"/>
           </w:tcPr>
           <w:p>
             <w:r>
@@ -8927,7 +9042,7 @@
         </w:tc>
         <w:tc>
           <w:tcPr>
-            <w:tcW w:type="dxa" w:w="1440"/>
+            <w:tcW w:type="dxa" w:w="1260"/>
           </w:tcPr>
           <w:p>
             <w:r>
@@ -8941,7 +9056,7 @@
         </w:tc>
         <w:tc>
           <w:tcPr>
-            <w:tcW w:type="dxa" w:w="1440"/>
+            <w:tcW w:type="dxa" w:w="1260"/>
           </w:tcPr>
           <w:p>
             <w:r>
@@ -8955,21 +9070,35 @@
         </w:tc>
         <w:tc>
           <w:tcPr>
-            <w:tcW w:type="dxa" w:w="1440"/>
-          </w:tcPr>
-          <w:p>
-            <w:r>
-              <w:rPr>
-                <w:color w:val="262B33"/>
-                <w:sz w:val="16"/>
-              </w:rPr>
-              <w:t>05/18/2026</w:t>
-            </w:r>
-          </w:p>
-        </w:tc>
-        <w:tc>
-          <w:tcPr>
-            <w:tcW w:type="dxa" w:w="1440"/>
+            <w:tcW w:type="dxa" w:w="1260"/>
+          </w:tcPr>
+          <w:p>
+            <w:r>
+              <w:rPr>
+                <w:color w:val="262B33"/>
+                <w:sz w:val="16"/>
+              </w:rPr>
+              <w:t>Custom Built by Writer</w:t>
+            </w:r>
+          </w:p>
+        </w:tc>
+        <w:tc>
+          <w:tcPr>
+            <w:tcW w:type="dxa" w:w="1260"/>
+          </w:tcPr>
+          <w:p>
+            <w:r>
+              <w:rPr>
+                <w:color w:val="262B33"/>
+                <w:sz w:val="16"/>
+              </w:rPr>
+              <w:t>DOCX Template</w:t>
+            </w:r>
+          </w:p>
+        </w:tc>
+        <w:tc>
+          <w:tcPr>
+            <w:tcW w:type="dxa" w:w="1260"/>
           </w:tcPr>
           <w:p>
             <w:r>
@@ -8983,7 +9112,7 @@
         </w:tc>
         <w:tc>
           <w:tcPr>
-            <w:tcW w:type="dxa" w:w="1440"/>
+            <w:tcW w:type="dxa" w:w="1260"/>
           </w:tcPr>
           <w:p>
             <w:r>
@@ -8997,7 +9126,7 @@
         </w:tc>
         <w:tc>
           <w:tcPr>
-            <w:tcW w:type="dxa" w:w="1440"/>
+            <w:tcW w:type="dxa" w:w="1260"/>
           </w:tcPr>
           <w:p>
             <w:r>
@@ -9013,7 +9142,7 @@
       <w:tr>
         <w:tc>
           <w:tcPr>
-            <w:tcW w:type="dxa" w:w="1440"/>
+            <w:tcW w:type="dxa" w:w="1260"/>
           </w:tcPr>
           <w:p>
             <w:r>
@@ -9027,7 +9156,7 @@
         </w:tc>
         <w:tc>
           <w:tcPr>
-            <w:tcW w:type="dxa" w:w="1440"/>
+            <w:tcW w:type="dxa" w:w="1260"/>
           </w:tcPr>
           <w:p>
             <w:r>
@@ -9041,7 +9170,7 @@
         </w:tc>
         <w:tc>
           <w:tcPr>
-            <w:tcW w:type="dxa" w:w="1440"/>
+            <w:tcW w:type="dxa" w:w="1260"/>
           </w:tcPr>
           <w:p>
             <w:r>
@@ -9055,21 +9184,35 @@
         </w:tc>
         <w:tc>
           <w:tcPr>
-            <w:tcW w:type="dxa" w:w="1440"/>
-          </w:tcPr>
-          <w:p>
-            <w:r>
-              <w:rPr>
-                <w:color w:val="262B33"/>
-                <w:sz w:val="16"/>
-              </w:rPr>
-              <w:t>05/19/2026</w:t>
-            </w:r>
-          </w:p>
-        </w:tc>
-        <w:tc>
-          <w:tcPr>
-            <w:tcW w:type="dxa" w:w="1440"/>
+            <w:tcW w:type="dxa" w:w="1260"/>
+          </w:tcPr>
+          <w:p>
+            <w:r>
+              <w:rPr>
+                <w:color w:val="262B33"/>
+                <w:sz w:val="16"/>
+              </w:rPr>
+              <w:t>Custom Built by Writer</w:t>
+            </w:r>
+          </w:p>
+        </w:tc>
+        <w:tc>
+          <w:tcPr>
+            <w:tcW w:type="dxa" w:w="1260"/>
+          </w:tcPr>
+          <w:p>
+            <w:r>
+              <w:rPr>
+                <w:color w:val="262B33"/>
+                <w:sz w:val="16"/>
+              </w:rPr>
+              <w:t>DOCX Template</w:t>
+            </w:r>
+          </w:p>
+        </w:tc>
+        <w:tc>
+          <w:tcPr>
+            <w:tcW w:type="dxa" w:w="1260"/>
           </w:tcPr>
           <w:p>
             <w:r>
@@ -9083,7 +9226,7 @@
         </w:tc>
         <w:tc>
           <w:tcPr>
-            <w:tcW w:type="dxa" w:w="1440"/>
+            <w:tcW w:type="dxa" w:w="1260"/>
           </w:tcPr>
           <w:p>
             <w:r>
@@ -9097,7 +9240,7 @@
         </w:tc>
         <w:tc>
           <w:tcPr>
-            <w:tcW w:type="dxa" w:w="1440"/>
+            <w:tcW w:type="dxa" w:w="1260"/>
           </w:tcPr>
           <w:p>
             <w:r>
@@ -9113,7 +9256,7 @@
       <w:tr>
         <w:tc>
           <w:tcPr>
-            <w:tcW w:type="dxa" w:w="1440"/>
+            <w:tcW w:type="dxa" w:w="1260"/>
           </w:tcPr>
           <w:p>
             <w:r>
@@ -9127,7 +9270,7 @@
         </w:tc>
         <w:tc>
           <w:tcPr>
-            <w:tcW w:type="dxa" w:w="1440"/>
+            <w:tcW w:type="dxa" w:w="1260"/>
           </w:tcPr>
           <w:p>
             <w:r>
@@ -9141,7 +9284,7 @@
         </w:tc>
         <w:tc>
           <w:tcPr>
-            <w:tcW w:type="dxa" w:w="1440"/>
+            <w:tcW w:type="dxa" w:w="1260"/>
           </w:tcPr>
           <w:p>
             <w:r>
@@ -9155,21 +9298,35 @@
         </w:tc>
         <w:tc>
           <w:tcPr>
-            <w:tcW w:type="dxa" w:w="1440"/>
-          </w:tcPr>
-          <w:p>
-            <w:r>
-              <w:rPr>
-                <w:color w:val="262B33"/>
-                <w:sz w:val="16"/>
-              </w:rPr>
-              <w:t>05/19/2026</w:t>
-            </w:r>
-          </w:p>
-        </w:tc>
-        <w:tc>
-          <w:tcPr>
-            <w:tcW w:type="dxa" w:w="1440"/>
+            <w:tcW w:type="dxa" w:w="1260"/>
+          </w:tcPr>
+          <w:p>
+            <w:r>
+              <w:rPr>
+                <w:color w:val="262B33"/>
+                <w:sz w:val="16"/>
+              </w:rPr>
+              <w:t>Custom Built by Writer</w:t>
+            </w:r>
+          </w:p>
+        </w:tc>
+        <w:tc>
+          <w:tcPr>
+            <w:tcW w:type="dxa" w:w="1260"/>
+          </w:tcPr>
+          <w:p>
+            <w:r>
+              <w:rPr>
+                <w:color w:val="262B33"/>
+                <w:sz w:val="16"/>
+              </w:rPr>
+              <w:t>DOCX Template</w:t>
+            </w:r>
+          </w:p>
+        </w:tc>
+        <w:tc>
+          <w:tcPr>
+            <w:tcW w:type="dxa" w:w="1260"/>
           </w:tcPr>
           <w:p>
             <w:r>
@@ -9183,7 +9340,7 @@
         </w:tc>
         <w:tc>
           <w:tcPr>
-            <w:tcW w:type="dxa" w:w="1440"/>
+            <w:tcW w:type="dxa" w:w="1260"/>
           </w:tcPr>
           <w:p>
             <w:r>
@@ -9197,7 +9354,7 @@
         </w:tc>
         <w:tc>
           <w:tcPr>
-            <w:tcW w:type="dxa" w:w="1440"/>
+            <w:tcW w:type="dxa" w:w="1260"/>
           </w:tcPr>
           <w:p>
             <w:r>
@@ -9213,7 +9370,7 @@
       <w:tr>
         <w:tc>
           <w:tcPr>
-            <w:tcW w:type="dxa" w:w="1440"/>
+            <w:tcW w:type="dxa" w:w="1260"/>
           </w:tcPr>
           <w:p>
             <w:r>
@@ -9227,7 +9384,7 @@
         </w:tc>
         <w:tc>
           <w:tcPr>
-            <w:tcW w:type="dxa" w:w="1440"/>
+            <w:tcW w:type="dxa" w:w="1260"/>
           </w:tcPr>
           <w:p>
             <w:r>
@@ -9241,7 +9398,7 @@
         </w:tc>
         <w:tc>
           <w:tcPr>
-            <w:tcW w:type="dxa" w:w="1440"/>
+            <w:tcW w:type="dxa" w:w="1260"/>
           </w:tcPr>
           <w:p>
             <w:r>
@@ -9255,21 +9412,35 @@
         </w:tc>
         <w:tc>
           <w:tcPr>
-            <w:tcW w:type="dxa" w:w="1440"/>
-          </w:tcPr>
-          <w:p>
-            <w:r>
-              <w:rPr>
-                <w:color w:val="262B33"/>
-                <w:sz w:val="16"/>
-              </w:rPr>
-              <w:t>05/20/2026</w:t>
-            </w:r>
-          </w:p>
-        </w:tc>
-        <w:tc>
-          <w:tcPr>
-            <w:tcW w:type="dxa" w:w="1440"/>
+            <w:tcW w:type="dxa" w:w="1260"/>
+          </w:tcPr>
+          <w:p>
+            <w:r>
+              <w:rPr>
+                <w:color w:val="262B33"/>
+                <w:sz w:val="16"/>
+              </w:rPr>
+              <w:t>Custom Built by Writer</w:t>
+            </w:r>
+          </w:p>
+        </w:tc>
+        <w:tc>
+          <w:tcPr>
+            <w:tcW w:type="dxa" w:w="1260"/>
+          </w:tcPr>
+          <w:p>
+            <w:r>
+              <w:rPr>
+                <w:color w:val="262B33"/>
+                <w:sz w:val="16"/>
+              </w:rPr>
+              <w:t>DOCX Template</w:t>
+            </w:r>
+          </w:p>
+        </w:tc>
+        <w:tc>
+          <w:tcPr>
+            <w:tcW w:type="dxa" w:w="1260"/>
           </w:tcPr>
           <w:p>
             <w:r>
@@ -9283,7 +9454,7 @@
         </w:tc>
         <w:tc>
           <w:tcPr>
-            <w:tcW w:type="dxa" w:w="1440"/>
+            <w:tcW w:type="dxa" w:w="1260"/>
           </w:tcPr>
           <w:p>
             <w:r>
@@ -9297,7 +9468,7 @@
         </w:tc>
         <w:tc>
           <w:tcPr>
-            <w:tcW w:type="dxa" w:w="1440"/>
+            <w:tcW w:type="dxa" w:w="1260"/>
           </w:tcPr>
           <w:p>
             <w:r>
@@ -9313,7 +9484,7 @@
       <w:tr>
         <w:tc>
           <w:tcPr>
-            <w:tcW w:type="dxa" w:w="1440"/>
+            <w:tcW w:type="dxa" w:w="1260"/>
           </w:tcPr>
           <w:p>
             <w:r>
@@ -9327,7 +9498,7 @@
         </w:tc>
         <w:tc>
           <w:tcPr>
-            <w:tcW w:type="dxa" w:w="1440"/>
+            <w:tcW w:type="dxa" w:w="1260"/>
           </w:tcPr>
           <w:p>
             <w:r>
@@ -9341,7 +9512,7 @@
         </w:tc>
         <w:tc>
           <w:tcPr>
-            <w:tcW w:type="dxa" w:w="1440"/>
+            <w:tcW w:type="dxa" w:w="1260"/>
           </w:tcPr>
           <w:p>
             <w:r>
@@ -9355,21 +9526,35 @@
         </w:tc>
         <w:tc>
           <w:tcPr>
-            <w:tcW w:type="dxa" w:w="1440"/>
-          </w:tcPr>
-          <w:p>
-            <w:r>
-              <w:rPr>
-                <w:color w:val="262B33"/>
-                <w:sz w:val="16"/>
-              </w:rPr>
-              <w:t>05/20/2026</w:t>
-            </w:r>
-          </w:p>
-        </w:tc>
-        <w:tc>
-          <w:tcPr>
-            <w:tcW w:type="dxa" w:w="1440"/>
+            <w:tcW w:type="dxa" w:w="1260"/>
+          </w:tcPr>
+          <w:p>
+            <w:r>
+              <w:rPr>
+                <w:color w:val="262B33"/>
+                <w:sz w:val="16"/>
+              </w:rPr>
+              <w:t>Custom Built by Writer</w:t>
+            </w:r>
+          </w:p>
+        </w:tc>
+        <w:tc>
+          <w:tcPr>
+            <w:tcW w:type="dxa" w:w="1260"/>
+          </w:tcPr>
+          <w:p>
+            <w:r>
+              <w:rPr>
+                <w:color w:val="262B33"/>
+                <w:sz w:val="16"/>
+              </w:rPr>
+              <w:t>DOCX Template</w:t>
+            </w:r>
+          </w:p>
+        </w:tc>
+        <w:tc>
+          <w:tcPr>
+            <w:tcW w:type="dxa" w:w="1260"/>
           </w:tcPr>
           <w:p>
             <w:r>
@@ -9383,7 +9568,7 @@
         </w:tc>
         <w:tc>
           <w:tcPr>
-            <w:tcW w:type="dxa" w:w="1440"/>
+            <w:tcW w:type="dxa" w:w="1260"/>
           </w:tcPr>
           <w:p>
             <w:r>
@@ -9397,7 +9582,7 @@
         </w:tc>
         <w:tc>
           <w:tcPr>
-            <w:tcW w:type="dxa" w:w="1440"/>
+            <w:tcW w:type="dxa" w:w="1260"/>
           </w:tcPr>
           <w:p>
             <w:r>
@@ -9413,7 +9598,7 @@
       <w:tr>
         <w:tc>
           <w:tcPr>
-            <w:tcW w:type="dxa" w:w="1440"/>
+            <w:tcW w:type="dxa" w:w="1260"/>
           </w:tcPr>
           <w:p>
             <w:r>
@@ -9427,7 +9612,7 @@
         </w:tc>
         <w:tc>
           <w:tcPr>
-            <w:tcW w:type="dxa" w:w="1440"/>
+            <w:tcW w:type="dxa" w:w="1260"/>
           </w:tcPr>
           <w:p>
             <w:r>
@@ -9441,7 +9626,7 @@
         </w:tc>
         <w:tc>
           <w:tcPr>
-            <w:tcW w:type="dxa" w:w="1440"/>
+            <w:tcW w:type="dxa" w:w="1260"/>
           </w:tcPr>
           <w:p>
             <w:r>
@@ -9455,21 +9640,35 @@
         </w:tc>
         <w:tc>
           <w:tcPr>
-            <w:tcW w:type="dxa" w:w="1440"/>
-          </w:tcPr>
-          <w:p>
-            <w:r>
-              <w:rPr>
-                <w:color w:val="262B33"/>
-                <w:sz w:val="16"/>
-              </w:rPr>
-              <w:t>05/20/2026</w:t>
-            </w:r>
-          </w:p>
-        </w:tc>
-        <w:tc>
-          <w:tcPr>
-            <w:tcW w:type="dxa" w:w="1440"/>
+            <w:tcW w:type="dxa" w:w="1260"/>
+          </w:tcPr>
+          <w:p>
+            <w:r>
+              <w:rPr>
+                <w:color w:val="262B33"/>
+                <w:sz w:val="16"/>
+              </w:rPr>
+              <w:t>Custom Built by Writer</w:t>
+            </w:r>
+          </w:p>
+        </w:tc>
+        <w:tc>
+          <w:tcPr>
+            <w:tcW w:type="dxa" w:w="1260"/>
+          </w:tcPr>
+          <w:p>
+            <w:r>
+              <w:rPr>
+                <w:color w:val="262B33"/>
+                <w:sz w:val="16"/>
+              </w:rPr>
+              <w:t>DOCX Template</w:t>
+            </w:r>
+          </w:p>
+        </w:tc>
+        <w:tc>
+          <w:tcPr>
+            <w:tcW w:type="dxa" w:w="1260"/>
           </w:tcPr>
           <w:p>
             <w:r>
@@ -9483,7 +9682,7 @@
         </w:tc>
         <w:tc>
           <w:tcPr>
-            <w:tcW w:type="dxa" w:w="1440"/>
+            <w:tcW w:type="dxa" w:w="1260"/>
           </w:tcPr>
           <w:p>
             <w:r>
@@ -9497,7 +9696,7 @@
         </w:tc>
         <w:tc>
           <w:tcPr>
-            <w:tcW w:type="dxa" w:w="1440"/>
+            <w:tcW w:type="dxa" w:w="1260"/>
           </w:tcPr>
           <w:p>
             <w:r>
@@ -9513,7 +9712,7 @@
       <w:tr>
         <w:tc>
           <w:tcPr>
-            <w:tcW w:type="dxa" w:w="1440"/>
+            <w:tcW w:type="dxa" w:w="1260"/>
           </w:tcPr>
           <w:p>
             <w:r>
@@ -9527,7 +9726,7 @@
         </w:tc>
         <w:tc>
           <w:tcPr>
-            <w:tcW w:type="dxa" w:w="1440"/>
+            <w:tcW w:type="dxa" w:w="1260"/>
           </w:tcPr>
           <w:p>
             <w:r>
@@ -9541,7 +9740,7 @@
         </w:tc>
         <w:tc>
           <w:tcPr>
-            <w:tcW w:type="dxa" w:w="1440"/>
+            <w:tcW w:type="dxa" w:w="1260"/>
           </w:tcPr>
           <w:p>
             <w:r>
@@ -9555,21 +9754,35 @@
         </w:tc>
         <w:tc>
           <w:tcPr>
-            <w:tcW w:type="dxa" w:w="1440"/>
-          </w:tcPr>
-          <w:p>
-            <w:r>
-              <w:rPr>
-                <w:color w:val="262B33"/>
-                <w:sz w:val="16"/>
-              </w:rPr>
-              <w:t>05/20/2026</w:t>
-            </w:r>
-          </w:p>
-        </w:tc>
-        <w:tc>
-          <w:tcPr>
-            <w:tcW w:type="dxa" w:w="1440"/>
+            <w:tcW w:type="dxa" w:w="1260"/>
+          </w:tcPr>
+          <w:p>
+            <w:r>
+              <w:rPr>
+                <w:color w:val="262B33"/>
+                <w:sz w:val="16"/>
+              </w:rPr>
+              <w:t>Custom Built by Writer</w:t>
+            </w:r>
+          </w:p>
+        </w:tc>
+        <w:tc>
+          <w:tcPr>
+            <w:tcW w:type="dxa" w:w="1260"/>
+          </w:tcPr>
+          <w:p>
+            <w:r>
+              <w:rPr>
+                <w:color w:val="262B33"/>
+                <w:sz w:val="16"/>
+              </w:rPr>
+              <w:t>DOCX Template</w:t>
+            </w:r>
+          </w:p>
+        </w:tc>
+        <w:tc>
+          <w:tcPr>
+            <w:tcW w:type="dxa" w:w="1260"/>
           </w:tcPr>
           <w:p>
             <w:r>
@@ -9583,7 +9796,7 @@
         </w:tc>
         <w:tc>
           <w:tcPr>
-            <w:tcW w:type="dxa" w:w="1440"/>
+            <w:tcW w:type="dxa" w:w="1260"/>
           </w:tcPr>
           <w:p>
             <w:r>
@@ -9597,7 +9810,7 @@
         </w:tc>
         <w:tc>
           <w:tcPr>
-            <w:tcW w:type="dxa" w:w="1440"/>
+            <w:tcW w:type="dxa" w:w="1260"/>
           </w:tcPr>
           <w:p>
             <w:r>
@@ -9613,7 +9826,7 @@
       <w:tr>
         <w:tc>
           <w:tcPr>
-            <w:tcW w:type="dxa" w:w="1440"/>
+            <w:tcW w:type="dxa" w:w="1260"/>
           </w:tcPr>
           <w:p>
             <w:r>
@@ -9627,7 +9840,7 @@
         </w:tc>
         <w:tc>
           <w:tcPr>
-            <w:tcW w:type="dxa" w:w="1440"/>
+            <w:tcW w:type="dxa" w:w="1260"/>
           </w:tcPr>
           <w:p>
             <w:r>
@@ -9641,7 +9854,7 @@
         </w:tc>
         <w:tc>
           <w:tcPr>
-            <w:tcW w:type="dxa" w:w="1440"/>
+            <w:tcW w:type="dxa" w:w="1260"/>
           </w:tcPr>
           <w:p>
             <w:r>
@@ -9655,21 +9868,35 @@
         </w:tc>
         <w:tc>
           <w:tcPr>
-            <w:tcW w:type="dxa" w:w="1440"/>
-          </w:tcPr>
-          <w:p>
-            <w:r>
-              <w:rPr>
-                <w:color w:val="262B33"/>
-                <w:sz w:val="16"/>
-              </w:rPr>
-              <w:t>05/20/2026</w:t>
-            </w:r>
-          </w:p>
-        </w:tc>
-        <w:tc>
-          <w:tcPr>
-            <w:tcW w:type="dxa" w:w="1440"/>
+            <w:tcW w:type="dxa" w:w="1260"/>
+          </w:tcPr>
+          <w:p>
+            <w:r>
+              <w:rPr>
+                <w:color w:val="262B33"/>
+                <w:sz w:val="16"/>
+              </w:rPr>
+              <w:t>Custom Built by Writer</w:t>
+            </w:r>
+          </w:p>
+        </w:tc>
+        <w:tc>
+          <w:tcPr>
+            <w:tcW w:type="dxa" w:w="1260"/>
+          </w:tcPr>
+          <w:p>
+            <w:r>
+              <w:rPr>
+                <w:color w:val="262B33"/>
+                <w:sz w:val="16"/>
+              </w:rPr>
+              <w:t>DOCX Template</w:t>
+            </w:r>
+          </w:p>
+        </w:tc>
+        <w:tc>
+          <w:tcPr>
+            <w:tcW w:type="dxa" w:w="1260"/>
           </w:tcPr>
           <w:p>
             <w:r>
@@ -9683,7 +9910,7 @@
         </w:tc>
         <w:tc>
           <w:tcPr>
-            <w:tcW w:type="dxa" w:w="1440"/>
+            <w:tcW w:type="dxa" w:w="1260"/>
           </w:tcPr>
           <w:p>
             <w:r>
@@ -9697,7 +9924,7 @@
         </w:tc>
         <w:tc>
           <w:tcPr>
-            <w:tcW w:type="dxa" w:w="1440"/>
+            <w:tcW w:type="dxa" w:w="1260"/>
           </w:tcPr>
           <w:p>
             <w:r>
@@ -9713,7 +9940,7 @@
       <w:tr>
         <w:tc>
           <w:tcPr>
-            <w:tcW w:type="dxa" w:w="1440"/>
+            <w:tcW w:type="dxa" w:w="1260"/>
           </w:tcPr>
           <w:p>
             <w:r>
@@ -9727,7 +9954,7 @@
         </w:tc>
         <w:tc>
           <w:tcPr>
-            <w:tcW w:type="dxa" w:w="1440"/>
+            <w:tcW w:type="dxa" w:w="1260"/>
           </w:tcPr>
           <w:p>
             <w:r>
@@ -9741,7 +9968,7 @@
         </w:tc>
         <w:tc>
           <w:tcPr>
-            <w:tcW w:type="dxa" w:w="1440"/>
+            <w:tcW w:type="dxa" w:w="1260"/>
           </w:tcPr>
           <w:p>
             <w:r>
@@ -9755,21 +9982,35 @@
         </w:tc>
         <w:tc>
           <w:tcPr>
-            <w:tcW w:type="dxa" w:w="1440"/>
-          </w:tcPr>
-          <w:p>
-            <w:r>
-              <w:rPr>
-                <w:color w:val="262B33"/>
-                <w:sz w:val="16"/>
-              </w:rPr>
-              <w:t>05/16/2026</w:t>
-            </w:r>
-          </w:p>
-        </w:tc>
-        <w:tc>
-          <w:tcPr>
-            <w:tcW w:type="dxa" w:w="1440"/>
+            <w:tcW w:type="dxa" w:w="1260"/>
+          </w:tcPr>
+          <w:p>
+            <w:r>
+              <w:rPr>
+                <w:color w:val="262B33"/>
+                <w:sz w:val="16"/>
+              </w:rPr>
+              <w:t>Custom Built by Writer</w:t>
+            </w:r>
+          </w:p>
+        </w:tc>
+        <w:tc>
+          <w:tcPr>
+            <w:tcW w:type="dxa" w:w="1260"/>
+          </w:tcPr>
+          <w:p>
+            <w:r>
+              <w:rPr>
+                <w:color w:val="262B33"/>
+                <w:sz w:val="16"/>
+              </w:rPr>
+              <w:t>DOCX Template</w:t>
+            </w:r>
+          </w:p>
+        </w:tc>
+        <w:tc>
+          <w:tcPr>
+            <w:tcW w:type="dxa" w:w="1260"/>
           </w:tcPr>
           <w:p>
             <w:r>
@@ -9783,7 +10024,7 @@
         </w:tc>
         <w:tc>
           <w:tcPr>
-            <w:tcW w:type="dxa" w:w="1440"/>
+            <w:tcW w:type="dxa" w:w="1260"/>
           </w:tcPr>
           <w:p>
             <w:r>
@@ -9797,7 +10038,7 @@
         </w:tc>
         <w:tc>
           <w:tcPr>
-            <w:tcW w:type="dxa" w:w="1440"/>
+            <w:tcW w:type="dxa" w:w="1260"/>
           </w:tcPr>
           <w:p>
             <w:r>
@@ -9813,7 +10054,7 @@
       <w:tr>
         <w:tc>
           <w:tcPr>
-            <w:tcW w:type="dxa" w:w="1440"/>
+            <w:tcW w:type="dxa" w:w="1260"/>
           </w:tcPr>
           <w:p>
             <w:r>
@@ -9827,7 +10068,7 @@
         </w:tc>
         <w:tc>
           <w:tcPr>
-            <w:tcW w:type="dxa" w:w="1440"/>
+            <w:tcW w:type="dxa" w:w="1260"/>
           </w:tcPr>
           <w:p>
             <w:r>
@@ -9841,7 +10082,7 @@
         </w:tc>
         <w:tc>
           <w:tcPr>
-            <w:tcW w:type="dxa" w:w="1440"/>
+            <w:tcW w:type="dxa" w:w="1260"/>
           </w:tcPr>
           <w:p>
             <w:r>
@@ -9855,21 +10096,35 @@
         </w:tc>
         <w:tc>
           <w:tcPr>
-            <w:tcW w:type="dxa" w:w="1440"/>
-          </w:tcPr>
-          <w:p>
-            <w:r>
-              <w:rPr>
-                <w:color w:val="262B33"/>
-                <w:sz w:val="16"/>
-              </w:rPr>
-              <w:t>05/16/2026</w:t>
-            </w:r>
-          </w:p>
-        </w:tc>
-        <w:tc>
-          <w:tcPr>
-            <w:tcW w:type="dxa" w:w="1440"/>
+            <w:tcW w:type="dxa" w:w="1260"/>
+          </w:tcPr>
+          <w:p>
+            <w:r>
+              <w:rPr>
+                <w:color w:val="262B33"/>
+                <w:sz w:val="16"/>
+              </w:rPr>
+              <w:t>Custom Built by Writer</w:t>
+            </w:r>
+          </w:p>
+        </w:tc>
+        <w:tc>
+          <w:tcPr>
+            <w:tcW w:type="dxa" w:w="1260"/>
+          </w:tcPr>
+          <w:p>
+            <w:r>
+              <w:rPr>
+                <w:color w:val="262B33"/>
+                <w:sz w:val="16"/>
+              </w:rPr>
+              <w:t>DOCX Template</w:t>
+            </w:r>
+          </w:p>
+        </w:tc>
+        <w:tc>
+          <w:tcPr>
+            <w:tcW w:type="dxa" w:w="1260"/>
           </w:tcPr>
           <w:p>
             <w:r>
@@ -9883,7 +10138,7 @@
         </w:tc>
         <w:tc>
           <w:tcPr>
-            <w:tcW w:type="dxa" w:w="1440"/>
+            <w:tcW w:type="dxa" w:w="1260"/>
           </w:tcPr>
           <w:p>
             <w:r>
@@ -9897,7 +10152,7 @@
         </w:tc>
         <w:tc>
           <w:tcPr>
-            <w:tcW w:type="dxa" w:w="1440"/>
+            <w:tcW w:type="dxa" w:w="1260"/>
           </w:tcPr>
           <w:p>
             <w:r>
@@ -9913,7 +10168,7 @@
       <w:tr>
         <w:tc>
           <w:tcPr>
-            <w:tcW w:type="dxa" w:w="1440"/>
+            <w:tcW w:type="dxa" w:w="1260"/>
           </w:tcPr>
           <w:p>
             <w:r>
@@ -9927,7 +10182,7 @@
         </w:tc>
         <w:tc>
           <w:tcPr>
-            <w:tcW w:type="dxa" w:w="1440"/>
+            <w:tcW w:type="dxa" w:w="1260"/>
           </w:tcPr>
           <w:p>
             <w:r>
@@ -9941,7 +10196,7 @@
         </w:tc>
         <w:tc>
           <w:tcPr>
-            <w:tcW w:type="dxa" w:w="1440"/>
+            <w:tcW w:type="dxa" w:w="1260"/>
           </w:tcPr>
           <w:p>
             <w:r>
@@ -9955,21 +10210,35 @@
         </w:tc>
         <w:tc>
           <w:tcPr>
-            <w:tcW w:type="dxa" w:w="1440"/>
-          </w:tcPr>
-          <w:p>
-            <w:r>
-              <w:rPr>
-                <w:color w:val="262B33"/>
-                <w:sz w:val="16"/>
-              </w:rPr>
-              <w:t>05/16/2026</w:t>
-            </w:r>
-          </w:p>
-        </w:tc>
-        <w:tc>
-          <w:tcPr>
-            <w:tcW w:type="dxa" w:w="1440"/>
+            <w:tcW w:type="dxa" w:w="1260"/>
+          </w:tcPr>
+          <w:p>
+            <w:r>
+              <w:rPr>
+                <w:color w:val="262B33"/>
+                <w:sz w:val="16"/>
+              </w:rPr>
+              <w:t>Custom Built by Writer</w:t>
+            </w:r>
+          </w:p>
+        </w:tc>
+        <w:tc>
+          <w:tcPr>
+            <w:tcW w:type="dxa" w:w="1260"/>
+          </w:tcPr>
+          <w:p>
+            <w:r>
+              <w:rPr>
+                <w:color w:val="262B33"/>
+                <w:sz w:val="16"/>
+              </w:rPr>
+              <w:t>DOCX Template</w:t>
+            </w:r>
+          </w:p>
+        </w:tc>
+        <w:tc>
+          <w:tcPr>
+            <w:tcW w:type="dxa" w:w="1260"/>
           </w:tcPr>
           <w:p>
             <w:r>
@@ -9983,7 +10252,7 @@
         </w:tc>
         <w:tc>
           <w:tcPr>
-            <w:tcW w:type="dxa" w:w="1440"/>
+            <w:tcW w:type="dxa" w:w="1260"/>
           </w:tcPr>
           <w:p>
             <w:r>
@@ -9997,7 +10266,7 @@
         </w:tc>
         <w:tc>
           <w:tcPr>
-            <w:tcW w:type="dxa" w:w="1440"/>
+            <w:tcW w:type="dxa" w:w="1260"/>
           </w:tcPr>
           <w:p>
             <w:r>
@@ -10013,7 +10282,7 @@
       <w:tr>
         <w:tc>
           <w:tcPr>
-            <w:tcW w:type="dxa" w:w="1440"/>
+            <w:tcW w:type="dxa" w:w="1260"/>
           </w:tcPr>
           <w:p>
             <w:r>
@@ -10027,7 +10296,7 @@
         </w:tc>
         <w:tc>
           <w:tcPr>
-            <w:tcW w:type="dxa" w:w="1440"/>
+            <w:tcW w:type="dxa" w:w="1260"/>
           </w:tcPr>
           <w:p>
             <w:r>
@@ -10041,7 +10310,7 @@
         </w:tc>
         <w:tc>
           <w:tcPr>
-            <w:tcW w:type="dxa" w:w="1440"/>
+            <w:tcW w:type="dxa" w:w="1260"/>
           </w:tcPr>
           <w:p>
             <w:r>
@@ -10055,21 +10324,35 @@
         </w:tc>
         <w:tc>
           <w:tcPr>
-            <w:tcW w:type="dxa" w:w="1440"/>
-          </w:tcPr>
-          <w:p>
-            <w:r>
-              <w:rPr>
-                <w:color w:val="262B33"/>
-                <w:sz w:val="16"/>
-              </w:rPr>
-              <w:t>05/17/2026</w:t>
-            </w:r>
-          </w:p>
-        </w:tc>
-        <w:tc>
-          <w:tcPr>
-            <w:tcW w:type="dxa" w:w="1440"/>
+            <w:tcW w:type="dxa" w:w="1260"/>
+          </w:tcPr>
+          <w:p>
+            <w:r>
+              <w:rPr>
+                <w:color w:val="262B33"/>
+                <w:sz w:val="16"/>
+              </w:rPr>
+              <w:t>Custom Built by Writer</w:t>
+            </w:r>
+          </w:p>
+        </w:tc>
+        <w:tc>
+          <w:tcPr>
+            <w:tcW w:type="dxa" w:w="1260"/>
+          </w:tcPr>
+          <w:p>
+            <w:r>
+              <w:rPr>
+                <w:color w:val="262B33"/>
+                <w:sz w:val="16"/>
+              </w:rPr>
+              <w:t>DOCX Template</w:t>
+            </w:r>
+          </w:p>
+        </w:tc>
+        <w:tc>
+          <w:tcPr>
+            <w:tcW w:type="dxa" w:w="1260"/>
           </w:tcPr>
           <w:p>
             <w:r>
@@ -10083,7 +10366,7 @@
         </w:tc>
         <w:tc>
           <w:tcPr>
-            <w:tcW w:type="dxa" w:w="1440"/>
+            <w:tcW w:type="dxa" w:w="1260"/>
           </w:tcPr>
           <w:p>
             <w:r>
@@ -10097,7 +10380,7 @@
         </w:tc>
         <w:tc>
           <w:tcPr>
-            <w:tcW w:type="dxa" w:w="1440"/>
+            <w:tcW w:type="dxa" w:w="1260"/>
           </w:tcPr>
           <w:p>
             <w:r>
@@ -10113,7 +10396,7 @@
       <w:tr>
         <w:tc>
           <w:tcPr>
-            <w:tcW w:type="dxa" w:w="1440"/>
+            <w:tcW w:type="dxa" w:w="1260"/>
           </w:tcPr>
           <w:p>
             <w:r>
@@ -10127,7 +10410,7 @@
         </w:tc>
         <w:tc>
           <w:tcPr>
-            <w:tcW w:type="dxa" w:w="1440"/>
+            <w:tcW w:type="dxa" w:w="1260"/>
           </w:tcPr>
           <w:p>
             <w:r>
@@ -10141,7 +10424,7 @@
         </w:tc>
         <w:tc>
           <w:tcPr>
-            <w:tcW w:type="dxa" w:w="1440"/>
+            <w:tcW w:type="dxa" w:w="1260"/>
           </w:tcPr>
           <w:p>
             <w:r>
@@ -10155,21 +10438,35 @@
         </w:tc>
         <w:tc>
           <w:tcPr>
-            <w:tcW w:type="dxa" w:w="1440"/>
-          </w:tcPr>
-          <w:p>
-            <w:r>
-              <w:rPr>
-                <w:color w:val="262B33"/>
-                <w:sz w:val="16"/>
-              </w:rPr>
-              <w:t>05/16/2026</w:t>
-            </w:r>
-          </w:p>
-        </w:tc>
-        <w:tc>
-          <w:tcPr>
-            <w:tcW w:type="dxa" w:w="1440"/>
+            <w:tcW w:type="dxa" w:w="1260"/>
+          </w:tcPr>
+          <w:p>
+            <w:r>
+              <w:rPr>
+                <w:color w:val="262B33"/>
+                <w:sz w:val="16"/>
+              </w:rPr>
+              <w:t>Custom Built by Writer</w:t>
+            </w:r>
+          </w:p>
+        </w:tc>
+        <w:tc>
+          <w:tcPr>
+            <w:tcW w:type="dxa" w:w="1260"/>
+          </w:tcPr>
+          <w:p>
+            <w:r>
+              <w:rPr>
+                <w:color w:val="262B33"/>
+                <w:sz w:val="16"/>
+              </w:rPr>
+              <w:t>DOCX Template</w:t>
+            </w:r>
+          </w:p>
+        </w:tc>
+        <w:tc>
+          <w:tcPr>
+            <w:tcW w:type="dxa" w:w="1260"/>
           </w:tcPr>
           <w:p>
             <w:r>
@@ -10183,7 +10480,7 @@
         </w:tc>
         <w:tc>
           <w:tcPr>
-            <w:tcW w:type="dxa" w:w="1440"/>
+            <w:tcW w:type="dxa" w:w="1260"/>
           </w:tcPr>
           <w:p>
             <w:r>
@@ -10197,7 +10494,7 @@
         </w:tc>
         <w:tc>
           <w:tcPr>
-            <w:tcW w:type="dxa" w:w="1440"/>
+            <w:tcW w:type="dxa" w:w="1260"/>
           </w:tcPr>
           <w:p>
             <w:r>
@@ -10213,7 +10510,7 @@
       <w:tr>
         <w:tc>
           <w:tcPr>
-            <w:tcW w:type="dxa" w:w="1440"/>
+            <w:tcW w:type="dxa" w:w="1260"/>
           </w:tcPr>
           <w:p>
             <w:r>
@@ -10227,7 +10524,7 @@
         </w:tc>
         <w:tc>
           <w:tcPr>
-            <w:tcW w:type="dxa" w:w="1440"/>
+            <w:tcW w:type="dxa" w:w="1260"/>
           </w:tcPr>
           <w:p>
             <w:r>
@@ -10241,7 +10538,7 @@
         </w:tc>
         <w:tc>
           <w:tcPr>
-            <w:tcW w:type="dxa" w:w="1440"/>
+            <w:tcW w:type="dxa" w:w="1260"/>
           </w:tcPr>
           <w:p>
             <w:r>
@@ -10255,21 +10552,35 @@
         </w:tc>
         <w:tc>
           <w:tcPr>
-            <w:tcW w:type="dxa" w:w="1440"/>
-          </w:tcPr>
-          <w:p>
-            <w:r>
-              <w:rPr>
-                <w:color w:val="262B33"/>
-                <w:sz w:val="16"/>
-              </w:rPr>
-              <w:t>05/19/2026</w:t>
-            </w:r>
-          </w:p>
-        </w:tc>
-        <w:tc>
-          <w:tcPr>
-            <w:tcW w:type="dxa" w:w="1440"/>
+            <w:tcW w:type="dxa" w:w="1260"/>
+          </w:tcPr>
+          <w:p>
+            <w:r>
+              <w:rPr>
+                <w:color w:val="262B33"/>
+                <w:sz w:val="16"/>
+              </w:rPr>
+              <w:t>Custom Built by Writer</w:t>
+            </w:r>
+          </w:p>
+        </w:tc>
+        <w:tc>
+          <w:tcPr>
+            <w:tcW w:type="dxa" w:w="1260"/>
+          </w:tcPr>
+          <w:p>
+            <w:r>
+              <w:rPr>
+                <w:color w:val="262B33"/>
+                <w:sz w:val="16"/>
+              </w:rPr>
+              <w:t>DOCX Template</w:t>
+            </w:r>
+          </w:p>
+        </w:tc>
+        <w:tc>
+          <w:tcPr>
+            <w:tcW w:type="dxa" w:w="1260"/>
           </w:tcPr>
           <w:p>
             <w:r>
@@ -10283,7 +10594,7 @@
         </w:tc>
         <w:tc>
           <w:tcPr>
-            <w:tcW w:type="dxa" w:w="1440"/>
+            <w:tcW w:type="dxa" w:w="1260"/>
           </w:tcPr>
           <w:p>
             <w:r>
@@ -10297,7 +10608,7 @@
         </w:tc>
         <w:tc>
           <w:tcPr>
-            <w:tcW w:type="dxa" w:w="1440"/>
+            <w:tcW w:type="dxa" w:w="1260"/>
           </w:tcPr>
           <w:p>
             <w:r>
@@ -10313,7 +10624,7 @@
       <w:tr>
         <w:tc>
           <w:tcPr>
-            <w:tcW w:type="dxa" w:w="1440"/>
+            <w:tcW w:type="dxa" w:w="1260"/>
           </w:tcPr>
           <w:p>
             <w:r>
@@ -10327,7 +10638,7 @@
         </w:tc>
         <w:tc>
           <w:tcPr>
-            <w:tcW w:type="dxa" w:w="1440"/>
+            <w:tcW w:type="dxa" w:w="1260"/>
           </w:tcPr>
           <w:p>
             <w:r>
@@ -10341,7 +10652,7 @@
         </w:tc>
         <w:tc>
           <w:tcPr>
-            <w:tcW w:type="dxa" w:w="1440"/>
+            <w:tcW w:type="dxa" w:w="1260"/>
           </w:tcPr>
           <w:p>
             <w:r>
@@ -10355,21 +10666,35 @@
         </w:tc>
         <w:tc>
           <w:tcPr>
-            <w:tcW w:type="dxa" w:w="1440"/>
-          </w:tcPr>
-          <w:p>
-            <w:r>
-              <w:rPr>
-                <w:color w:val="262B33"/>
-                <w:sz w:val="16"/>
-              </w:rPr>
-              <w:t>05/16/2026</w:t>
-            </w:r>
-          </w:p>
-        </w:tc>
-        <w:tc>
-          <w:tcPr>
-            <w:tcW w:type="dxa" w:w="1440"/>
+            <w:tcW w:type="dxa" w:w="1260"/>
+          </w:tcPr>
+          <w:p>
+            <w:r>
+              <w:rPr>
+                <w:color w:val="262B33"/>
+                <w:sz w:val="16"/>
+              </w:rPr>
+              <w:t>Custom Built by Writer</w:t>
+            </w:r>
+          </w:p>
+        </w:tc>
+        <w:tc>
+          <w:tcPr>
+            <w:tcW w:type="dxa" w:w="1260"/>
+          </w:tcPr>
+          <w:p>
+            <w:r>
+              <w:rPr>
+                <w:color w:val="262B33"/>
+                <w:sz w:val="16"/>
+              </w:rPr>
+              <w:t>DOCX Template</w:t>
+            </w:r>
+          </w:p>
+        </w:tc>
+        <w:tc>
+          <w:tcPr>
+            <w:tcW w:type="dxa" w:w="1260"/>
           </w:tcPr>
           <w:p>
             <w:r>
@@ -10383,21 +10708,21 @@
         </w:tc>
         <w:tc>
           <w:tcPr>
-            <w:tcW w:type="dxa" w:w="1440"/>
-          </w:tcPr>
-          <w:p>
-            <w:r>
-              <w:rPr>
-                <w:color w:val="262B33"/>
-                <w:sz w:val="16"/>
-              </w:rPr>
-              <w:t>System-generated pre-admission home medication list with dose, route, frequency, indication</w:t>
-            </w:r>
-          </w:p>
-        </w:tc>
-        <w:tc>
-          <w:tcPr>
-            <w:tcW w:type="dxa" w:w="1440"/>
+            <w:tcW w:type="dxa" w:w="1260"/>
+          </w:tcPr>
+          <w:p>
+            <w:r>
+              <w:rPr>
+                <w:color w:val="262B33"/>
+                <w:sz w:val="16"/>
+              </w:rPr>
+              <w:t>EMR pre-admission home medication list with dose, route, frequency, indication</w:t>
+            </w:r>
+          </w:p>
+        </w:tc>
+        <w:tc>
+          <w:tcPr>
+            <w:tcW w:type="dxa" w:w="1260"/>
           </w:tcPr>
           <w:p>
             <w:r>
@@ -10413,7 +10738,7 @@
       <w:tr>
         <w:tc>
           <w:tcPr>
-            <w:tcW w:type="dxa" w:w="1440"/>
+            <w:tcW w:type="dxa" w:w="1260"/>
           </w:tcPr>
           <w:p>
             <w:r>
@@ -10427,7 +10752,7 @@
         </w:tc>
         <w:tc>
           <w:tcPr>
-            <w:tcW w:type="dxa" w:w="1440"/>
+            <w:tcW w:type="dxa" w:w="1260"/>
           </w:tcPr>
           <w:p>
             <w:r>
@@ -10441,7 +10766,7 @@
         </w:tc>
         <w:tc>
           <w:tcPr>
-            <w:tcW w:type="dxa" w:w="1440"/>
+            <w:tcW w:type="dxa" w:w="1260"/>
           </w:tcPr>
           <w:p>
             <w:r>
@@ -10455,21 +10780,35 @@
         </w:tc>
         <w:tc>
           <w:tcPr>
-            <w:tcW w:type="dxa" w:w="1440"/>
-          </w:tcPr>
-          <w:p>
-            <w:r>
-              <w:rPr>
-                <w:color w:val="262B33"/>
-                <w:sz w:val="16"/>
-              </w:rPr>
-              <w:t>04/30/2026</w:t>
-            </w:r>
-          </w:p>
-        </w:tc>
-        <w:tc>
-          <w:tcPr>
-            <w:tcW w:type="dxa" w:w="1440"/>
+            <w:tcW w:type="dxa" w:w="1260"/>
+          </w:tcPr>
+          <w:p>
+            <w:r>
+              <w:rPr>
+                <w:color w:val="262B33"/>
+                <w:sz w:val="16"/>
+              </w:rPr>
+              <w:t>Custom Built by Writer</w:t>
+            </w:r>
+          </w:p>
+        </w:tc>
+        <w:tc>
+          <w:tcPr>
+            <w:tcW w:type="dxa" w:w="1260"/>
+          </w:tcPr>
+          <w:p>
+            <w:r>
+              <w:rPr>
+                <w:color w:val="262B33"/>
+                <w:sz w:val="16"/>
+              </w:rPr>
+              <w:t>DOCX Template</w:t>
+            </w:r>
+          </w:p>
+        </w:tc>
+        <w:tc>
+          <w:tcPr>
+            <w:tcW w:type="dxa" w:w="1260"/>
           </w:tcPr>
           <w:p>
             <w:r>
@@ -10483,7 +10822,7 @@
         </w:tc>
         <w:tc>
           <w:tcPr>
-            <w:tcW w:type="dxa" w:w="1440"/>
+            <w:tcW w:type="dxa" w:w="1260"/>
           </w:tcPr>
           <w:p>
             <w:r>
@@ -10497,7 +10836,7 @@
         </w:tc>
         <w:tc>
           <w:tcPr>
-            <w:tcW w:type="dxa" w:w="1440"/>
+            <w:tcW w:type="dxa" w:w="1260"/>
           </w:tcPr>
           <w:p>
             <w:r>
@@ -10513,7 +10852,7 @@
       <w:tr>
         <w:tc>
           <w:tcPr>
-            <w:tcW w:type="dxa" w:w="1440"/>
+            <w:tcW w:type="dxa" w:w="1260"/>
           </w:tcPr>
           <w:p>
             <w:r>
@@ -10527,7 +10866,7 @@
         </w:tc>
         <w:tc>
           <w:tcPr>
-            <w:tcW w:type="dxa" w:w="1440"/>
+            <w:tcW w:type="dxa" w:w="1260"/>
           </w:tcPr>
           <w:p>
             <w:r>
@@ -10541,7 +10880,7 @@
         </w:tc>
         <w:tc>
           <w:tcPr>
-            <w:tcW w:type="dxa" w:w="1440"/>
+            <w:tcW w:type="dxa" w:w="1260"/>
           </w:tcPr>
           <w:p>
             <w:r>
@@ -10555,21 +10894,35 @@
         </w:tc>
         <w:tc>
           <w:tcPr>
-            <w:tcW w:type="dxa" w:w="1440"/>
-          </w:tcPr>
-          <w:p>
-            <w:r>
-              <w:rPr>
-                <w:color w:val="262B33"/>
-                <w:sz w:val="16"/>
-              </w:rPr>
-              <w:t>05/20/2026</w:t>
-            </w:r>
-          </w:p>
-        </w:tc>
-        <w:tc>
-          <w:tcPr>
-            <w:tcW w:type="dxa" w:w="1440"/>
+            <w:tcW w:type="dxa" w:w="1260"/>
+          </w:tcPr>
+          <w:p>
+            <w:r>
+              <w:rPr>
+                <w:color w:val="262B33"/>
+                <w:sz w:val="16"/>
+              </w:rPr>
+              <w:t>Custom Built by Writer</w:t>
+            </w:r>
+          </w:p>
+        </w:tc>
+        <w:tc>
+          <w:tcPr>
+            <w:tcW w:type="dxa" w:w="1260"/>
+          </w:tcPr>
+          <w:p>
+            <w:r>
+              <w:rPr>
+                <w:color w:val="262B33"/>
+                <w:sz w:val="16"/>
+              </w:rPr>
+              <w:t>DOCX Template</w:t>
+            </w:r>
+          </w:p>
+        </w:tc>
+        <w:tc>
+          <w:tcPr>
+            <w:tcW w:type="dxa" w:w="1260"/>
           </w:tcPr>
           <w:p>
             <w:r>
@@ -10583,7 +10936,7 @@
         </w:tc>
         <w:tc>
           <w:tcPr>
-            <w:tcW w:type="dxa" w:w="1440"/>
+            <w:tcW w:type="dxa" w:w="1260"/>
           </w:tcPr>
           <w:p>
             <w:r>
@@ -10597,7 +10950,7 @@
         </w:tc>
         <w:tc>
           <w:tcPr>
-            <w:tcW w:type="dxa" w:w="1440"/>
+            <w:tcW w:type="dxa" w:w="1260"/>
           </w:tcPr>
           <w:p>
             <w:r>
@@ -10613,7 +10966,7 @@
       <w:tr>
         <w:tc>
           <w:tcPr>
-            <w:tcW w:type="dxa" w:w="1440"/>
+            <w:tcW w:type="dxa" w:w="1260"/>
           </w:tcPr>
           <w:p>
             <w:r>
@@ -10627,7 +10980,7 @@
         </w:tc>
         <w:tc>
           <w:tcPr>
-            <w:tcW w:type="dxa" w:w="1440"/>
+            <w:tcW w:type="dxa" w:w="1260"/>
           </w:tcPr>
           <w:p>
             <w:r>
@@ -10641,7 +10994,7 @@
         </w:tc>
         <w:tc>
           <w:tcPr>
-            <w:tcW w:type="dxa" w:w="1440"/>
+            <w:tcW w:type="dxa" w:w="1260"/>
           </w:tcPr>
           <w:p>
             <w:r>
@@ -10655,21 +11008,35 @@
         </w:tc>
         <w:tc>
           <w:tcPr>
-            <w:tcW w:type="dxa" w:w="1440"/>
-          </w:tcPr>
-          <w:p>
-            <w:r>
-              <w:rPr>
-                <w:color w:val="262B33"/>
-                <w:sz w:val="16"/>
-              </w:rPr>
-              <w:t>05/16/2026</w:t>
-            </w:r>
-          </w:p>
-        </w:tc>
-        <w:tc>
-          <w:tcPr>
-            <w:tcW w:type="dxa" w:w="1440"/>
+            <w:tcW w:type="dxa" w:w="1260"/>
+          </w:tcPr>
+          <w:p>
+            <w:r>
+              <w:rPr>
+                <w:color w:val="262B33"/>
+                <w:sz w:val="16"/>
+              </w:rPr>
+              <w:t>Custom Built by Writer</w:t>
+            </w:r>
+          </w:p>
+        </w:tc>
+        <w:tc>
+          <w:tcPr>
+            <w:tcW w:type="dxa" w:w="1260"/>
+          </w:tcPr>
+          <w:p>
+            <w:r>
+              <w:rPr>
+                <w:color w:val="262B33"/>
+                <w:sz w:val="16"/>
+              </w:rPr>
+              <w:t>DOCX Template</w:t>
+            </w:r>
+          </w:p>
+        </w:tc>
+        <w:tc>
+          <w:tcPr>
+            <w:tcW w:type="dxa" w:w="1260"/>
           </w:tcPr>
           <w:p>
             <w:r>
@@ -10683,7 +11050,7 @@
         </w:tc>
         <w:tc>
           <w:tcPr>
-            <w:tcW w:type="dxa" w:w="1440"/>
+            <w:tcW w:type="dxa" w:w="1260"/>
           </w:tcPr>
           <w:p>
             <w:r>
@@ -10697,7 +11064,7 @@
         </w:tc>
         <w:tc>
           <w:tcPr>
-            <w:tcW w:type="dxa" w:w="1440"/>
+            <w:tcW w:type="dxa" w:w="1260"/>
           </w:tcPr>
           <w:p>
             <w:r>
@@ -10713,7 +11080,7 @@
       <w:tr>
         <w:tc>
           <w:tcPr>
-            <w:tcW w:type="dxa" w:w="1440"/>
+            <w:tcW w:type="dxa" w:w="1260"/>
           </w:tcPr>
           <w:p>
             <w:r>
@@ -10727,7 +11094,7 @@
         </w:tc>
         <w:tc>
           <w:tcPr>
-            <w:tcW w:type="dxa" w:w="1440"/>
+            <w:tcW w:type="dxa" w:w="1260"/>
           </w:tcPr>
           <w:p>
             <w:r>
@@ -10741,7 +11108,7 @@
         </w:tc>
         <w:tc>
           <w:tcPr>
-            <w:tcW w:type="dxa" w:w="1440"/>
+            <w:tcW w:type="dxa" w:w="1260"/>
           </w:tcPr>
           <w:p>
             <w:r>
@@ -10755,21 +11122,35 @@
         </w:tc>
         <w:tc>
           <w:tcPr>
-            <w:tcW w:type="dxa" w:w="1440"/>
-          </w:tcPr>
-          <w:p>
-            <w:r>
-              <w:rPr>
-                <w:color w:val="262B33"/>
-                <w:sz w:val="16"/>
-              </w:rPr>
-              <w:t>05/19/2026</w:t>
-            </w:r>
-          </w:p>
-        </w:tc>
-        <w:tc>
-          <w:tcPr>
-            <w:tcW w:type="dxa" w:w="1440"/>
+            <w:tcW w:type="dxa" w:w="1260"/>
+          </w:tcPr>
+          <w:p>
+            <w:r>
+              <w:rPr>
+                <w:color w:val="262B33"/>
+                <w:sz w:val="16"/>
+              </w:rPr>
+              <w:t>Custom Built by Writer</w:t>
+            </w:r>
+          </w:p>
+        </w:tc>
+        <w:tc>
+          <w:tcPr>
+            <w:tcW w:type="dxa" w:w="1260"/>
+          </w:tcPr>
+          <w:p>
+            <w:r>
+              <w:rPr>
+                <w:color w:val="262B33"/>
+                <w:sz w:val="16"/>
+              </w:rPr>
+              <w:t>DOCX Template</w:t>
+            </w:r>
+          </w:p>
+        </w:tc>
+        <w:tc>
+          <w:tcPr>
+            <w:tcW w:type="dxa" w:w="1260"/>
           </w:tcPr>
           <w:p>
             <w:r>
@@ -10783,7 +11164,7 @@
         </w:tc>
         <w:tc>
           <w:tcPr>
-            <w:tcW w:type="dxa" w:w="1440"/>
+            <w:tcW w:type="dxa" w:w="1260"/>
           </w:tcPr>
           <w:p>
             <w:r>
@@ -10797,7 +11178,7 @@
         </w:tc>
         <w:tc>
           <w:tcPr>
-            <w:tcW w:type="dxa" w:w="1440"/>
+            <w:tcW w:type="dxa" w:w="1260"/>
           </w:tcPr>
           <w:p>
             <w:r>
@@ -10813,7 +11194,7 @@
       <w:tr>
         <w:tc>
           <w:tcPr>
-            <w:tcW w:type="dxa" w:w="1440"/>
+            <w:tcW w:type="dxa" w:w="1260"/>
           </w:tcPr>
           <w:p>
             <w:r>
@@ -10827,7 +11208,7 @@
         </w:tc>
         <w:tc>
           <w:tcPr>
-            <w:tcW w:type="dxa" w:w="1440"/>
+            <w:tcW w:type="dxa" w:w="1260"/>
           </w:tcPr>
           <w:p>
             <w:r>
@@ -10841,7 +11222,7 @@
         </w:tc>
         <w:tc>
           <w:tcPr>
-            <w:tcW w:type="dxa" w:w="1440"/>
+            <w:tcW w:type="dxa" w:w="1260"/>
           </w:tcPr>
           <w:p>
             <w:r>
@@ -10855,21 +11236,35 @@
         </w:tc>
         <w:tc>
           <w:tcPr>
-            <w:tcW w:type="dxa" w:w="1440"/>
-          </w:tcPr>
-          <w:p>
-            <w:r>
-              <w:rPr>
-                <w:color w:val="262B33"/>
-                <w:sz w:val="16"/>
-              </w:rPr>
-              <w:t>05/16/2026</w:t>
-            </w:r>
-          </w:p>
-        </w:tc>
-        <w:tc>
-          <w:tcPr>
-            <w:tcW w:type="dxa" w:w="1440"/>
+            <w:tcW w:type="dxa" w:w="1260"/>
+          </w:tcPr>
+          <w:p>
+            <w:r>
+              <w:rPr>
+                <w:color w:val="262B33"/>
+                <w:sz w:val="16"/>
+              </w:rPr>
+              <w:t>Custom Built by Writer</w:t>
+            </w:r>
+          </w:p>
+        </w:tc>
+        <w:tc>
+          <w:tcPr>
+            <w:tcW w:type="dxa" w:w="1260"/>
+          </w:tcPr>
+          <w:p>
+            <w:r>
+              <w:rPr>
+                <w:color w:val="262B33"/>
+                <w:sz w:val="16"/>
+              </w:rPr>
+              <w:t>DOCX Template</w:t>
+            </w:r>
+          </w:p>
+        </w:tc>
+        <w:tc>
+          <w:tcPr>
+            <w:tcW w:type="dxa" w:w="1260"/>
           </w:tcPr>
           <w:p>
             <w:r>
@@ -10883,7 +11278,7 @@
         </w:tc>
         <w:tc>
           <w:tcPr>
-            <w:tcW w:type="dxa" w:w="1440"/>
+            <w:tcW w:type="dxa" w:w="1260"/>
           </w:tcPr>
           <w:p>
             <w:r>
@@ -10897,7 +11292,7 @@
         </w:tc>
         <w:tc>
           <w:tcPr>
-            <w:tcW w:type="dxa" w:w="1440"/>
+            <w:tcW w:type="dxa" w:w="1260"/>
           </w:tcPr>
           <w:p>
             <w:r>
@@ -10913,7 +11308,7 @@
       <w:tr>
         <w:tc>
           <w:tcPr>
-            <w:tcW w:type="dxa" w:w="1440"/>
+            <w:tcW w:type="dxa" w:w="1260"/>
           </w:tcPr>
           <w:p>
             <w:r>
@@ -10927,7 +11322,7 @@
         </w:tc>
         <w:tc>
           <w:tcPr>
-            <w:tcW w:type="dxa" w:w="1440"/>
+            <w:tcW w:type="dxa" w:w="1260"/>
           </w:tcPr>
           <w:p>
             <w:r>
@@ -10941,7 +11336,7 @@
         </w:tc>
         <w:tc>
           <w:tcPr>
-            <w:tcW w:type="dxa" w:w="1440"/>
+            <w:tcW w:type="dxa" w:w="1260"/>
           </w:tcPr>
           <w:p>
             <w:r>
@@ -10955,21 +11350,35 @@
         </w:tc>
         <w:tc>
           <w:tcPr>
-            <w:tcW w:type="dxa" w:w="1440"/>
-          </w:tcPr>
-          <w:p>
-            <w:r>
-              <w:rPr>
-                <w:color w:val="262B33"/>
-                <w:sz w:val="16"/>
-              </w:rPr>
-              <w:t>03/15/2026</w:t>
-            </w:r>
-          </w:p>
-        </w:tc>
-        <w:tc>
-          <w:tcPr>
-            <w:tcW w:type="dxa" w:w="1440"/>
+            <w:tcW w:type="dxa" w:w="1260"/>
+          </w:tcPr>
+          <w:p>
+            <w:r>
+              <w:rPr>
+                <w:color w:val="262B33"/>
+                <w:sz w:val="16"/>
+              </w:rPr>
+              <w:t>Custom Built by Writer</w:t>
+            </w:r>
+          </w:p>
+        </w:tc>
+        <w:tc>
+          <w:tcPr>
+            <w:tcW w:type="dxa" w:w="1260"/>
+          </w:tcPr>
+          <w:p>
+            <w:r>
+              <w:rPr>
+                <w:color w:val="262B33"/>
+                <w:sz w:val="16"/>
+              </w:rPr>
+              <w:t>DOCX Template</w:t>
+            </w:r>
+          </w:p>
+        </w:tc>
+        <w:tc>
+          <w:tcPr>
+            <w:tcW w:type="dxa" w:w="1260"/>
           </w:tcPr>
           <w:p>
             <w:r>
@@ -10983,7 +11392,7 @@
         </w:tc>
         <w:tc>
           <w:tcPr>
-            <w:tcW w:type="dxa" w:w="1440"/>
+            <w:tcW w:type="dxa" w:w="1260"/>
           </w:tcPr>
           <w:p>
             <w:r>
@@ -10997,7 +11406,7 @@
         </w:tc>
         <w:tc>
           <w:tcPr>
-            <w:tcW w:type="dxa" w:w="1440"/>
+            <w:tcW w:type="dxa" w:w="1260"/>
           </w:tcPr>
           <w:p>
             <w:r>
@@ -11013,7 +11422,7 @@
       <w:tr>
         <w:tc>
           <w:tcPr>
-            <w:tcW w:type="dxa" w:w="1440"/>
+            <w:tcW w:type="dxa" w:w="1260"/>
           </w:tcPr>
           <w:p>
             <w:r>
@@ -11027,7 +11436,7 @@
         </w:tc>
         <w:tc>
           <w:tcPr>
-            <w:tcW w:type="dxa" w:w="1440"/>
+            <w:tcW w:type="dxa" w:w="1260"/>
           </w:tcPr>
           <w:p>
             <w:r>
@@ -11041,7 +11450,7 @@
         </w:tc>
         <w:tc>
           <w:tcPr>
-            <w:tcW w:type="dxa" w:w="1440"/>
+            <w:tcW w:type="dxa" w:w="1260"/>
           </w:tcPr>
           <w:p>
             <w:r>
@@ -11055,21 +11464,35 @@
         </w:tc>
         <w:tc>
           <w:tcPr>
-            <w:tcW w:type="dxa" w:w="1440"/>
-          </w:tcPr>
-          <w:p>
-            <w:r>
-              <w:rPr>
-                <w:color w:val="262B33"/>
-                <w:sz w:val="16"/>
-              </w:rPr>
-              <w:t>05/20/2026</w:t>
-            </w:r>
-          </w:p>
-        </w:tc>
-        <w:tc>
-          <w:tcPr>
-            <w:tcW w:type="dxa" w:w="1440"/>
+            <w:tcW w:type="dxa" w:w="1260"/>
+          </w:tcPr>
+          <w:p>
+            <w:r>
+              <w:rPr>
+                <w:color w:val="262B33"/>
+                <w:sz w:val="16"/>
+              </w:rPr>
+              <w:t>Custom Built by Writer</w:t>
+            </w:r>
+          </w:p>
+        </w:tc>
+        <w:tc>
+          <w:tcPr>
+            <w:tcW w:type="dxa" w:w="1260"/>
+          </w:tcPr>
+          <w:p>
+            <w:r>
+              <w:rPr>
+                <w:color w:val="262B33"/>
+                <w:sz w:val="16"/>
+              </w:rPr>
+              <w:t>DOCX Template</w:t>
+            </w:r>
+          </w:p>
+        </w:tc>
+        <w:tc>
+          <w:tcPr>
+            <w:tcW w:type="dxa" w:w="1260"/>
           </w:tcPr>
           <w:p>
             <w:r>
@@ -11083,7 +11506,7 @@
         </w:tc>
         <w:tc>
           <w:tcPr>
-            <w:tcW w:type="dxa" w:w="1440"/>
+            <w:tcW w:type="dxa" w:w="1260"/>
           </w:tcPr>
           <w:p>
             <w:r>
@@ -11097,7 +11520,7 @@
         </w:tc>
         <w:tc>
           <w:tcPr>
-            <w:tcW w:type="dxa" w:w="1440"/>
+            <w:tcW w:type="dxa" w:w="1260"/>
           </w:tcPr>
           <w:p>
             <w:r>
@@ -11113,7 +11536,7 @@
       <w:tr>
         <w:tc>
           <w:tcPr>
-            <w:tcW w:type="dxa" w:w="1440"/>
+            <w:tcW w:type="dxa" w:w="1260"/>
           </w:tcPr>
           <w:p>
             <w:r>
@@ -11127,7 +11550,7 @@
         </w:tc>
         <w:tc>
           <w:tcPr>
-            <w:tcW w:type="dxa" w:w="1440"/>
+            <w:tcW w:type="dxa" w:w="1260"/>
           </w:tcPr>
           <w:p>
             <w:r>
@@ -11141,7 +11564,7 @@
         </w:tc>
         <w:tc>
           <w:tcPr>
-            <w:tcW w:type="dxa" w:w="1440"/>
+            <w:tcW w:type="dxa" w:w="1260"/>
           </w:tcPr>
           <w:p>
             <w:r>
@@ -11155,21 +11578,35 @@
         </w:tc>
         <w:tc>
           <w:tcPr>
-            <w:tcW w:type="dxa" w:w="1440"/>
-          </w:tcPr>
-          <w:p>
-            <w:r>
-              <w:rPr>
-                <w:color w:val="262B33"/>
-                <w:sz w:val="16"/>
-              </w:rPr>
-              <w:t>05/20/2026</w:t>
-            </w:r>
-          </w:p>
-        </w:tc>
-        <w:tc>
-          <w:tcPr>
-            <w:tcW w:type="dxa" w:w="1440"/>
+            <w:tcW w:type="dxa" w:w="1260"/>
+          </w:tcPr>
+          <w:p>
+            <w:r>
+              <w:rPr>
+                <w:color w:val="262B33"/>
+                <w:sz w:val="16"/>
+              </w:rPr>
+              <w:t>Writer Produced Media</w:t>
+            </w:r>
+          </w:p>
+        </w:tc>
+        <w:tc>
+          <w:tcPr>
+            <w:tcW w:type="dxa" w:w="1260"/>
+          </w:tcPr>
+          <w:p>
+            <w:r>
+              <w:rPr>
+                <w:color w:val="262B33"/>
+                <w:sz w:val="16"/>
+              </w:rPr>
+              <w:t>Writer Image Tool</w:t>
+            </w:r>
+          </w:p>
+        </w:tc>
+        <w:tc>
+          <w:tcPr>
+            <w:tcW w:type="dxa" w:w="1260"/>
           </w:tcPr>
           <w:p>
             <w:r>
@@ -11183,7 +11620,7 @@
         </w:tc>
         <w:tc>
           <w:tcPr>
-            <w:tcW w:type="dxa" w:w="1440"/>
+            <w:tcW w:type="dxa" w:w="1260"/>
           </w:tcPr>
           <w:p>
             <w:r>
@@ -11197,7 +11634,7 @@
         </w:tc>
         <w:tc>
           <w:tcPr>
-            <w:tcW w:type="dxa" w:w="1440"/>
+            <w:tcW w:type="dxa" w:w="1260"/>
           </w:tcPr>
           <w:p>
             <w:r>
@@ -11213,7 +11650,7 @@
       <w:tr>
         <w:tc>
           <w:tcPr>
-            <w:tcW w:type="dxa" w:w="1440"/>
+            <w:tcW w:type="dxa" w:w="1260"/>
           </w:tcPr>
           <w:p>
             <w:r>
@@ -11227,7 +11664,7 @@
         </w:tc>
         <w:tc>
           <w:tcPr>
-            <w:tcW w:type="dxa" w:w="1440"/>
+            <w:tcW w:type="dxa" w:w="1260"/>
           </w:tcPr>
           <w:p>
             <w:r>
@@ -11241,7 +11678,7 @@
         </w:tc>
         <w:tc>
           <w:tcPr>
-            <w:tcW w:type="dxa" w:w="1440"/>
+            <w:tcW w:type="dxa" w:w="1260"/>
           </w:tcPr>
           <w:p>
             <w:r>
@@ -11255,21 +11692,35 @@
         </w:tc>
         <w:tc>
           <w:tcPr>
-            <w:tcW w:type="dxa" w:w="1440"/>
-          </w:tcPr>
-          <w:p>
-            <w:r>
-              <w:rPr>
-                <w:color w:val="262B33"/>
-                <w:sz w:val="16"/>
-              </w:rPr>
-              <w:t>05/19/2026</w:t>
-            </w:r>
-          </w:p>
-        </w:tc>
-        <w:tc>
-          <w:tcPr>
-            <w:tcW w:type="dxa" w:w="1440"/>
+            <w:tcW w:type="dxa" w:w="1260"/>
+          </w:tcPr>
+          <w:p>
+            <w:r>
+              <w:rPr>
+                <w:color w:val="262B33"/>
+                <w:sz w:val="16"/>
+              </w:rPr>
+              <w:t>Writer Produced Media</w:t>
+            </w:r>
+          </w:p>
+        </w:tc>
+        <w:tc>
+          <w:tcPr>
+            <w:tcW w:type="dxa" w:w="1260"/>
+          </w:tcPr>
+          <w:p>
+            <w:r>
+              <w:rPr>
+                <w:color w:val="262B33"/>
+                <w:sz w:val="16"/>
+              </w:rPr>
+              <w:t>Writer Image Tool</w:t>
+            </w:r>
+          </w:p>
+        </w:tc>
+        <w:tc>
+          <w:tcPr>
+            <w:tcW w:type="dxa" w:w="1260"/>
           </w:tcPr>
           <w:p>
             <w:r>
@@ -11283,7 +11734,7 @@
         </w:tc>
         <w:tc>
           <w:tcPr>
-            <w:tcW w:type="dxa" w:w="1440"/>
+            <w:tcW w:type="dxa" w:w="1260"/>
           </w:tcPr>
           <w:p>
             <w:r>
@@ -11297,7 +11748,7 @@
         </w:tc>
         <w:tc>
           <w:tcPr>
-            <w:tcW w:type="dxa" w:w="1440"/>
+            <w:tcW w:type="dxa" w:w="1260"/>
           </w:tcPr>
           <w:p>
             <w:r>
@@ -11333,18 +11784,19 @@
         </w:tblBorders>
       </w:tblPr>
       <w:tblGrid>
-        <w:gridCol w:w="1440"/>
-        <w:gridCol w:w="1440"/>
-        <w:gridCol w:w="1440"/>
-        <w:gridCol w:w="1440"/>
-        <w:gridCol w:w="1440"/>
-        <w:gridCol w:w="1440"/>
-        <w:gridCol w:w="1440"/>
+        <w:gridCol w:w="1260"/>
+        <w:gridCol w:w="1260"/>
+        <w:gridCol w:w="1260"/>
+        <w:gridCol w:w="1260"/>
+        <w:gridCol w:w="1260"/>
+        <w:gridCol w:w="1260"/>
+        <w:gridCol w:w="1260"/>
+        <w:gridCol w:w="1260"/>
       </w:tblGrid>
       <w:tr>
         <w:tc>
           <w:tcPr>
-            <w:tcW w:type="dxa" w:w="1440"/>
+            <w:tcW w:type="dxa" w:w="1260"/>
             <w:shd w:val="clear" w:color="auto" w:fill="4472C4"/>
           </w:tcPr>
           <w:p>
@@ -11360,7 +11812,7 @@
         </w:tc>
         <w:tc>
           <w:tcPr>
-            <w:tcW w:type="dxa" w:w="1440"/>
+            <w:tcW w:type="dxa" w:w="1260"/>
             <w:shd w:val="clear" w:color="auto" w:fill="4472C4"/>
           </w:tcPr>
           <w:p>
@@ -11376,7 +11828,7 @@
         </w:tc>
         <w:tc>
           <w:tcPr>
-            <w:tcW w:type="dxa" w:w="1440"/>
+            <w:tcW w:type="dxa" w:w="1260"/>
             <w:shd w:val="clear" w:color="auto" w:fill="4472C4"/>
           </w:tcPr>
           <w:p>
@@ -11392,7 +11844,7 @@
         </w:tc>
         <w:tc>
           <w:tcPr>
-            <w:tcW w:type="dxa" w:w="1440"/>
+            <w:tcW w:type="dxa" w:w="1260"/>
             <w:shd w:val="clear" w:color="auto" w:fill="4472C4"/>
           </w:tcPr>
           <w:p>
@@ -11402,13 +11854,13 @@
                 <w:color w:val="FFFFFF"/>
                 <w:sz w:val="16"/>
               </w:rPr>
-              <w:t>Date</w:t>
-            </w:r>
-          </w:p>
-        </w:tc>
-        <w:tc>
-          <w:tcPr>
-            <w:tcW w:type="dxa" w:w="1440"/>
+              <w:t>Source</w:t>
+            </w:r>
+          </w:p>
+        </w:tc>
+        <w:tc>
+          <w:tcPr>
+            <w:tcW w:type="dxa" w:w="1260"/>
             <w:shd w:val="clear" w:color="auto" w:fill="4472C4"/>
           </w:tcPr>
           <w:p>
@@ -11418,13 +11870,13 @@
                 <w:color w:val="FFFFFF"/>
                 <w:sz w:val="16"/>
               </w:rPr>
-              <w:t>Reference File Origin</w:t>
-            </w:r>
-          </w:p>
-        </w:tc>
-        <w:tc>
-          <w:tcPr>
-            <w:tcW w:type="dxa" w:w="1440"/>
+              <w:t>Tool</w:t>
+            </w:r>
+          </w:p>
+        </w:tc>
+        <w:tc>
+          <w:tcPr>
+            <w:tcW w:type="dxa" w:w="1260"/>
             <w:shd w:val="clear" w:color="auto" w:fill="4472C4"/>
           </w:tcPr>
           <w:p>
@@ -11434,13 +11886,13 @@
                 <w:color w:val="FFFFFF"/>
                 <w:sz w:val="16"/>
               </w:rPr>
-              <w:t>Description</w:t>
-            </w:r>
-          </w:p>
-        </w:tc>
-        <w:tc>
-          <w:tcPr>
-            <w:tcW w:type="dxa" w:w="1440"/>
+              <w:t>Reference File Origin</w:t>
+            </w:r>
+          </w:p>
+        </w:tc>
+        <w:tc>
+          <w:tcPr>
+            <w:tcW w:type="dxa" w:w="1260"/>
             <w:shd w:val="clear" w:color="auto" w:fill="4472C4"/>
           </w:tcPr>
           <w:p>
@@ -11450,6 +11902,22 @@
                 <w:color w:val="FFFFFF"/>
                 <w:sz w:val="16"/>
               </w:rPr>
+              <w:t>Description</w:t>
+            </w:r>
+          </w:p>
+        </w:tc>
+        <w:tc>
+          <w:tcPr>
+            <w:tcW w:type="dxa" w:w="1260"/>
+            <w:shd w:val="clear" w:color="auto" w:fill="4472C4"/>
+          </w:tcPr>
+          <w:p>
+            <w:r>
+              <w:rPr>
+                <w:b/>
+                <w:color w:val="FFFFFF"/>
+                <w:sz w:val="16"/>
+              </w:rPr>
               <w:t>Pearls, Traps, and Friction</w:t>
             </w:r>
           </w:p>
@@ -11458,7 +11926,7 @@
       <w:tr>
         <w:tc>
           <w:tcPr>
-            <w:tcW w:type="dxa" w:w="1440"/>
+            <w:tcW w:type="dxa" w:w="1260"/>
           </w:tcPr>
           <w:p>
             <w:r>
@@ -11472,7 +11940,7 @@
         </w:tc>
         <w:tc>
           <w:tcPr>
-            <w:tcW w:type="dxa" w:w="1440"/>
+            <w:tcW w:type="dxa" w:w="1260"/>
           </w:tcPr>
           <w:p>
             <w:r>
@@ -11486,7 +11954,7 @@
         </w:tc>
         <w:tc>
           <w:tcPr>
-            <w:tcW w:type="dxa" w:w="1440"/>
+            <w:tcW w:type="dxa" w:w="1260"/>
           </w:tcPr>
           <w:p>
             <w:r>
@@ -11500,21 +11968,35 @@
         </w:tc>
         <w:tc>
           <w:tcPr>
-            <w:tcW w:type="dxa" w:w="1440"/>
-          </w:tcPr>
-          <w:p>
-            <w:r>
-              <w:rPr>
-                <w:color w:val="262B33"/>
-                <w:sz w:val="16"/>
-              </w:rPr>
-              <w:t>05/21/2026</w:t>
-            </w:r>
-          </w:p>
-        </w:tc>
-        <w:tc>
-          <w:tcPr>
-            <w:tcW w:type="dxa" w:w="1440"/>
+            <w:tcW w:type="dxa" w:w="1260"/>
+          </w:tcPr>
+          <w:p>
+            <w:r>
+              <w:rPr>
+                <w:color w:val="262B33"/>
+                <w:sz w:val="16"/>
+              </w:rPr>
+              <w:t>Custom Built by Writer</w:t>
+            </w:r>
+          </w:p>
+        </w:tc>
+        <w:tc>
+          <w:tcPr>
+            <w:tcW w:type="dxa" w:w="1260"/>
+          </w:tcPr>
+          <w:p>
+            <w:r>
+              <w:rPr>
+                <w:color w:val="262B33"/>
+                <w:sz w:val="16"/>
+              </w:rPr>
+              <w:t>DOCX Template</w:t>
+            </w:r>
+          </w:p>
+        </w:tc>
+        <w:tc>
+          <w:tcPr>
+            <w:tcW w:type="dxa" w:w="1260"/>
           </w:tcPr>
           <w:p>
             <w:r>
@@ -11528,7 +12010,7 @@
         </w:tc>
         <w:tc>
           <w:tcPr>
-            <w:tcW w:type="dxa" w:w="1440"/>
+            <w:tcW w:type="dxa" w:w="1260"/>
           </w:tcPr>
           <w:p>
             <w:r>
@@ -11542,7 +12024,7 @@
         </w:tc>
         <w:tc>
           <w:tcPr>
-            <w:tcW w:type="dxa" w:w="1440"/>
+            <w:tcW w:type="dxa" w:w="1260"/>
           </w:tcPr>
           <w:p>
             <w:r>
@@ -11558,7 +12040,7 @@
       <w:tr>
         <w:tc>
           <w:tcPr>
-            <w:tcW w:type="dxa" w:w="1440"/>
+            <w:tcW w:type="dxa" w:w="1260"/>
           </w:tcPr>
           <w:p>
             <w:r>
@@ -11572,7 +12054,7 @@
         </w:tc>
         <w:tc>
           <w:tcPr>
-            <w:tcW w:type="dxa" w:w="1440"/>
+            <w:tcW w:type="dxa" w:w="1260"/>
           </w:tcPr>
           <w:p>
             <w:r>
@@ -11586,7 +12068,7 @@
         </w:tc>
         <w:tc>
           <w:tcPr>
-            <w:tcW w:type="dxa" w:w="1440"/>
+            <w:tcW w:type="dxa" w:w="1260"/>
           </w:tcPr>
           <w:p>
             <w:r>
@@ -11600,21 +12082,35 @@
         </w:tc>
         <w:tc>
           <w:tcPr>
-            <w:tcW w:type="dxa" w:w="1440"/>
-          </w:tcPr>
-          <w:p>
-            <w:r>
-              <w:rPr>
-                <w:color w:val="262B33"/>
-                <w:sz w:val="16"/>
-              </w:rPr>
-              <w:t>05/21/2026</w:t>
-            </w:r>
-          </w:p>
-        </w:tc>
-        <w:tc>
-          <w:tcPr>
-            <w:tcW w:type="dxa" w:w="1440"/>
+            <w:tcW w:type="dxa" w:w="1260"/>
+          </w:tcPr>
+          <w:p>
+            <w:r>
+              <w:rPr>
+                <w:color w:val="262B33"/>
+                <w:sz w:val="16"/>
+              </w:rPr>
+              <w:t>Custom Built by Writer</w:t>
+            </w:r>
+          </w:p>
+        </w:tc>
+        <w:tc>
+          <w:tcPr>
+            <w:tcW w:type="dxa" w:w="1260"/>
+          </w:tcPr>
+          <w:p>
+            <w:r>
+              <w:rPr>
+                <w:color w:val="262B33"/>
+                <w:sz w:val="16"/>
+              </w:rPr>
+              <w:t>DOCX Template</w:t>
+            </w:r>
+          </w:p>
+        </w:tc>
+        <w:tc>
+          <w:tcPr>
+            <w:tcW w:type="dxa" w:w="1260"/>
           </w:tcPr>
           <w:p>
             <w:r>
@@ -11628,7 +12124,7 @@
         </w:tc>
         <w:tc>
           <w:tcPr>
-            <w:tcW w:type="dxa" w:w="1440"/>
+            <w:tcW w:type="dxa" w:w="1260"/>
           </w:tcPr>
           <w:p>
             <w:r>
@@ -11642,7 +12138,7 @@
         </w:tc>
         <w:tc>
           <w:tcPr>
-            <w:tcW w:type="dxa" w:w="1440"/>
+            <w:tcW w:type="dxa" w:w="1260"/>
           </w:tcPr>
           <w:p>
             <w:r>
@@ -11658,7 +12154,7 @@
       <w:tr>
         <w:tc>
           <w:tcPr>
-            <w:tcW w:type="dxa" w:w="1440"/>
+            <w:tcW w:type="dxa" w:w="1260"/>
           </w:tcPr>
           <w:p>
             <w:r>
@@ -11672,7 +12168,7 @@
         </w:tc>
         <w:tc>
           <w:tcPr>
-            <w:tcW w:type="dxa" w:w="1440"/>
+            <w:tcW w:type="dxa" w:w="1260"/>
           </w:tcPr>
           <w:p>
             <w:r>
@@ -11686,7 +12182,7 @@
         </w:tc>
         <w:tc>
           <w:tcPr>
-            <w:tcW w:type="dxa" w:w="1440"/>
+            <w:tcW w:type="dxa" w:w="1260"/>
           </w:tcPr>
           <w:p>
             <w:r>
@@ -11700,21 +12196,35 @@
         </w:tc>
         <w:tc>
           <w:tcPr>
-            <w:tcW w:type="dxa" w:w="1440"/>
-          </w:tcPr>
-          <w:p>
-            <w:r>
-              <w:rPr>
-                <w:color w:val="262B33"/>
-                <w:sz w:val="16"/>
-              </w:rPr>
-              <w:t>05/23/2026</w:t>
-            </w:r>
-          </w:p>
-        </w:tc>
-        <w:tc>
-          <w:tcPr>
-            <w:tcW w:type="dxa" w:w="1440"/>
+            <w:tcW w:type="dxa" w:w="1260"/>
+          </w:tcPr>
+          <w:p>
+            <w:r>
+              <w:rPr>
+                <w:color w:val="262B33"/>
+                <w:sz w:val="16"/>
+              </w:rPr>
+              <w:t>Custom Built by Writer</w:t>
+            </w:r>
+          </w:p>
+        </w:tc>
+        <w:tc>
+          <w:tcPr>
+            <w:tcW w:type="dxa" w:w="1260"/>
+          </w:tcPr>
+          <w:p>
+            <w:r>
+              <w:rPr>
+                <w:color w:val="262B33"/>
+                <w:sz w:val="16"/>
+              </w:rPr>
+              <w:t>DOCX Template</w:t>
+            </w:r>
+          </w:p>
+        </w:tc>
+        <w:tc>
+          <w:tcPr>
+            <w:tcW w:type="dxa" w:w="1260"/>
           </w:tcPr>
           <w:p>
             <w:r>
@@ -11728,7 +12238,7 @@
         </w:tc>
         <w:tc>
           <w:tcPr>
-            <w:tcW w:type="dxa" w:w="1440"/>
+            <w:tcW w:type="dxa" w:w="1260"/>
           </w:tcPr>
           <w:p>
             <w:r>
@@ -11742,7 +12252,7 @@
         </w:tc>
         <w:tc>
           <w:tcPr>
-            <w:tcW w:type="dxa" w:w="1440"/>
+            <w:tcW w:type="dxa" w:w="1260"/>
           </w:tcPr>
           <w:p>
             <w:r>
@@ -11758,7 +12268,7 @@
       <w:tr>
         <w:tc>
           <w:tcPr>
-            <w:tcW w:type="dxa" w:w="1440"/>
+            <w:tcW w:type="dxa" w:w="1260"/>
           </w:tcPr>
           <w:p>
             <w:r>
@@ -11772,7 +12282,7 @@
         </w:tc>
         <w:tc>
           <w:tcPr>
-            <w:tcW w:type="dxa" w:w="1440"/>
+            <w:tcW w:type="dxa" w:w="1260"/>
           </w:tcPr>
           <w:p>
             <w:r>
@@ -11786,7 +12296,7 @@
         </w:tc>
         <w:tc>
           <w:tcPr>
-            <w:tcW w:type="dxa" w:w="1440"/>
+            <w:tcW w:type="dxa" w:w="1260"/>
           </w:tcPr>
           <w:p>
             <w:r>
@@ -11800,21 +12310,35 @@
         </w:tc>
         <w:tc>
           <w:tcPr>
-            <w:tcW w:type="dxa" w:w="1440"/>
-          </w:tcPr>
-          <w:p>
-            <w:r>
-              <w:rPr>
-                <w:color w:val="262B33"/>
-                <w:sz w:val="16"/>
-              </w:rPr>
-              <w:t>05/23/2026</w:t>
-            </w:r>
-          </w:p>
-        </w:tc>
-        <w:tc>
-          <w:tcPr>
-            <w:tcW w:type="dxa" w:w="1440"/>
+            <w:tcW w:type="dxa" w:w="1260"/>
+          </w:tcPr>
+          <w:p>
+            <w:r>
+              <w:rPr>
+                <w:color w:val="262B33"/>
+                <w:sz w:val="16"/>
+              </w:rPr>
+              <w:t>Custom Built by Writer</w:t>
+            </w:r>
+          </w:p>
+        </w:tc>
+        <w:tc>
+          <w:tcPr>
+            <w:tcW w:type="dxa" w:w="1260"/>
+          </w:tcPr>
+          <w:p>
+            <w:r>
+              <w:rPr>
+                <w:color w:val="262B33"/>
+                <w:sz w:val="16"/>
+              </w:rPr>
+              <w:t>DOCX Template</w:t>
+            </w:r>
+          </w:p>
+        </w:tc>
+        <w:tc>
+          <w:tcPr>
+            <w:tcW w:type="dxa" w:w="1260"/>
           </w:tcPr>
           <w:p>
             <w:r>
@@ -11828,7 +12352,7 @@
         </w:tc>
         <w:tc>
           <w:tcPr>
-            <w:tcW w:type="dxa" w:w="1440"/>
+            <w:tcW w:type="dxa" w:w="1260"/>
           </w:tcPr>
           <w:p>
             <w:r>
@@ -11842,7 +12366,7 @@
         </w:tc>
         <w:tc>
           <w:tcPr>
-            <w:tcW w:type="dxa" w:w="1440"/>
+            <w:tcW w:type="dxa" w:w="1260"/>
           </w:tcPr>
           <w:p>
             <w:r>
@@ -11858,7 +12382,7 @@
       <w:tr>
         <w:tc>
           <w:tcPr>
-            <w:tcW w:type="dxa" w:w="1440"/>
+            <w:tcW w:type="dxa" w:w="1260"/>
           </w:tcPr>
           <w:p>
             <w:r>
@@ -11872,7 +12396,7 @@
         </w:tc>
         <w:tc>
           <w:tcPr>
-            <w:tcW w:type="dxa" w:w="1440"/>
+            <w:tcW w:type="dxa" w:w="1260"/>
           </w:tcPr>
           <w:p>
             <w:r>
@@ -11886,7 +12410,7 @@
         </w:tc>
         <w:tc>
           <w:tcPr>
-            <w:tcW w:type="dxa" w:w="1440"/>
+            <w:tcW w:type="dxa" w:w="1260"/>
           </w:tcPr>
           <w:p>
             <w:r>
@@ -11900,21 +12424,35 @@
         </w:tc>
         <w:tc>
           <w:tcPr>
-            <w:tcW w:type="dxa" w:w="1440"/>
-          </w:tcPr>
-          <w:p>
-            <w:r>
-              <w:rPr>
-                <w:color w:val="262B33"/>
-                <w:sz w:val="16"/>
-              </w:rPr>
-              <w:t>05/24/2026</w:t>
-            </w:r>
-          </w:p>
-        </w:tc>
-        <w:tc>
-          <w:tcPr>
-            <w:tcW w:type="dxa" w:w="1440"/>
+            <w:tcW w:type="dxa" w:w="1260"/>
+          </w:tcPr>
+          <w:p>
+            <w:r>
+              <w:rPr>
+                <w:color w:val="262B33"/>
+                <w:sz w:val="16"/>
+              </w:rPr>
+              <w:t>Custom Built by Writer</w:t>
+            </w:r>
+          </w:p>
+        </w:tc>
+        <w:tc>
+          <w:tcPr>
+            <w:tcW w:type="dxa" w:w="1260"/>
+          </w:tcPr>
+          <w:p>
+            <w:r>
+              <w:rPr>
+                <w:color w:val="262B33"/>
+                <w:sz w:val="16"/>
+              </w:rPr>
+              <w:t>DOCX Template</w:t>
+            </w:r>
+          </w:p>
+        </w:tc>
+        <w:tc>
+          <w:tcPr>
+            <w:tcW w:type="dxa" w:w="1260"/>
           </w:tcPr>
           <w:p>
             <w:r>
@@ -11928,7 +12466,7 @@
         </w:tc>
         <w:tc>
           <w:tcPr>
-            <w:tcW w:type="dxa" w:w="1440"/>
+            <w:tcW w:type="dxa" w:w="1260"/>
           </w:tcPr>
           <w:p>
             <w:r>
@@ -11942,7 +12480,7 @@
         </w:tc>
         <w:tc>
           <w:tcPr>
-            <w:tcW w:type="dxa" w:w="1440"/>
+            <w:tcW w:type="dxa" w:w="1260"/>
           </w:tcPr>
           <w:p>
             <w:r>
@@ -11958,7 +12496,7 @@
       <w:tr>
         <w:tc>
           <w:tcPr>
-            <w:tcW w:type="dxa" w:w="1440"/>
+            <w:tcW w:type="dxa" w:w="1260"/>
           </w:tcPr>
           <w:p>
             <w:r>
@@ -11972,7 +12510,7 @@
         </w:tc>
         <w:tc>
           <w:tcPr>
-            <w:tcW w:type="dxa" w:w="1440"/>
+            <w:tcW w:type="dxa" w:w="1260"/>
           </w:tcPr>
           <w:p>
             <w:r>
@@ -11986,7 +12524,7 @@
         </w:tc>
         <w:tc>
           <w:tcPr>
-            <w:tcW w:type="dxa" w:w="1440"/>
+            <w:tcW w:type="dxa" w:w="1260"/>
           </w:tcPr>
           <w:p>
             <w:r>
@@ -12000,21 +12538,35 @@
         </w:tc>
         <w:tc>
           <w:tcPr>
-            <w:tcW w:type="dxa" w:w="1440"/>
-          </w:tcPr>
-          <w:p>
-            <w:r>
-              <w:rPr>
-                <w:color w:val="262B33"/>
-                <w:sz w:val="16"/>
-              </w:rPr>
-              <w:t>05/25/2026</w:t>
-            </w:r>
-          </w:p>
-        </w:tc>
-        <w:tc>
-          <w:tcPr>
-            <w:tcW w:type="dxa" w:w="1440"/>
+            <w:tcW w:type="dxa" w:w="1260"/>
+          </w:tcPr>
+          <w:p>
+            <w:r>
+              <w:rPr>
+                <w:color w:val="262B33"/>
+                <w:sz w:val="16"/>
+              </w:rPr>
+              <w:t>Custom Built by Writer</w:t>
+            </w:r>
+          </w:p>
+        </w:tc>
+        <w:tc>
+          <w:tcPr>
+            <w:tcW w:type="dxa" w:w="1260"/>
+          </w:tcPr>
+          <w:p>
+            <w:r>
+              <w:rPr>
+                <w:color w:val="262B33"/>
+                <w:sz w:val="16"/>
+              </w:rPr>
+              <w:t>DOCX Template</w:t>
+            </w:r>
+          </w:p>
+        </w:tc>
+        <w:tc>
+          <w:tcPr>
+            <w:tcW w:type="dxa" w:w="1260"/>
           </w:tcPr>
           <w:p>
             <w:r>
@@ -12028,7 +12580,7 @@
         </w:tc>
         <w:tc>
           <w:tcPr>
-            <w:tcW w:type="dxa" w:w="1440"/>
+            <w:tcW w:type="dxa" w:w="1260"/>
           </w:tcPr>
           <w:p>
             <w:r>
@@ -12042,7 +12594,7 @@
         </w:tc>
         <w:tc>
           <w:tcPr>
-            <w:tcW w:type="dxa" w:w="1440"/>
+            <w:tcW w:type="dxa" w:w="1260"/>
           </w:tcPr>
           <w:p>
             <w:r>
@@ -12058,7 +12610,7 @@
       <w:tr>
         <w:tc>
           <w:tcPr>
-            <w:tcW w:type="dxa" w:w="1440"/>
+            <w:tcW w:type="dxa" w:w="1260"/>
           </w:tcPr>
           <w:p>
             <w:r>
@@ -12072,7 +12624,7 @@
         </w:tc>
         <w:tc>
           <w:tcPr>
-            <w:tcW w:type="dxa" w:w="1440"/>
+            <w:tcW w:type="dxa" w:w="1260"/>
           </w:tcPr>
           <w:p>
             <w:r>
@@ -12086,7 +12638,7 @@
         </w:tc>
         <w:tc>
           <w:tcPr>
-            <w:tcW w:type="dxa" w:w="1440"/>
+            <w:tcW w:type="dxa" w:w="1260"/>
           </w:tcPr>
           <w:p>
             <w:r>
@@ -12100,21 +12652,35 @@
         </w:tc>
         <w:tc>
           <w:tcPr>
-            <w:tcW w:type="dxa" w:w="1440"/>
-          </w:tcPr>
-          <w:p>
-            <w:r>
-              <w:rPr>
-                <w:color w:val="262B33"/>
-                <w:sz w:val="16"/>
-              </w:rPr>
-              <w:t>06/04/2026</w:t>
-            </w:r>
-          </w:p>
-        </w:tc>
-        <w:tc>
-          <w:tcPr>
-            <w:tcW w:type="dxa" w:w="1440"/>
+            <w:tcW w:type="dxa" w:w="1260"/>
+          </w:tcPr>
+          <w:p>
+            <w:r>
+              <w:rPr>
+                <w:color w:val="262B33"/>
+                <w:sz w:val="16"/>
+              </w:rPr>
+              <w:t>Custom Built by Writer</w:t>
+            </w:r>
+          </w:p>
+        </w:tc>
+        <w:tc>
+          <w:tcPr>
+            <w:tcW w:type="dxa" w:w="1260"/>
+          </w:tcPr>
+          <w:p>
+            <w:r>
+              <w:rPr>
+                <w:color w:val="262B33"/>
+                <w:sz w:val="16"/>
+              </w:rPr>
+              <w:t>DOCX Template</w:t>
+            </w:r>
+          </w:p>
+        </w:tc>
+        <w:tc>
+          <w:tcPr>
+            <w:tcW w:type="dxa" w:w="1260"/>
           </w:tcPr>
           <w:p>
             <w:r>
@@ -12128,7 +12694,7 @@
         </w:tc>
         <w:tc>
           <w:tcPr>
-            <w:tcW w:type="dxa" w:w="1440"/>
+            <w:tcW w:type="dxa" w:w="1260"/>
           </w:tcPr>
           <w:p>
             <w:r>
@@ -12142,7 +12708,7 @@
         </w:tc>
         <w:tc>
           <w:tcPr>
-            <w:tcW w:type="dxa" w:w="1440"/>
+            <w:tcW w:type="dxa" w:w="1260"/>
           </w:tcPr>
           <w:p>
             <w:r>
@@ -12158,7 +12724,7 @@
       <w:tr>
         <w:tc>
           <w:tcPr>
-            <w:tcW w:type="dxa" w:w="1440"/>
+            <w:tcW w:type="dxa" w:w="1260"/>
           </w:tcPr>
           <w:p>
             <w:r>
@@ -12172,7 +12738,7 @@
         </w:tc>
         <w:tc>
           <w:tcPr>
-            <w:tcW w:type="dxa" w:w="1440"/>
+            <w:tcW w:type="dxa" w:w="1260"/>
           </w:tcPr>
           <w:p>
             <w:r>
@@ -12186,7 +12752,7 @@
         </w:tc>
         <w:tc>
           <w:tcPr>
-            <w:tcW w:type="dxa" w:w="1440"/>
+            <w:tcW w:type="dxa" w:w="1260"/>
           </w:tcPr>
           <w:p>
             <w:r>
@@ -12200,21 +12766,35 @@
         </w:tc>
         <w:tc>
           <w:tcPr>
-            <w:tcW w:type="dxa" w:w="1440"/>
-          </w:tcPr>
-          <w:p>
-            <w:r>
-              <w:rPr>
-                <w:color w:val="262B33"/>
-                <w:sz w:val="16"/>
-              </w:rPr>
-              <w:t>06/11/2026</w:t>
-            </w:r>
-          </w:p>
-        </w:tc>
-        <w:tc>
-          <w:tcPr>
-            <w:tcW w:type="dxa" w:w="1440"/>
+            <w:tcW w:type="dxa" w:w="1260"/>
+          </w:tcPr>
+          <w:p>
+            <w:r>
+              <w:rPr>
+                <w:color w:val="262B33"/>
+                <w:sz w:val="16"/>
+              </w:rPr>
+              <w:t>Custom Built by Writer</w:t>
+            </w:r>
+          </w:p>
+        </w:tc>
+        <w:tc>
+          <w:tcPr>
+            <w:tcW w:type="dxa" w:w="1260"/>
+          </w:tcPr>
+          <w:p>
+            <w:r>
+              <w:rPr>
+                <w:color w:val="262B33"/>
+                <w:sz w:val="16"/>
+              </w:rPr>
+              <w:t>DOCX Template</w:t>
+            </w:r>
+          </w:p>
+        </w:tc>
+        <w:tc>
+          <w:tcPr>
+            <w:tcW w:type="dxa" w:w="1260"/>
           </w:tcPr>
           <w:p>
             <w:r>
@@ -12228,7 +12808,7 @@
         </w:tc>
         <w:tc>
           <w:tcPr>
-            <w:tcW w:type="dxa" w:w="1440"/>
+            <w:tcW w:type="dxa" w:w="1260"/>
           </w:tcPr>
           <w:p>
             <w:r>
@@ -12242,7 +12822,7 @@
         </w:tc>
         <w:tc>
           <w:tcPr>
-            <w:tcW w:type="dxa" w:w="1440"/>
+            <w:tcW w:type="dxa" w:w="1260"/>
           </w:tcPr>
           <w:p>
             <w:r>
@@ -12258,7 +12838,7 @@
       <w:tr>
         <w:tc>
           <w:tcPr>
-            <w:tcW w:type="dxa" w:w="1440"/>
+            <w:tcW w:type="dxa" w:w="1260"/>
           </w:tcPr>
           <w:p>
             <w:r>
@@ -12272,7 +12852,7 @@
         </w:tc>
         <w:tc>
           <w:tcPr>
-            <w:tcW w:type="dxa" w:w="1440"/>
+            <w:tcW w:type="dxa" w:w="1260"/>
           </w:tcPr>
           <w:p>
             <w:r>
@@ -12286,7 +12866,7 @@
         </w:tc>
         <w:tc>
           <w:tcPr>
-            <w:tcW w:type="dxa" w:w="1440"/>
+            <w:tcW w:type="dxa" w:w="1260"/>
           </w:tcPr>
           <w:p>
             <w:r>
@@ -12300,21 +12880,35 @@
         </w:tc>
         <w:tc>
           <w:tcPr>
-            <w:tcW w:type="dxa" w:w="1440"/>
-          </w:tcPr>
-          <w:p>
-            <w:r>
-              <w:rPr>
-                <w:color w:val="262B33"/>
-                <w:sz w:val="16"/>
-              </w:rPr>
-              <w:t>05/21/2026</w:t>
-            </w:r>
-          </w:p>
-        </w:tc>
-        <w:tc>
-          <w:tcPr>
-            <w:tcW w:type="dxa" w:w="1440"/>
+            <w:tcW w:type="dxa" w:w="1260"/>
+          </w:tcPr>
+          <w:p>
+            <w:r>
+              <w:rPr>
+                <w:color w:val="262B33"/>
+                <w:sz w:val="16"/>
+              </w:rPr>
+              <w:t>Custom Built by Writer</w:t>
+            </w:r>
+          </w:p>
+        </w:tc>
+        <w:tc>
+          <w:tcPr>
+            <w:tcW w:type="dxa" w:w="1260"/>
+          </w:tcPr>
+          <w:p>
+            <w:r>
+              <w:rPr>
+                <w:color w:val="262B33"/>
+                <w:sz w:val="16"/>
+              </w:rPr>
+              <w:t>DOCX Template</w:t>
+            </w:r>
+          </w:p>
+        </w:tc>
+        <w:tc>
+          <w:tcPr>
+            <w:tcW w:type="dxa" w:w="1260"/>
           </w:tcPr>
           <w:p>
             <w:r>
@@ -12328,7 +12922,7 @@
         </w:tc>
         <w:tc>
           <w:tcPr>
-            <w:tcW w:type="dxa" w:w="1440"/>
+            <w:tcW w:type="dxa" w:w="1260"/>
           </w:tcPr>
           <w:p>
             <w:r>
@@ -12342,7 +12936,7 @@
         </w:tc>
         <w:tc>
           <w:tcPr>
-            <w:tcW w:type="dxa" w:w="1440"/>
+            <w:tcW w:type="dxa" w:w="1260"/>
           </w:tcPr>
           <w:p>
             <w:r>
@@ -12378,18 +12972,19 @@
         </w:tblBorders>
       </w:tblPr>
       <w:tblGrid>
-        <w:gridCol w:w="1440"/>
-        <w:gridCol w:w="1440"/>
-        <w:gridCol w:w="1440"/>
-        <w:gridCol w:w="1440"/>
-        <w:gridCol w:w="1440"/>
-        <w:gridCol w:w="1440"/>
-        <w:gridCol w:w="1440"/>
+        <w:gridCol w:w="1260"/>
+        <w:gridCol w:w="1260"/>
+        <w:gridCol w:w="1260"/>
+        <w:gridCol w:w="1260"/>
+        <w:gridCol w:w="1260"/>
+        <w:gridCol w:w="1260"/>
+        <w:gridCol w:w="1260"/>
+        <w:gridCol w:w="1260"/>
       </w:tblGrid>
       <w:tr>
         <w:tc>
           <w:tcPr>
-            <w:tcW w:type="dxa" w:w="1440"/>
+            <w:tcW w:type="dxa" w:w="1260"/>
             <w:shd w:val="clear" w:color="auto" w:fill="4472C4"/>
           </w:tcPr>
           <w:p>
@@ -12405,7 +13000,7 @@
         </w:tc>
         <w:tc>
           <w:tcPr>
-            <w:tcW w:type="dxa" w:w="1440"/>
+            <w:tcW w:type="dxa" w:w="1260"/>
             <w:shd w:val="clear" w:color="auto" w:fill="4472C4"/>
           </w:tcPr>
           <w:p>
@@ -12421,7 +13016,7 @@
         </w:tc>
         <w:tc>
           <w:tcPr>
-            <w:tcW w:type="dxa" w:w="1440"/>
+            <w:tcW w:type="dxa" w:w="1260"/>
             <w:shd w:val="clear" w:color="auto" w:fill="4472C4"/>
           </w:tcPr>
           <w:p>
@@ -12437,7 +13032,7 @@
         </w:tc>
         <w:tc>
           <w:tcPr>
-            <w:tcW w:type="dxa" w:w="1440"/>
+            <w:tcW w:type="dxa" w:w="1260"/>
             <w:shd w:val="clear" w:color="auto" w:fill="4472C4"/>
           </w:tcPr>
           <w:p>
@@ -12447,13 +13042,13 @@
                 <w:color w:val="FFFFFF"/>
                 <w:sz w:val="16"/>
               </w:rPr>
-              <w:t>Date</w:t>
-            </w:r>
-          </w:p>
-        </w:tc>
-        <w:tc>
-          <w:tcPr>
-            <w:tcW w:type="dxa" w:w="1440"/>
+              <w:t>Source</w:t>
+            </w:r>
+          </w:p>
+        </w:tc>
+        <w:tc>
+          <w:tcPr>
+            <w:tcW w:type="dxa" w:w="1260"/>
             <w:shd w:val="clear" w:color="auto" w:fill="4472C4"/>
           </w:tcPr>
           <w:p>
@@ -12463,13 +13058,13 @@
                 <w:color w:val="FFFFFF"/>
                 <w:sz w:val="16"/>
               </w:rPr>
-              <w:t>Reference File Origin</w:t>
-            </w:r>
-          </w:p>
-        </w:tc>
-        <w:tc>
-          <w:tcPr>
-            <w:tcW w:type="dxa" w:w="1440"/>
+              <w:t>Tool</w:t>
+            </w:r>
+          </w:p>
+        </w:tc>
+        <w:tc>
+          <w:tcPr>
+            <w:tcW w:type="dxa" w:w="1260"/>
             <w:shd w:val="clear" w:color="auto" w:fill="4472C4"/>
           </w:tcPr>
           <w:p>
@@ -12479,13 +13074,13 @@
                 <w:color w:val="FFFFFF"/>
                 <w:sz w:val="16"/>
               </w:rPr>
-              <w:t>Description</w:t>
-            </w:r>
-          </w:p>
-        </w:tc>
-        <w:tc>
-          <w:tcPr>
-            <w:tcW w:type="dxa" w:w="1440"/>
+              <w:t>Reference File Origin</w:t>
+            </w:r>
+          </w:p>
+        </w:tc>
+        <w:tc>
+          <w:tcPr>
+            <w:tcW w:type="dxa" w:w="1260"/>
             <w:shd w:val="clear" w:color="auto" w:fill="4472C4"/>
           </w:tcPr>
           <w:p>
@@ -12495,6 +13090,22 @@
                 <w:color w:val="FFFFFF"/>
                 <w:sz w:val="16"/>
               </w:rPr>
+              <w:t>Description</w:t>
+            </w:r>
+          </w:p>
+        </w:tc>
+        <w:tc>
+          <w:tcPr>
+            <w:tcW w:type="dxa" w:w="1260"/>
+            <w:shd w:val="clear" w:color="auto" w:fill="4472C4"/>
+          </w:tcPr>
+          <w:p>
+            <w:r>
+              <w:rPr>
+                <w:b/>
+                <w:color w:val="FFFFFF"/>
+                <w:sz w:val="16"/>
+              </w:rPr>
               <w:t>Pearls, Traps, and Friction</w:t>
             </w:r>
           </w:p>
@@ -12503,7 +13114,7 @@
       <w:tr>
         <w:tc>
           <w:tcPr>
-            <w:tcW w:type="dxa" w:w="1440"/>
+            <w:tcW w:type="dxa" w:w="1260"/>
           </w:tcPr>
           <w:p>
             <w:r>
@@ -12517,7 +13128,7 @@
         </w:tc>
         <w:tc>
           <w:tcPr>
-            <w:tcW w:type="dxa" w:w="1440"/>
+            <w:tcW w:type="dxa" w:w="1260"/>
           </w:tcPr>
           <w:p>
             <w:r>
@@ -12531,7 +13142,7 @@
         </w:tc>
         <w:tc>
           <w:tcPr>
-            <w:tcW w:type="dxa" w:w="1440"/>
+            <w:tcW w:type="dxa" w:w="1260"/>
           </w:tcPr>
           <w:p>
             <w:r>
@@ -12545,21 +13156,35 @@
         </w:tc>
         <w:tc>
           <w:tcPr>
-            <w:tcW w:type="dxa" w:w="1440"/>
-          </w:tcPr>
-          <w:p>
-            <w:r>
-              <w:rPr>
-                <w:color w:val="262B33"/>
-                <w:sz w:val="16"/>
-              </w:rPr>
-              <w:t>05/21/2026</w:t>
-            </w:r>
-          </w:p>
-        </w:tc>
-        <w:tc>
-          <w:tcPr>
-            <w:tcW w:type="dxa" w:w="1440"/>
+            <w:tcW w:type="dxa" w:w="1260"/>
+          </w:tcPr>
+          <w:p>
+            <w:r>
+              <w:rPr>
+                <w:color w:val="262B33"/>
+                <w:sz w:val="16"/>
+              </w:rPr>
+              <w:t>Custom Built by Writer</w:t>
+            </w:r>
+          </w:p>
+        </w:tc>
+        <w:tc>
+          <w:tcPr>
+            <w:tcW w:type="dxa" w:w="1260"/>
+          </w:tcPr>
+          <w:p>
+            <w:r>
+              <w:rPr>
+                <w:color w:val="262B33"/>
+                <w:sz w:val="16"/>
+              </w:rPr>
+              <w:t>DOCX Template</w:t>
+            </w:r>
+          </w:p>
+        </w:tc>
+        <w:tc>
+          <w:tcPr>
+            <w:tcW w:type="dxa" w:w="1260"/>
           </w:tcPr>
           <w:p>
             <w:r>
@@ -12573,7 +13198,7 @@
         </w:tc>
         <w:tc>
           <w:tcPr>
-            <w:tcW w:type="dxa" w:w="1440"/>
+            <w:tcW w:type="dxa" w:w="1260"/>
           </w:tcPr>
           <w:p>
             <w:r>
@@ -12587,7 +13212,7 @@
         </w:tc>
         <w:tc>
           <w:tcPr>
-            <w:tcW w:type="dxa" w:w="1440"/>
+            <w:tcW w:type="dxa" w:w="1260"/>
           </w:tcPr>
           <w:p>
             <w:r>
@@ -12603,7 +13228,7 @@
       <w:tr>
         <w:tc>
           <w:tcPr>
-            <w:tcW w:type="dxa" w:w="1440"/>
+            <w:tcW w:type="dxa" w:w="1260"/>
           </w:tcPr>
           <w:p>
             <w:r>
@@ -12617,7 +13242,7 @@
         </w:tc>
         <w:tc>
           <w:tcPr>
-            <w:tcW w:type="dxa" w:w="1440"/>
+            <w:tcW w:type="dxa" w:w="1260"/>
           </w:tcPr>
           <w:p>
             <w:r>
@@ -12631,7 +13256,7 @@
         </w:tc>
         <w:tc>
           <w:tcPr>
-            <w:tcW w:type="dxa" w:w="1440"/>
+            <w:tcW w:type="dxa" w:w="1260"/>
           </w:tcPr>
           <w:p>
             <w:r>
@@ -12645,21 +13270,35 @@
         </w:tc>
         <w:tc>
           <w:tcPr>
-            <w:tcW w:type="dxa" w:w="1440"/>
-          </w:tcPr>
-          <w:p>
-            <w:r>
-              <w:rPr>
-                <w:color w:val="262B33"/>
-                <w:sz w:val="16"/>
-              </w:rPr>
-              <w:t>05/21/2026</w:t>
-            </w:r>
-          </w:p>
-        </w:tc>
-        <w:tc>
-          <w:tcPr>
-            <w:tcW w:type="dxa" w:w="1440"/>
+            <w:tcW w:type="dxa" w:w="1260"/>
+          </w:tcPr>
+          <w:p>
+            <w:r>
+              <w:rPr>
+                <w:color w:val="262B33"/>
+                <w:sz w:val="16"/>
+              </w:rPr>
+              <w:t>Custom Built by Writer</w:t>
+            </w:r>
+          </w:p>
+        </w:tc>
+        <w:tc>
+          <w:tcPr>
+            <w:tcW w:type="dxa" w:w="1260"/>
+          </w:tcPr>
+          <w:p>
+            <w:r>
+              <w:rPr>
+                <w:color w:val="262B33"/>
+                <w:sz w:val="16"/>
+              </w:rPr>
+              <w:t>DOCX Template</w:t>
+            </w:r>
+          </w:p>
+        </w:tc>
+        <w:tc>
+          <w:tcPr>
+            <w:tcW w:type="dxa" w:w="1260"/>
           </w:tcPr>
           <w:p>
             <w:r>
@@ -12673,7 +13312,7 @@
         </w:tc>
         <w:tc>
           <w:tcPr>
-            <w:tcW w:type="dxa" w:w="1440"/>
+            <w:tcW w:type="dxa" w:w="1260"/>
           </w:tcPr>
           <w:p>
             <w:r>
@@ -12687,7 +13326,7 @@
         </w:tc>
         <w:tc>
           <w:tcPr>
-            <w:tcW w:type="dxa" w:w="1440"/>
+            <w:tcW w:type="dxa" w:w="1260"/>
           </w:tcPr>
           <w:p>
             <w:r>
@@ -12703,7 +13342,7 @@
       <w:tr>
         <w:tc>
           <w:tcPr>
-            <w:tcW w:type="dxa" w:w="1440"/>
+            <w:tcW w:type="dxa" w:w="1260"/>
           </w:tcPr>
           <w:p>
             <w:r>
@@ -12717,7 +13356,7 @@
         </w:tc>
         <w:tc>
           <w:tcPr>
-            <w:tcW w:type="dxa" w:w="1440"/>
+            <w:tcW w:type="dxa" w:w="1260"/>
           </w:tcPr>
           <w:p>
             <w:r>
@@ -12731,7 +13370,7 @@
         </w:tc>
         <w:tc>
           <w:tcPr>
-            <w:tcW w:type="dxa" w:w="1440"/>
+            <w:tcW w:type="dxa" w:w="1260"/>
           </w:tcPr>
           <w:p>
             <w:r>
@@ -12745,21 +13384,35 @@
         </w:tc>
         <w:tc>
           <w:tcPr>
-            <w:tcW w:type="dxa" w:w="1440"/>
-          </w:tcPr>
-          <w:p>
-            <w:r>
-              <w:rPr>
-                <w:color w:val="262B33"/>
-                <w:sz w:val="16"/>
-              </w:rPr>
-              <w:t>05/18/2026</w:t>
-            </w:r>
-          </w:p>
-        </w:tc>
-        <w:tc>
-          <w:tcPr>
-            <w:tcW w:type="dxa" w:w="1440"/>
+            <w:tcW w:type="dxa" w:w="1260"/>
+          </w:tcPr>
+          <w:p>
+            <w:r>
+              <w:rPr>
+                <w:color w:val="262B33"/>
+                <w:sz w:val="16"/>
+              </w:rPr>
+              <w:t>Custom Built by Writer</w:t>
+            </w:r>
+          </w:p>
+        </w:tc>
+        <w:tc>
+          <w:tcPr>
+            <w:tcW w:type="dxa" w:w="1260"/>
+          </w:tcPr>
+          <w:p>
+            <w:r>
+              <w:rPr>
+                <w:color w:val="262B33"/>
+                <w:sz w:val="16"/>
+              </w:rPr>
+              <w:t>DOCX Template</w:t>
+            </w:r>
+          </w:p>
+        </w:tc>
+        <w:tc>
+          <w:tcPr>
+            <w:tcW w:type="dxa" w:w="1260"/>
           </w:tcPr>
           <w:p>
             <w:r>
@@ -12773,7 +13426,7 @@
         </w:tc>
         <w:tc>
           <w:tcPr>
-            <w:tcW w:type="dxa" w:w="1440"/>
+            <w:tcW w:type="dxa" w:w="1260"/>
           </w:tcPr>
           <w:p>
             <w:r>
@@ -12787,7 +13440,7 @@
         </w:tc>
         <w:tc>
           <w:tcPr>
-            <w:tcW w:type="dxa" w:w="1440"/>
+            <w:tcW w:type="dxa" w:w="1260"/>
           </w:tcPr>
           <w:p>
             <w:r>

</xml_diff>